<commit_message>
Version final del paper de invetsigacion con las correciones indicadas: - Acortar títulos de tablas y notas - Organizar y diferenciar subtítulos - Retirar nombres de variables del código - Subir el código a Zenodo - Usar un tono neutral y defendible
</commit_message>
<xml_diff>
--- a/C26-202609-missingpersons/pipeline/C26_Manuscript_InformationSciences_EN.docx
+++ b/C26-202609-missingpersons/pipeline/C26_Manuscript_InformationSciences_EN.docx
@@ -393,15 +393,7 @@
       </w:r>
       <w:proofErr w:type="gramEnd"/>
       <w:r>
-        <w:t xml:space="preserve"> make it possible to describe territorial and temporal </w:t>
-      </w:r>
-      <w:proofErr w:type="gramStart"/>
-      <w:r>
-        <w:t>patterns, but</w:t>
-      </w:r>
-      <w:proofErr w:type="gramEnd"/>
-      <w:r>
-        <w:t xml:space="preserve"> interpreting them requires distinguishing the recorded volume from its frequency relative to the population. This study develops and applies a reproducible </w:t>
+        <w:t xml:space="preserve"> make it possible to describe territorial and temporal patterns, whose interpretation requires distinguishing the recorded volume from its frequency relative to the population. This study develops and applies a reproducible </w:t>
       </w:r>
       <w:proofErr w:type="spellStart"/>
       <w:r>
@@ -409,7 +401,7 @@
       </w:r>
       <w:proofErr w:type="spellEnd"/>
       <w:r>
-        <w:t xml:space="preserve"> framework to the 142,374 reports in Peru's National Registry of Information on Missing Persons (RENIPED, 2019–2025), organized as a panel of 26 territories by 84 months. The framework integrates rates with official denominators, multi-algorithm clustering, spatial association and multilevel validation. Rates ranged from 2.84 to 9.96 reports per 10,000 person-years; ten territories, led by Tacna, Apurímac, Huánuco, Cusco and Junín, had rates above the rest of the country after false discovery rate control, and the classification held in two sensitivity analyses. Metropolitan Lima accounted for a third of the reports, yet its rate exceeded that of the rest of the country by only 14%. Spatial autocorrelation was significant with the four nearest neighbors (Moran's I = 0.288; p = 0.018) but not with contiguity; after Benjamini–Hochberg adjustment, cold spots were detected in the north, but no hot spots. Clustering did not show enough separation or stability to support discrete categories, and four states descriptively summarize monthly profiles. A specification multiverse showed that the clusters and the hot-spot corridor of an initial analysis depended on specific analytical decisions. The framework provides complementary information for assessing institutional needs, without estimating individual risk or setting resource-allocation rules.</w:t>
+        <w:t xml:space="preserve"> framework to the 142,374 reports in Peru's National Registry of Information on Missing Persons (RENIPED, 2019–2025), organized as a panel of 26 territories by 84 months. The framework integrates rates with official denominators, multi-algorithm clustering, spatial association and multilevel validation. Rates ranged from 2.84 to 9.96 reports per 10,000 person-years; ten territories, led by Tacna, Apurímac, Huánuco, Cusco and Junín, had rates above the rest of the country after false discovery rate control, and the classification held in two sensitivity analyses. Metropolitan Lima accounted for a third of the reports, and its rate exceeded that of the rest of the country by 14%. Spatial autocorrelation was significant with the four nearest neighbors (Moran's I = 0.288; p = 0.018) and not with contiguity; after Benjamini–Hochberg adjustment, cold spots were identified in the north and no hot spots. In clustering, the gap statistic favored a single cluster, and four states descriptively summarize monthly profiles. A specification multiverse showed that the clusters and the hot-spot corridor of an initial analysis depended on specific analytical decisions. The framework provides quantitative and reproducible information for assessing institutional needs for search and prevention.</w:t>
       </w:r>
     </w:p>
     <w:p>
@@ -470,7 +462,7 @@
         <w:jc w:val="both"/>
       </w:pPr>
       <w:r>
-        <w:t>Metropolitan Lima holds a third of all reports but not the highest rate</w:t>
+        <w:t>Metropolitan Lima holds a third of all reports and ranks ninth by rate</w:t>
       </w:r>
     </w:p>
     <w:p>
@@ -484,7 +476,6 @@
         <w:jc w:val="both"/>
       </w:pPr>
       <w:r>
-        <w:lastRenderedPageBreak/>
         <w:t>Evidence of spatial association depends on how neighbors are defined</w:t>
       </w:r>
     </w:p>
@@ -499,7 +490,8 @@
         <w:jc w:val="both"/>
       </w:pPr>
       <w:r>
-        <w:t>Four states summarize monthly profiles without demonstrating natural categories</w:t>
+        <w:lastRenderedPageBreak/>
+        <w:t>Four descriptive states summarize monthly profiles</w:t>
       </w:r>
     </w:p>
     <w:p>
@@ -513,7 +505,7 @@
         <w:jc w:val="both"/>
       </w:pPr>
       <w:r>
-        <w:t>A specification multiverse shows how findings depend on analytical decisions</w:t>
+        <w:t>A specification multiverse quantifies how findings depend on analytical choices</w:t>
       </w:r>
     </w:p>
     <w:p>
@@ -569,11 +561,11 @@
         <w:jc w:val="both"/>
       </w:pPr>
       <w:r>
-        <w:t xml:space="preserve">These tools, however, force analysts to make decisions that can alter the result, such as the unit of analysis, the features, the number of clusters, the spatial weights matrix or the way p-values are computed. The modifiable areal unit problem has already shown that aggregation </w:t>
+        <w:t xml:space="preserve">These tools require decisions that can alter the result, such as the unit of analysis, the features, the number of clusters, the spatial weights matrix or the way p-values are computed. The modifiable areal unit problem has already shown that aggregation decisions alone can change spatial conclusions [12], and when each decision is made only once it becomes difficult </w:t>
       </w:r>
       <w:r>
         <w:lastRenderedPageBreak/>
-        <w:t>decisions alone can change spatial conclusions [12], and when each decision is made only once it becomes difficult to tell whether a pattern reflects the data or the analytical path chosen to examine them [13,14]. This risk is particularly high in registers organized as panels, which combine few territories with serially correlated months.</w:t>
+        <w:t>to tell whether a pattern reflects the data or the analytical path chosen to examine them [13,14]. This risk is particularly high in registers organized as panels, which combine few territories with serially correlated months.</w:t>
       </w:r>
     </w:p>
     <w:p>
@@ -722,11 +714,11 @@
         <w:jc w:val="both"/>
       </w:pPr>
       <w:r>
-        <w:t xml:space="preserve">The applied contribution is a joint characterization of the territorial differences, monthly profiles and spatial association of the reports recorded in Peru between 2019 and 2025, which distinguishes how much is recorded in each territory, how frequently relative to its population, </w:t>
+        <w:t xml:space="preserve">The applied contribution is a joint characterization of the territorial differences, monthly profiles and spatial association of the reports recorded in Peru between 2019 and 2025, which distinguishes how much is recorded in each territory, how frequently relative to its population, how a month behaves relative to its recent history, and whether values are associated with those </w:t>
       </w:r>
       <w:r>
         <w:lastRenderedPageBreak/>
-        <w:t xml:space="preserve">how a month behaves relative to its recent history, and whether values are associated with those of neighboring territories. The methodological contribution is an integrated and documented implementation of existing methods that </w:t>
+        <w:t xml:space="preserve">of neighboring territories. The methodological contribution is an integrated and documented implementation of existing methods that </w:t>
       </w:r>
       <w:proofErr w:type="gramStart"/>
       <w:r>
@@ -734,7 +726,7 @@
       </w:r>
       <w:proofErr w:type="gramEnd"/>
       <w:r>
-        <w:t xml:space="preserve"> each component with checks of uncertainty, stability or sensitivity; its application to other registers requires further validation.</w:t>
+        <w:t xml:space="preserve"> each component with checks of uncertainty, stability or sensitivity, designed to be applied to other administrative registers organized as panels.</w:t>
       </w:r>
     </w:p>
     <w:p>
@@ -777,15 +769,7 @@
       </w:r>
       <w:proofErr w:type="spellEnd"/>
       <w:r>
-        <w:t xml:space="preserve"> combines machine learning with spatial data to describe and predict geographic phenomena [6,15,16]. In public-safety research, a common workflow aggregates records into territory-period panels, clusters them with centroid-based algorithms and maps the resulting states. Missing-person data have entered this field only recently: Ruiz Reyes et al. reviewed the statistical and data-analysis techniques that support the search for missing persons [10]; Escobar et al. released a monthly municipality-level panel of disappearance cases and their outcomes in Mexico [11]; and Johnson et al. applied spatial clustering to missing-person records to locate community outreach events [17]. These studies open registers to large-scale analysis but also expose it to their properties: reports that are not </w:t>
-      </w:r>
-      <w:proofErr w:type="gramStart"/>
-      <w:r>
-        <w:t>persons</w:t>
-      </w:r>
-      <w:proofErr w:type="gramEnd"/>
-      <w:r>
-        <w:t>, intermittent coverage and few territorial units.</w:t>
+        <w:t xml:space="preserve"> combines machine learning with spatial data to describe and predict geographic phenomena [6,15,16]. In public-safety research, a common workflow aggregates records into territory-period panels, clusters them with centroid-based algorithms and maps the resulting states. Missing-person data have entered this field only recently: Ruiz Reyes et al. reviewed the statistical and data-analysis techniques that support the search for missing persons [10]; Escobar et al. released a monthly municipality-level panel of disappearance cases and their outcomes in Mexico [11]; and Johnson et al. applied spatial clustering to missing-person records to locate community outreach events [17]. These studies show the value of registers for large-scale analysis and highlight three of their properties: the unit of record is the report, coverage can be interrupted and territorial units are few.</w:t>
       </w:r>
     </w:p>
     <w:p>
@@ -869,7 +853,7 @@
         <w:jc w:val="both"/>
       </w:pPr>
       <w:r>
-        <w:t>Internal indices such as the silhouette coefficient [21] summarize how well separated clusters are, but they cannot indicate that clusters do not exist, because they are undefined for a single cluster [22]. The gap statistic, by contrast, compares the dispersion of the data with that of structureless reference data and admits a single cluster as a valid answer [23]. Stability-based validation complements both criteria by assessing whether a partition reappears when the data are perturbed [24,25], although its outcome depends on the type of perturbation [26]. In panels, this dependence is decisive: resampling rows treats the months of a territory as independent, whereas block resampling preserves temporal dependence [27].</w:t>
+        <w:t>Internal indices such as the silhouette coefficient [21] summarize how well separated clusters are and are defined for two or more clusters, so the hypothesis of a single cluster lies outside their scope [22]. The gap statistic, by contrast, compares the dispersion of the data with that of structureless reference data and admits a single cluster as a valid answer [23]. Stability-based validation complements both criteria by assessing whether a partition reappears when the data are perturbed [24,25], although its outcome depends on the type of perturbation [26]. In panels, this dependence is decisive: resampling rows treats the months of a territory as independent, whereas block resampling preserves temporal dependence [27].</w:t>
       </w:r>
     </w:p>
     <w:p>
@@ -889,7 +873,7 @@
         <w:jc w:val="both"/>
       </w:pPr>
       <w:r>
-        <w:t>In supervised learning, information leakage occurs when model development or evaluation uses information that would not be available under the intended conditions of application [28,29]. Clustering territorial registers raises a related but distinct issue: features that represent usual levels can produce clusters associated mainly with the territory of origin instead of distinguishing temporal situations shared across territories. Normalized mutual information can quantify this association [30], but it does not establish on its own whether the association reflects real territorial differences or properties of the representation used.</w:t>
+        <w:t>In supervised learning, information leakage occurs when model development or evaluation uses information that would not be available under the intended conditions of application [28,29]. Clustering territorial registers raises a related but distinct issue: features that represent usual levels can produce clusters associated mainly with the territory of origin instead of distinguishing temporal situations shared across territories. Normalized mutual information quantifies this association [30], and its interpretation requires distinguishing persistent territorial differences from properties of the representation used.</w:t>
       </w:r>
     </w:p>
     <w:p>
@@ -918,7 +902,7 @@
         <w:jc w:val="both"/>
       </w:pPr>
       <w:r>
-        <w:t>When many teams analyze the same data, their conclusions can differ considerably [14]. Multiverse analysis [31] and specification curve analysis [32] address this problem by running all reasonable combinations of decisions and reporting the full distribution of results. Although these methods have been applied mainly to regression models, this study extends them to clustering and local spatial statistics as part of the validation.</w:t>
+        <w:t>When many teams analyze the same data, their conclusions can differ considerably [14]. Multiverse analysis [31] and specification curve analysis [32] address this problem by evaluating a broad set of combinations of decisions and reporting the full distribution of results. Although these methods have been applied mainly to regression models, this study extends them to clustering and local spatial statistics as part of the validation.</w:t>
       </w:r>
     </w:p>
     <w:p>
@@ -982,7 +966,7 @@
         <w:jc w:val="both"/>
       </w:pPr>
       <w:r>
-        <w:t>Three properties of the register condition its interpretation. First, the unit of record is the report rather than the person, so that someone reported more than once is counted more than once, a known feature of police data on missing persons [33,34], and the register does not state whether the person was found. Second, 1,197 rows (1,357 reports) have an unknown age and 83 rows (90 reports) an unknown sex; all were retained without imputation. Third, MININTER describes 2025 as a preliminary year [35], so 2024 is the last consolidated year. Annual totals ranged from 18,192 reports in 2023 to 26,331 in 2019 (2020: 18,481; 2021: 20,141; 2022: 18,862; 2024: 19,420; 2025: 20,947).</w:t>
+        <w:t>Three properties of the register condition its interpretation. First, the unit of record is the report rather than the person, so that someone reported more than once is counted more than once, a known feature of police data on missing persons [33,34], and each record documents the report, without its outcome. Second, 1,197 rows (1,357 reports) have an unknown age and 83 rows (90 reports) an unknown sex; all were retained without imputation. Third, MININTER describes 2025 as a preliminary year [35], so 2024 is the last consolidated year. The annual number of reports peaked in 2019 (26,331), fell in 2020 (18,481) and remained between 18,192 and 20,947 from 2021 to 2025.</w:t>
       </w:r>
     </w:p>
     <w:p>
@@ -1052,7 +1036,7 @@
       </w:r>
       <w:proofErr w:type="gramEnd"/>
       <w:r>
-        <w:t xml:space="preserve"> combinations have no rows in the source. Six correspond to January 2023 (Madre de Dios, Moquegua, Piura, Puno, San Martín and Tacna), a gap consistent with a press release of the Ombudsman's Office stating that police statistics as of 13 February 2023 did not include those departments [37]; the remaining two correspond to Moquegua in May and June 2020, and their coverage could not be verified. The eight cases were treated as missing data and never as zeros, so that 2,176 of the 2,184 department-months are observed.</w:t>
+        <w:t xml:space="preserve"> combinations have no rows in the source. Six correspond to January 2023 (Madre de Dios, Moquegua, Piura, Puno, San Martín and Tacna), a gap consistent with a press release of the Ombudsman's Office stating that police statistics as of 13 February 2023 did not include those departments [37]; the remaining two correspond to Moquegua in May and June 2020, whose coverage remains unverified. The eight cases were treated as missing data rather than zeros, so that 2,176 of the 2,184 department-months are observed.</w:t>
       </w:r>
     </w:p>
     <w:p>
@@ -1080,7 +1064,23 @@
         <w:jc w:val="both"/>
       </w:pPr>
       <w:r>
-        <w:t>The rate therefore expresses the frequency of recorded reports relative to the population and observation time of each territory. Because the aggregated data identify neither unique persons nor the outcome of each report, the rate does not estimate the individual probability of disappearance or the proportion of persons who remain missing, and territorial differences may reflect both the occurrence of the phenomenon and its reporting and recording, components that these data cannot separate.</w:t>
+        <w:t xml:space="preserve">The rate measures the frequency of recorded reports relative to the population and observation time of each territory. It is a territorial measure of the administrative register that jointly reflects the occurrence of disappearances and reporting and recording practices, and it is interpreted at the aggregate </w:t>
+      </w:r>
+      <w:proofErr w:type="gramStart"/>
+      <w:r>
+        <w:t>level,</w:t>
+      </w:r>
+      <w:proofErr w:type="gramEnd"/>
+      <w:r>
+        <w:t xml:space="preserve"> as distinct from the individual probability of disappearance or the proportion of </w:t>
+      </w:r>
+      <w:proofErr w:type="gramStart"/>
+      <w:r>
+        <w:t>persons</w:t>
+      </w:r>
+      <w:proofErr w:type="gramEnd"/>
+      <w:r>
+        <w:t xml:space="preserve"> who remain missing.</w:t>
       </w:r>
     </w:p>
     <w:p>
@@ -1177,7 +1177,13 @@
         <w:jc w:val="both"/>
       </w:pPr>
       <w:r>
-        <w:t>We understand the explainability of the framework in an operational sense, as interpretability by design [39], rather than as post hoc explanation of a black-box model. It rests on three properties: (a) every output is a quantity with a direct meaning, such as a rate ratio with its interval or a state described by its standardized features and its mean rate (Table 1); (b) every analytical decision is explicit, and its influence is quantified in the multiverse through η²</w:t>
+        <w:t>We understand the explainability of the framework in an operational sense, as interpretability by design [39], in contrast to post hoc explanation of black-box models. It rests on three properties: (a) every output is a quantity with a direct meaning, such as a rate ratio with its interval or a state described by its standardized features and its mean rate (</w:t>
+      </w:r>
+      <w:r>
+        <w:t>Fig. 5d</w:t>
+      </w:r>
+      <w:r>
+        <w:t>); (b) every analytical decision is explicit, and its influence is quantified in the multiverse through η²</w:t>
       </w:r>
       <w:r>
         <w:rPr>
@@ -1186,10 +1192,7 @@
         <w:t>p</w:t>
       </w:r>
       <w:r>
-        <w:t>; and (c) every result can be traced to the results file and the code that produces it. The framework therefore does not evaluate explainability with users or use feature-attribution methods</w:t>
-      </w:r>
-      <w:r>
-        <w:t>.</w:t>
+        <w:t>; and (c) every result can be traced to the results file and the code that produces it. User studies and feature-attribution methods lie outside its scope.</w:t>
       </w:r>
     </w:p>
     <w:p>
@@ -1203,10 +1206,10 @@
           <w:noProof/>
         </w:rPr>
         <w:drawing>
-          <wp:inline distT="0" distB="0" distL="0" distR="0" wp14:anchorId="32661149" wp14:editId="10B1DD49">
-            <wp:extent cx="5400675" cy="2981325"/>
+          <wp:inline distT="0" distB="0" distL="0" distR="0" wp14:anchorId="064F270F" wp14:editId="259A1695">
+            <wp:extent cx="5400675" cy="2983437"/>
             <wp:effectExtent l="0" t="0" r="0" b="0"/>
-            <wp:docPr id="1" name="Fig1_framework_en.png" descr="Fig. 1. Architecture of the GeoAI framework. The three sources are integrated into a panel of 26 territories by 84 months, from which four analytical stages start: (i) priority territories, (ii) spatiotemporal states, (iii) spatial structure and (iv) temporal dynamics. Stage (v) validates the results of stages (ii)–(iv) through territorial identity, the reproduction of the initial analysis and a multiverse of specifications. Italic arrows indicate where each result is reported; the bottom band summarizes the reproducibility safeguards." title="Fig1_framework_en.png"/>
+            <wp:docPr id="1" name="Fig1_framework_en.png" descr="Fig. 1. Architecture of the GeoAI framework." title="Fig1_framework_en.png"/>
             <wp:cNvGraphicFramePr>
               <a:graphicFrameLocks xmlns:a="http://schemas.openxmlformats.org/drawingml/2006/main" noChangeAspect="1"/>
             </wp:cNvGraphicFramePr>
@@ -1220,7 +1223,7 @@
                     </pic:cNvPicPr>
                   </pic:nvPicPr>
                   <pic:blipFill>
-                    <a:blip r:embed="rId7"/>
+                    <a:blip r:embed="rId8"/>
                     <a:srcRect/>
                     <a:stretch>
                       <a:fillRect/>
@@ -1229,7 +1232,7 @@
                   <pic:spPr bwMode="auto">
                     <a:xfrm>
                       <a:off x="0" y="0"/>
-                      <a:ext cx="5400675" cy="2981325"/>
+                      <a:ext cx="5400675" cy="2983437"/>
                     </a:xfrm>
                     <a:prstGeom prst="rect">
                       <a:avLst/>
@@ -1277,23 +1280,7 @@
           <w:sz w:val="20"/>
           <w:szCs w:val="20"/>
         </w:rPr>
-        <w:t xml:space="preserve"> framework. The three sources are integrated into a panel of 26 territories by 84 months, from which four analytical stages start: (</w:t>
-      </w:r>
-      <w:proofErr w:type="spellStart"/>
-      <w:r>
-        <w:rPr>
-          <w:sz w:val="20"/>
-          <w:szCs w:val="20"/>
-        </w:rPr>
-        <w:t>i</w:t>
-      </w:r>
-      <w:proofErr w:type="spellEnd"/>
-      <w:r>
-        <w:rPr>
-          <w:sz w:val="20"/>
-          <w:szCs w:val="20"/>
-        </w:rPr>
-        <w:t>) priority territories, (ii) spatiotemporal states, (iii) spatial structure and (iv) temporal dynamics. Stage (v) validates the results of stages (ii)–(iv) through territorial identity, the reproduction of the initial analysis and a multiverse of specifications. Italic arrows indicate where each result is reported; the bottom band summarizes the reproducibility safeguards.</w:t>
+        <w:t xml:space="preserve"> framework: sources, territory-month panel, analytical stages and validation. Italic arrows indicate the section where each result is reported.</w:t>
       </w:r>
     </w:p>
     <w:p>
@@ -1303,8 +1290,7 @@
         <w:spacing w:before="240" w:after="60" w:line="480" w:lineRule="auto"/>
       </w:pPr>
       <w:r>
-        <w:lastRenderedPageBreak/>
-        <w:t>4.1. Rates and priority territories</w:t>
+        <w:t>4.1. Comparison of rates across territories</w:t>
       </w:r>
     </w:p>
     <w:p>
@@ -1336,6 +1322,7 @@
         <w:spacing w:before="60" w:after="60" w:line="480" w:lineRule="auto"/>
       </w:pPr>
       <w:r>
+        <w:lastRenderedPageBreak/>
         <w:tab/>
       </w:r>
       <m:oMath>
@@ -1446,7 +1433,15 @@
         <w:jc w:val="both"/>
       </w:pPr>
       <w:r>
-        <w:t>A rate ratio of 1.5 means that the recorded rate of the territory is 50% higher than that of the other 25 territories combined over the period analyzed; it refers to reports per unit of population and time, not to a 50% higher individual probability of disappearance. We used the rest of the country as the reference so that the reports and population of the territory evaluated do not enter both terms of the comparison, which is especially relevant for Metropolitan Lima, whose weight in the national total would push its comparison with the national mean toward equality.</w:t>
+        <w:t xml:space="preserve">A rate ratio of 1.5 means that the recorded rate of the territory is 50% higher than that of the other 25 territories combined over the period analyzed. We used the rest of the country as </w:t>
+      </w:r>
+      <w:proofErr w:type="gramStart"/>
+      <w:r>
+        <w:t>the</w:t>
+      </w:r>
+      <w:proofErr w:type="gramEnd"/>
+      <w:r>
+        <w:t xml:space="preserve"> reference so that each territory is compared with a set that excludes it, which is especially relevant for Metropolitan Lima, whose weight in the national total would pull its comparison with the national mean toward 1.</w:t>
       </w:r>
     </w:p>
     <w:p>
@@ -1474,7 +1469,7 @@
       </w:r>
       <w:proofErr w:type="spellEnd"/>
       <w:r>
-        <w:t xml:space="preserve"> was estimated with a moving-block bootstrap [27,39] with 9,999 replicates. In each replicate, blocks of 12 consecutive months were drawn with replacement (seven for 2019–2025 and six for 2019–2024), the same for all 26 territories, and the reports and exposure of those months were used to recompute each territory's rate, the rate of the rest of the country and their ratio. Each block spans a full annual cycle, and joint resampling preserves the temporal correspondence between territories, although not necessarily the dependence between blocks. The 95% confidence intervals are the 2.5th and 97.5th percentiles of the replicates; they are individual intervals, not adjusted for the 26 comparisons.</w:t>
+        <w:t xml:space="preserve"> was estimated with a moving-block bootstrap [27,40] with 9,999 replicates. In each replicate, blocks of 12 consecutive months were drawn with replacement (seven for 2019–2025 and six for 2019–2024), the same for all 26 territories, and the reports and exposure of those months were used to recompute each territory's rate, the rate of the rest of the country and their ratio. Each block spans a full annual cycle, and joint resampling preserves the temporal dependence within each block and the correspondence between territories. The 95% confidence intervals are the 2.5th and 97.5th percentiles of the replicates and are individual intervals; multiplicity is controlled in the test described next.</w:t>
       </w:r>
     </w:p>
     <w:p>
@@ -1510,15 +1505,7 @@
       </w:r>
       <w:proofErr w:type="gramEnd"/>
       <w:r>
-        <w:t xml:space="preserve">9,999 + 1), with a maximum of 1. We then applied the Benjamini–Hochberg procedure to the 26 comparisons [20]. </w:t>
-      </w:r>
-      <w:proofErr w:type="gramStart"/>
-      <w:r>
-        <w:t>A territory</w:t>
-      </w:r>
-      <w:proofErr w:type="gramEnd"/>
-      <w:r>
-        <w:t xml:space="preserve"> was classified as having a </w:t>
+        <w:t xml:space="preserve">9,999 + 1), with a maximum of 1. We then applied the Benjamini–Hochberg procedure to the 26 comparisons [20]. A territory was classified as having a </w:t>
       </w:r>
       <w:r>
         <w:rPr>
@@ -1538,11 +1525,7 @@
         <w:t>lower</w:t>
       </w:r>
       <w:r>
-        <w:t xml:space="preserve"> rate than the rest when its adjusted p-value (q-value) </w:t>
-      </w:r>
-      <w:r>
-        <w:lastRenderedPageBreak/>
-        <w:t xml:space="preserve">was below 0.05, according to the direction of the estimated ratio, and as </w:t>
+        <w:t xml:space="preserve"> rate than the rest when its adjusted p-value (q-value) was below 0.05, according to the direction of the estimated ratio, and as </w:t>
       </w:r>
       <w:r>
         <w:rPr>
@@ -1552,7 +1535,7 @@
         <w:t>not distinguishable</w:t>
       </w:r>
       <w:r>
-        <w:t xml:space="preserve"> otherwise, that is, when no significant difference was detected. As a complementary persistence criterion, we counted in how many of the seven years its annual rate exceeded that of the rest, and we repeated the analysis, as a sensitivity check, for the consolidated period 2019–2024 and with total exposure.</w:t>
+        <w:t xml:space="preserve"> when the q-value was 0.05 or higher. As a complementary persistence criterion, we counted in how many of the seven years its annual rate exceeded that of the rest, and we repeated the analysis, as a sensitivity check, for the consolidated period 2019–2024 and with total exposure.</w:t>
       </w:r>
     </w:p>
     <w:p>
@@ -1562,6 +1545,7 @@
         <w:spacing w:before="240" w:after="60" w:line="480" w:lineRule="auto"/>
       </w:pPr>
       <w:r>
+        <w:lastRenderedPageBreak/>
         <w:t>4.2. Features and feature spaces</w:t>
       </w:r>
     </w:p>
@@ -2112,7 +2096,7 @@
         <w:t>y</w:t>
       </w:r>
       <w:r>
-        <w:t xml:space="preserve"> in the current month and that level: a positive value places the month above its recent history and a negative value below it, on the transformed scale rather than as a percentage change:</w:t>
+        <w:t xml:space="preserve"> in the current month and that level: a positive value places the month above its recent history and a negative value below it, both on the transformed scale:</w:t>
       </w:r>
     </w:p>
     <w:p>
@@ -2408,7 +2392,6 @@
         <w:jc w:val="both"/>
       </w:pPr>
       <w:r>
-        <w:lastRenderedPageBreak/>
         <w:t xml:space="preserve">where </w:t>
       </w:r>
       <w:proofErr w:type="spellStart"/>
@@ -2473,7 +2456,7 @@
         <w:t>A</w:t>
       </w:r>
       <w:r>
-        <w:t xml:space="preserve"> thus expresses how far a month departs from its seasonal reference in units of the territory's residual variability; a value far from zero is not, on its own, a statistically significant anomaly.</w:t>
+        <w:t xml:space="preserve"> thus expresses how far a month departs from its seasonal reference in units of the territory's residual variability; it is a descriptive measure of seasonal deviation.</w:t>
       </w:r>
     </w:p>
     <w:p>
@@ -2523,7 +2506,11 @@
         <w:t>mixed space (E2)</w:t>
       </w:r>
       <w:r>
-        <w:t xml:space="preserve">, which is the main space and adds </w:t>
+        <w:t xml:space="preserve">, which is the main space </w:t>
+      </w:r>
+      <w:r>
+        <w:lastRenderedPageBreak/>
+        <w:t xml:space="preserve">and adds </w:t>
       </w:r>
       <w:r>
         <w:rPr>
@@ -2563,7 +2550,7 @@
         <w:t>N</w:t>
       </w:r>
       <w:r>
-        <w:t xml:space="preserve">. The features of each space were standardized with the mean and standard deviation of the training set, and the same parameters were applied to the evaluation observations. This scaling differs from the territorial normalization of </w:t>
+        <w:t xml:space="preserve">. The features of each space were standardized with the mean and standard deviation of the training set, and the same parameters were applied to the evaluation observations. This scaling, independent of the territorial normalization of </w:t>
       </w:r>
       <w:r>
         <w:rPr>
@@ -2573,7 +2560,7 @@
         <w:t>A</w:t>
       </w:r>
       <w:r>
-        <w:t>, so standardized profiles are interpreted relative to the training distribution.</w:t>
+        <w:t>, places the standardized profiles relative to the training distribution.</w:t>
       </w:r>
     </w:p>
     <w:p>
@@ -2596,7 +2583,7 @@
           <w:sz w:val="20"/>
           <w:szCs w:val="20"/>
         </w:rPr>
-        <w:t xml:space="preserve"> Features and feature spaces. Internal code names are included only to facilitate verification of the reproducibility package.</w:t>
+        <w:t xml:space="preserve"> Features and feature spaces.</w:t>
       </w:r>
     </w:p>
     <w:tbl>
@@ -2614,13 +2601,12 @@
           <w:left w:w="10" w:type="dxa"/>
           <w:right w:w="10" w:type="dxa"/>
         </w:tblCellMar>
-        <w:tblLook w:val="04A0" w:firstRow="1" w:lastRow="0" w:firstColumn="1" w:lastColumn="0" w:noHBand="0" w:noVBand="1"/>
+        <w:tblLook w:val="0000" w:firstRow="0" w:lastRow="0" w:firstColumn="0" w:lastColumn="0" w:noHBand="0" w:noVBand="0"/>
       </w:tblPr>
       <w:tblGrid>
-        <w:gridCol w:w="2400"/>
-        <w:gridCol w:w="800"/>
-        <w:gridCol w:w="3800"/>
-        <w:gridCol w:w="2300"/>
+        <w:gridCol w:w="2900"/>
+        <w:gridCol w:w="900"/>
+        <w:gridCol w:w="5500"/>
       </w:tblGrid>
       <w:tr>
         <w:trPr>
@@ -2628,7 +2614,7 @@
         </w:trPr>
         <w:tc>
           <w:tcPr>
-            <w:tcW w:w="2400" w:type="dxa"/>
+            <w:tcW w:w="2900" w:type="dxa"/>
             <w:tcBorders>
               <w:top w:val="none" w:sz="0" w:space="0" w:color="000000"/>
               <w:left w:val="none" w:sz="0" w:space="0" w:color="000000"/>
@@ -2657,7 +2643,7 @@
         </w:tc>
         <w:tc>
           <w:tcPr>
-            <w:tcW w:w="800" w:type="dxa"/>
+            <w:tcW w:w="900" w:type="dxa"/>
             <w:tcBorders>
               <w:top w:val="none" w:sz="0" w:space="0" w:color="000000"/>
               <w:left w:val="none" w:sz="0" w:space="0" w:color="000000"/>
@@ -2689,7 +2675,7 @@
         </w:tc>
         <w:tc>
           <w:tcPr>
-            <w:tcW w:w="3800" w:type="dxa"/>
+            <w:tcW w:w="5500" w:type="dxa"/>
             <w:tcBorders>
               <w:top w:val="none" w:sz="0" w:space="0" w:color="000000"/>
               <w:left w:val="none" w:sz="0" w:space="0" w:color="000000"/>
@@ -2719,13 +2705,42 @@
             </w:r>
           </w:p>
         </w:tc>
-        <w:tc>
-          <w:tcPr>
-            <w:tcW w:w="2300" w:type="dxa"/>
-            <w:tcBorders>
-              <w:top w:val="none" w:sz="0" w:space="0" w:color="000000"/>
-              <w:left w:val="none" w:sz="0" w:space="0" w:color="000000"/>
-              <w:bottom w:val="single" w:sz="6" w:space="0" w:color="000000"/>
+      </w:tr>
+      <w:tr>
+        <w:tc>
+          <w:tcPr>
+            <w:tcW w:w="2900" w:type="dxa"/>
+            <w:tcBorders>
+              <w:top w:val="none" w:sz="0" w:space="0" w:color="000000"/>
+              <w:left w:val="none" w:sz="0" w:space="0" w:color="000000"/>
+              <w:bottom w:val="none" w:sz="0" w:space="0" w:color="000000"/>
+              <w:right w:val="none" w:sz="0" w:space="0" w:color="000000"/>
+            </w:tcBorders>
+            <w:tcMar>
+              <w:top w:w="40" w:type="dxa"/>
+              <w:left w:w="80" w:type="dxa"/>
+              <w:bottom w:w="40" w:type="dxa"/>
+              <w:right w:w="80" w:type="dxa"/>
+            </w:tcMar>
+            <w:vAlign w:val="center"/>
+          </w:tcPr>
+          <w:p>
+            <w:r>
+              <w:rPr>
+                <w:sz w:val="19"/>
+                <w:szCs w:val="19"/>
+              </w:rPr>
+              <w:t>Monthly rate</w:t>
+            </w:r>
+          </w:p>
+        </w:tc>
+        <w:tc>
+          <w:tcPr>
+            <w:tcW w:w="900" w:type="dxa"/>
+            <w:tcBorders>
+              <w:top w:val="none" w:sz="0" w:space="0" w:color="000000"/>
+              <w:left w:val="none" w:sz="0" w:space="0" w:color="000000"/>
+              <w:bottom w:val="none" w:sz="0" w:space="0" w:color="000000"/>
               <w:right w:val="none" w:sz="0" w:space="0" w:color="000000"/>
             </w:tcBorders>
             <w:tcMar>
@@ -2742,47 +2757,18 @@
             </w:pPr>
             <w:r>
               <w:rPr>
-                <w:b/>
-                <w:bCs/>
-                <w:sz w:val="19"/>
-                <w:szCs w:val="19"/>
-              </w:rPr>
-              <w:t>Code name</w:t>
-            </w:r>
-          </w:p>
-        </w:tc>
-      </w:tr>
-      <w:tr>
-        <w:tc>
-          <w:tcPr>
-            <w:tcW w:w="2400" w:type="dxa"/>
-            <w:tcBorders>
-              <w:top w:val="none" w:sz="0" w:space="0" w:color="000000"/>
-              <w:left w:val="none" w:sz="0" w:space="0" w:color="000000"/>
-              <w:bottom w:val="none" w:sz="0" w:space="0" w:color="000000"/>
-              <w:right w:val="none" w:sz="0" w:space="0" w:color="000000"/>
-            </w:tcBorders>
-            <w:tcMar>
-              <w:top w:w="40" w:type="dxa"/>
-              <w:left w:w="80" w:type="dxa"/>
-              <w:bottom w:w="40" w:type="dxa"/>
-              <w:right w:w="80" w:type="dxa"/>
-            </w:tcMar>
-            <w:vAlign w:val="center"/>
-          </w:tcPr>
-          <w:p>
-            <w:r>
-              <w:rPr>
-                <w:sz w:val="19"/>
-                <w:szCs w:val="19"/>
-              </w:rPr>
-              <w:t>Monthly rate</w:t>
-            </w:r>
-          </w:p>
-        </w:tc>
-        <w:tc>
-          <w:tcPr>
-            <w:tcW w:w="800" w:type="dxa"/>
+                <w:i/>
+                <w:iCs/>
+                <w:sz w:val="19"/>
+                <w:szCs w:val="19"/>
+              </w:rPr>
+              <w:t>r</w:t>
+            </w:r>
+          </w:p>
+        </w:tc>
+        <w:tc>
+          <w:tcPr>
+            <w:tcW w:w="5500" w:type="dxa"/>
             <w:tcBorders>
               <w:top w:val="none" w:sz="0" w:space="0" w:color="000000"/>
               <w:left w:val="none" w:sz="0" w:space="0" w:color="000000"/>
@@ -2803,18 +2789,45 @@
             </w:pPr>
             <w:r>
               <w:rPr>
-                <w:i/>
-                <w:iCs/>
-                <w:sz w:val="19"/>
-                <w:szCs w:val="19"/>
-              </w:rPr>
-              <w:t>r</w:t>
-            </w:r>
-          </w:p>
-        </w:tc>
-        <w:tc>
-          <w:tcPr>
-            <w:tcW w:w="3800" w:type="dxa"/>
+                <w:sz w:val="19"/>
+                <w:szCs w:val="19"/>
+              </w:rPr>
+              <w:t>Reports per 10,000 inhabitants during the month</w:t>
+            </w:r>
+          </w:p>
+        </w:tc>
+      </w:tr>
+      <w:tr>
+        <w:tc>
+          <w:tcPr>
+            <w:tcW w:w="2900" w:type="dxa"/>
+            <w:tcBorders>
+              <w:top w:val="none" w:sz="0" w:space="0" w:color="000000"/>
+              <w:left w:val="none" w:sz="0" w:space="0" w:color="000000"/>
+              <w:bottom w:val="none" w:sz="0" w:space="0" w:color="000000"/>
+              <w:right w:val="none" w:sz="0" w:space="0" w:color="000000"/>
+            </w:tcBorders>
+            <w:tcMar>
+              <w:top w:w="40" w:type="dxa"/>
+              <w:left w:w="80" w:type="dxa"/>
+              <w:bottom w:w="40" w:type="dxa"/>
+              <w:right w:w="80" w:type="dxa"/>
+            </w:tcMar>
+            <w:vAlign w:val="center"/>
+          </w:tcPr>
+          <w:p>
+            <w:r>
+              <w:rPr>
+                <w:sz w:val="19"/>
+                <w:szCs w:val="19"/>
+              </w:rPr>
+              <w:t>Transformed monthly rate</w:t>
+            </w:r>
+          </w:p>
+        </w:tc>
+        <w:tc>
+          <w:tcPr>
+            <w:tcW w:w="900" w:type="dxa"/>
             <w:tcBorders>
               <w:top w:val="none" w:sz="0" w:space="0" w:color="000000"/>
               <w:left w:val="none" w:sz="0" w:space="0" w:color="000000"/>
@@ -2835,16 +2848,18 @@
             </w:pPr>
             <w:r>
               <w:rPr>
-                <w:sz w:val="19"/>
-                <w:szCs w:val="19"/>
-              </w:rPr>
-              <w:t>Reports per 10,000 inhabitants during the month</w:t>
-            </w:r>
-          </w:p>
-        </w:tc>
-        <w:tc>
-          <w:tcPr>
-            <w:tcW w:w="2300" w:type="dxa"/>
+                <w:i/>
+                <w:iCs/>
+                <w:sz w:val="19"/>
+                <w:szCs w:val="19"/>
+              </w:rPr>
+              <w:t>y</w:t>
+            </w:r>
+          </w:p>
+        </w:tc>
+        <w:tc>
+          <w:tcPr>
+            <w:tcW w:w="5500" w:type="dxa"/>
             <w:tcBorders>
               <w:top w:val="none" w:sz="0" w:space="0" w:color="000000"/>
               <w:left w:val="none" w:sz="0" w:space="0" w:color="000000"/>
@@ -2868,7 +2883,16 @@
                 <w:sz w:val="19"/>
                 <w:szCs w:val="19"/>
               </w:rPr>
-              <w:t>TASA_10K</w:t>
+              <w:t xml:space="preserve">Natural logarithm of 1 + </w:t>
+            </w:r>
+            <w:r>
+              <w:rPr>
+                <w:i/>
+                <w:iCs/>
+                <w:sz w:val="19"/>
+                <w:szCs w:val="19"/>
+              </w:rPr>
+              <w:t>r</w:t>
             </w:r>
           </w:p>
         </w:tc>
@@ -2876,34 +2900,34 @@
       <w:tr>
         <w:tc>
           <w:tcPr>
-            <w:tcW w:w="2400" w:type="dxa"/>
-            <w:tcBorders>
-              <w:top w:val="none" w:sz="0" w:space="0" w:color="000000"/>
-              <w:left w:val="none" w:sz="0" w:space="0" w:color="000000"/>
-              <w:bottom w:val="none" w:sz="0" w:space="0" w:color="000000"/>
-              <w:right w:val="none" w:sz="0" w:space="0" w:color="000000"/>
-            </w:tcBorders>
-            <w:tcMar>
-              <w:top w:w="40" w:type="dxa"/>
-              <w:left w:w="80" w:type="dxa"/>
-              <w:bottom w:w="40" w:type="dxa"/>
-              <w:right w:w="80" w:type="dxa"/>
-            </w:tcMar>
-            <w:vAlign w:val="center"/>
-          </w:tcPr>
-          <w:p>
-            <w:r>
-              <w:rPr>
-                <w:sz w:val="19"/>
-                <w:szCs w:val="19"/>
-              </w:rPr>
-              <w:t>Transformed monthly rate</w:t>
-            </w:r>
-          </w:p>
-        </w:tc>
-        <w:tc>
-          <w:tcPr>
-            <w:tcW w:w="800" w:type="dxa"/>
+            <w:tcW w:w="2900" w:type="dxa"/>
+            <w:tcBorders>
+              <w:top w:val="none" w:sz="0" w:space="0" w:color="000000"/>
+              <w:left w:val="none" w:sz="0" w:space="0" w:color="000000"/>
+              <w:bottom w:val="none" w:sz="0" w:space="0" w:color="000000"/>
+              <w:right w:val="none" w:sz="0" w:space="0" w:color="000000"/>
+            </w:tcBorders>
+            <w:tcMar>
+              <w:top w:w="40" w:type="dxa"/>
+              <w:left w:w="80" w:type="dxa"/>
+              <w:bottom w:w="40" w:type="dxa"/>
+              <w:right w:w="80" w:type="dxa"/>
+            </w:tcMar>
+            <w:vAlign w:val="center"/>
+          </w:tcPr>
+          <w:p>
+            <w:r>
+              <w:rPr>
+                <w:sz w:val="19"/>
+                <w:szCs w:val="19"/>
+              </w:rPr>
+              <w:t>Prior level</w:t>
+            </w:r>
+          </w:p>
+        </w:tc>
+        <w:tc>
+          <w:tcPr>
+            <w:tcW w:w="900" w:type="dxa"/>
             <w:tcBorders>
               <w:top w:val="none" w:sz="0" w:space="0" w:color="000000"/>
               <w:left w:val="none" w:sz="0" w:space="0" w:color="000000"/>
@@ -2929,13 +2953,13 @@
                 <w:sz w:val="19"/>
                 <w:szCs w:val="19"/>
               </w:rPr>
-              <w:t>y</w:t>
-            </w:r>
-          </w:p>
-        </w:tc>
-        <w:tc>
-          <w:tcPr>
-            <w:tcW w:w="3800" w:type="dxa"/>
+              <w:t>N</w:t>
+            </w:r>
+          </w:p>
+        </w:tc>
+        <w:tc>
+          <w:tcPr>
+            <w:tcW w:w="5500" w:type="dxa"/>
             <w:tcBorders>
               <w:top w:val="none" w:sz="0" w:space="0" w:color="000000"/>
               <w:left w:val="none" w:sz="0" w:space="0" w:color="000000"/>
@@ -2959,7 +2983,7 @@
                 <w:sz w:val="19"/>
                 <w:szCs w:val="19"/>
               </w:rPr>
-              <w:t xml:space="preserve">Natural logarithm of 1 + </w:t>
+              <w:t xml:space="preserve">Mean of </w:t>
             </w:r>
             <w:r>
               <w:rPr>
@@ -2968,13 +2992,49 @@
                 <w:sz w:val="19"/>
                 <w:szCs w:val="19"/>
               </w:rPr>
-              <w:t>r</w:t>
-            </w:r>
-          </w:p>
-        </w:tc>
-        <w:tc>
-          <w:tcPr>
-            <w:tcW w:w="2300" w:type="dxa"/>
+              <w:t>y</w:t>
+            </w:r>
+            <w:r>
+              <w:rPr>
+                <w:sz w:val="19"/>
+                <w:szCs w:val="19"/>
+              </w:rPr>
+              <w:t xml:space="preserve"> over the previous 12 months, with at least six observed months</w:t>
+            </w:r>
+          </w:p>
+        </w:tc>
+      </w:tr>
+      <w:tr>
+        <w:tc>
+          <w:tcPr>
+            <w:tcW w:w="2900" w:type="dxa"/>
+            <w:tcBorders>
+              <w:top w:val="none" w:sz="0" w:space="0" w:color="000000"/>
+              <w:left w:val="none" w:sz="0" w:space="0" w:color="000000"/>
+              <w:bottom w:val="none" w:sz="0" w:space="0" w:color="000000"/>
+              <w:right w:val="none" w:sz="0" w:space="0" w:color="000000"/>
+            </w:tcBorders>
+            <w:tcMar>
+              <w:top w:w="40" w:type="dxa"/>
+              <w:left w:w="80" w:type="dxa"/>
+              <w:bottom w:w="40" w:type="dxa"/>
+              <w:right w:w="80" w:type="dxa"/>
+            </w:tcMar>
+            <w:vAlign w:val="center"/>
+          </w:tcPr>
+          <w:p>
+            <w:r>
+              <w:rPr>
+                <w:sz w:val="19"/>
+                <w:szCs w:val="19"/>
+              </w:rPr>
+              <w:t>Change from prior level</w:t>
+            </w:r>
+          </w:p>
+        </w:tc>
+        <w:tc>
+          <w:tcPr>
+            <w:tcW w:w="900" w:type="dxa"/>
             <w:tcBorders>
               <w:top w:val="none" w:sz="0" w:space="0" w:color="000000"/>
               <w:left w:val="none" w:sz="0" w:space="0" w:color="000000"/>
@@ -2995,45 +3055,18 @@
             </w:pPr>
             <w:r>
               <w:rPr>
-                <w:sz w:val="19"/>
-                <w:szCs w:val="19"/>
-              </w:rPr>
-              <w:t>LOG_TASA</w:t>
-            </w:r>
-          </w:p>
-        </w:tc>
-      </w:tr>
-      <w:tr>
-        <w:tc>
-          <w:tcPr>
-            <w:tcW w:w="2400" w:type="dxa"/>
-            <w:tcBorders>
-              <w:top w:val="none" w:sz="0" w:space="0" w:color="000000"/>
-              <w:left w:val="none" w:sz="0" w:space="0" w:color="000000"/>
-              <w:bottom w:val="none" w:sz="0" w:space="0" w:color="000000"/>
-              <w:right w:val="none" w:sz="0" w:space="0" w:color="000000"/>
-            </w:tcBorders>
-            <w:tcMar>
-              <w:top w:w="40" w:type="dxa"/>
-              <w:left w:w="80" w:type="dxa"/>
-              <w:bottom w:w="40" w:type="dxa"/>
-              <w:right w:w="80" w:type="dxa"/>
-            </w:tcMar>
-            <w:vAlign w:val="center"/>
-          </w:tcPr>
-          <w:p>
-            <w:r>
-              <w:rPr>
-                <w:sz w:val="19"/>
-                <w:szCs w:val="19"/>
-              </w:rPr>
-              <w:t>Prior level</w:t>
-            </w:r>
-          </w:p>
-        </w:tc>
-        <w:tc>
-          <w:tcPr>
-            <w:tcW w:w="800" w:type="dxa"/>
+                <w:i/>
+                <w:iCs/>
+                <w:sz w:val="19"/>
+                <w:szCs w:val="19"/>
+              </w:rPr>
+              <w:t>C</w:t>
+            </w:r>
+          </w:p>
+        </w:tc>
+        <w:tc>
+          <w:tcPr>
+            <w:tcW w:w="5500" w:type="dxa"/>
             <w:tcBorders>
               <w:top w:val="none" w:sz="0" w:space="0" w:color="000000"/>
               <w:left w:val="none" w:sz="0" w:space="0" w:color="000000"/>
@@ -3054,18 +3087,79 @@
             </w:pPr>
             <w:r>
               <w:rPr>
+                <w:sz w:val="19"/>
+                <w:szCs w:val="19"/>
+              </w:rPr>
+              <w:t xml:space="preserve">Difference </w:t>
+            </w:r>
+            <w:proofErr w:type="gramStart"/>
+            <w:r>
+              <w:rPr>
+                <w:sz w:val="19"/>
+                <w:szCs w:val="19"/>
+              </w:rPr>
+              <w:t xml:space="preserve">between </w:t>
+            </w:r>
+            <w:r>
+              <w:rPr>
                 <w:i/>
                 <w:iCs/>
                 <w:sz w:val="19"/>
                 <w:szCs w:val="19"/>
               </w:rPr>
+              <w:t>y</w:t>
+            </w:r>
+            <w:proofErr w:type="gramEnd"/>
+            <w:r>
+              <w:rPr>
+                <w:sz w:val="19"/>
+                <w:szCs w:val="19"/>
+              </w:rPr>
+              <w:t xml:space="preserve"> in the current month and </w:t>
+            </w:r>
+            <w:r>
+              <w:rPr>
+                <w:i/>
+                <w:iCs/>
+                <w:sz w:val="19"/>
+                <w:szCs w:val="19"/>
+              </w:rPr>
               <w:t>N</w:t>
             </w:r>
           </w:p>
         </w:tc>
-        <w:tc>
-          <w:tcPr>
-            <w:tcW w:w="3800" w:type="dxa"/>
+      </w:tr>
+      <w:tr>
+        <w:tc>
+          <w:tcPr>
+            <w:tcW w:w="2900" w:type="dxa"/>
+            <w:tcBorders>
+              <w:top w:val="none" w:sz="0" w:space="0" w:color="000000"/>
+              <w:left w:val="none" w:sz="0" w:space="0" w:color="000000"/>
+              <w:bottom w:val="none" w:sz="0" w:space="0" w:color="000000"/>
+              <w:right w:val="none" w:sz="0" w:space="0" w:color="000000"/>
+            </w:tcBorders>
+            <w:tcMar>
+              <w:top w:w="40" w:type="dxa"/>
+              <w:left w:w="80" w:type="dxa"/>
+              <w:bottom w:w="40" w:type="dxa"/>
+              <w:right w:w="80" w:type="dxa"/>
+            </w:tcMar>
+            <w:vAlign w:val="center"/>
+          </w:tcPr>
+          <w:p>
+            <w:r>
+              <w:rPr>
+                <w:sz w:val="19"/>
+                <w:szCs w:val="19"/>
+              </w:rPr>
+              <w:t>Seasonal anomaly</w:t>
+            </w:r>
+          </w:p>
+        </w:tc>
+        <w:tc>
+          <w:tcPr>
+            <w:tcW w:w="900" w:type="dxa"/>
             <w:tcBorders>
               <w:top w:val="none" w:sz="0" w:space="0" w:color="000000"/>
               <w:left w:val="none" w:sz="0" w:space="0" w:color="000000"/>
@@ -3086,32 +3180,18 @@
             </w:pPr>
             <w:r>
               <w:rPr>
-                <w:sz w:val="19"/>
-                <w:szCs w:val="19"/>
-              </w:rPr>
-              <w:t xml:space="preserve">Mean of </w:t>
-            </w:r>
-            <w:r>
-              <w:rPr>
                 <w:i/>
                 <w:iCs/>
                 <w:sz w:val="19"/>
                 <w:szCs w:val="19"/>
               </w:rPr>
-              <w:t>y</w:t>
-            </w:r>
-            <w:r>
-              <w:rPr>
-                <w:sz w:val="19"/>
-                <w:szCs w:val="19"/>
-              </w:rPr>
-              <w:t xml:space="preserve"> over the previous 12 months, with at least six observed months</w:t>
-            </w:r>
-          </w:p>
-        </w:tc>
-        <w:tc>
-          <w:tcPr>
-            <w:tcW w:w="2300" w:type="dxa"/>
+              <w:t>A</w:t>
+            </w:r>
+          </w:p>
+        </w:tc>
+        <w:tc>
+          <w:tcPr>
+            <w:tcW w:w="5500" w:type="dxa"/>
             <w:tcBorders>
               <w:top w:val="none" w:sz="0" w:space="0" w:color="000000"/>
               <w:left w:val="none" w:sz="0" w:space="0" w:color="000000"/>
@@ -3135,7 +3215,39 @@
                 <w:sz w:val="19"/>
                 <w:szCs w:val="19"/>
               </w:rPr>
-              <w:t>NIVEL_PREV12</w:t>
+              <w:t xml:space="preserve">Difference from the seasonal </w:t>
+            </w:r>
+            <w:proofErr w:type="gramStart"/>
+            <w:r>
+              <w:rPr>
+                <w:sz w:val="19"/>
+                <w:szCs w:val="19"/>
+              </w:rPr>
+              <w:t>mean</w:t>
+            </w:r>
+            <w:proofErr w:type="gramEnd"/>
+            <w:r>
+              <w:rPr>
+                <w:sz w:val="19"/>
+                <w:szCs w:val="19"/>
+              </w:rPr>
+              <w:t xml:space="preserve"> of </w:t>
+            </w:r>
+            <w:r>
+              <w:rPr>
+                <w:i/>
+                <w:iCs/>
+                <w:sz w:val="19"/>
+                <w:szCs w:val="19"/>
+              </w:rPr>
+              <w:t>y</w:t>
+            </w:r>
+            <w:r>
+              <w:rPr>
+                <w:sz w:val="19"/>
+                <w:szCs w:val="19"/>
+              </w:rPr>
+              <w:t>, divided by the territory's residual standard deviation</w:t>
             </w:r>
           </w:p>
         </w:tc>
@@ -3143,34 +3255,34 @@
       <w:tr>
         <w:tc>
           <w:tcPr>
-            <w:tcW w:w="2400" w:type="dxa"/>
-            <w:tcBorders>
-              <w:top w:val="none" w:sz="0" w:space="0" w:color="000000"/>
-              <w:left w:val="none" w:sz="0" w:space="0" w:color="000000"/>
-              <w:bottom w:val="none" w:sz="0" w:space="0" w:color="000000"/>
-              <w:right w:val="none" w:sz="0" w:space="0" w:color="000000"/>
-            </w:tcBorders>
-            <w:tcMar>
-              <w:top w:w="40" w:type="dxa"/>
-              <w:left w:w="80" w:type="dxa"/>
-              <w:bottom w:w="40" w:type="dxa"/>
-              <w:right w:w="80" w:type="dxa"/>
-            </w:tcMar>
-            <w:vAlign w:val="center"/>
-          </w:tcPr>
-          <w:p>
-            <w:r>
-              <w:rPr>
-                <w:sz w:val="19"/>
-                <w:szCs w:val="19"/>
-              </w:rPr>
-              <w:t>Change from prior level</w:t>
-            </w:r>
-          </w:p>
-        </w:tc>
-        <w:tc>
-          <w:tcPr>
-            <w:tcW w:w="800" w:type="dxa"/>
+            <w:tcW w:w="2900" w:type="dxa"/>
+            <w:tcBorders>
+              <w:top w:val="none" w:sz="0" w:space="0" w:color="000000"/>
+              <w:left w:val="none" w:sz="0" w:space="0" w:color="000000"/>
+              <w:bottom w:val="none" w:sz="0" w:space="0" w:color="000000"/>
+              <w:right w:val="none" w:sz="0" w:space="0" w:color="000000"/>
+            </w:tcBorders>
+            <w:tcMar>
+              <w:top w:w="40" w:type="dxa"/>
+              <w:left w:w="80" w:type="dxa"/>
+              <w:bottom w:w="40" w:type="dxa"/>
+              <w:right w:w="80" w:type="dxa"/>
+            </w:tcMar>
+            <w:vAlign w:val="center"/>
+          </w:tcPr>
+          <w:p>
+            <w:r>
+              <w:rPr>
+                <w:sz w:val="19"/>
+                <w:szCs w:val="19"/>
+              </w:rPr>
+              <w:t>Territory share of the register</w:t>
+            </w:r>
+          </w:p>
+        </w:tc>
+        <w:tc>
+          <w:tcPr>
+            <w:tcW w:w="900" w:type="dxa"/>
             <w:tcBorders>
               <w:top w:val="none" w:sz="0" w:space="0" w:color="000000"/>
               <w:left w:val="none" w:sz="0" w:space="0" w:color="000000"/>
@@ -3196,13 +3308,13 @@
                 <w:sz w:val="19"/>
                 <w:szCs w:val="19"/>
               </w:rPr>
-              <w:t>C</w:t>
-            </w:r>
-          </w:p>
-        </w:tc>
-        <w:tc>
-          <w:tcPr>
-            <w:tcW w:w="3800" w:type="dxa"/>
+              <w:t>P</w:t>
+            </w:r>
+          </w:p>
+        </w:tc>
+        <w:tc>
+          <w:tcPr>
+            <w:tcW w:w="5500" w:type="dxa"/>
             <w:tcBorders>
               <w:top w:val="none" w:sz="0" w:space="0" w:color="000000"/>
               <w:left w:val="none" w:sz="0" w:space="0" w:color="000000"/>
@@ -3226,49 +3338,46 @@
                 <w:sz w:val="19"/>
                 <w:szCs w:val="19"/>
               </w:rPr>
-              <w:t xml:space="preserve">Difference </w:t>
-            </w:r>
-            <w:proofErr w:type="gramStart"/>
-            <w:r>
-              <w:rPr>
-                <w:sz w:val="19"/>
-                <w:szCs w:val="19"/>
-              </w:rPr>
-              <w:t xml:space="preserve">between </w:t>
-            </w:r>
-            <w:r>
-              <w:rPr>
-                <w:i/>
-                <w:iCs/>
-                <w:sz w:val="19"/>
-                <w:szCs w:val="19"/>
-              </w:rPr>
-              <w:t>y</w:t>
-            </w:r>
-            <w:proofErr w:type="gramEnd"/>
-            <w:r>
-              <w:rPr>
-                <w:sz w:val="19"/>
-                <w:szCs w:val="19"/>
-              </w:rPr>
-              <w:t xml:space="preserve"> in the current month and </w:t>
-            </w:r>
-            <w:r>
-              <w:rPr>
-                <w:i/>
-                <w:iCs/>
-                <w:sz w:val="19"/>
-                <w:szCs w:val="19"/>
-              </w:rPr>
-              <w:t>N</w:t>
-            </w:r>
-          </w:p>
-        </w:tc>
-        <w:tc>
-          <w:tcPr>
-            <w:tcW w:w="2300" w:type="dxa"/>
-            <w:tcBorders>
-              <w:top w:val="none" w:sz="0" w:space="0" w:color="000000"/>
+              <w:t>Share of reports (panel) or rows (cells) of the territory; used only in sensitivity specifications</w:t>
+            </w:r>
+          </w:p>
+        </w:tc>
+      </w:tr>
+      <w:tr>
+        <w:tc>
+          <w:tcPr>
+            <w:tcW w:w="2900" w:type="dxa"/>
+            <w:tcBorders>
+              <w:top w:val="single" w:sz="4" w:space="0" w:color="000000"/>
+              <w:left w:val="none" w:sz="0" w:space="0" w:color="000000"/>
+              <w:bottom w:val="none" w:sz="0" w:space="0" w:color="000000"/>
+              <w:right w:val="none" w:sz="0" w:space="0" w:color="000000"/>
+            </w:tcBorders>
+            <w:tcMar>
+              <w:top w:w="40" w:type="dxa"/>
+              <w:left w:w="80" w:type="dxa"/>
+              <w:bottom w:w="40" w:type="dxa"/>
+              <w:right w:w="80" w:type="dxa"/>
+            </w:tcMar>
+            <w:vAlign w:val="center"/>
+          </w:tcPr>
+          <w:p>
+            <w:r>
+              <w:rPr>
+                <w:b/>
+                <w:bCs/>
+                <w:sz w:val="19"/>
+                <w:szCs w:val="19"/>
+              </w:rPr>
+              <w:t>Space</w:t>
+            </w:r>
+          </w:p>
+        </w:tc>
+        <w:tc>
+          <w:tcPr>
+            <w:tcW w:w="900" w:type="dxa"/>
+            <w:tcBorders>
+              <w:top w:val="single" w:sz="4" w:space="0" w:color="000000"/>
               <w:left w:val="none" w:sz="0" w:space="0" w:color="000000"/>
               <w:bottom w:val="none" w:sz="0" w:space="0" w:color="000000"/>
               <w:right w:val="none" w:sz="0" w:space="0" w:color="000000"/>
@@ -3285,49 +3394,13 @@
             <w:pPr>
               <w:jc w:val="center"/>
             </w:pPr>
-            <w:r>
-              <w:rPr>
-                <w:sz w:val="19"/>
-                <w:szCs w:val="19"/>
-              </w:rPr>
-              <w:t>CAMBIO_12M</w:t>
-            </w:r>
-          </w:p>
-        </w:tc>
-      </w:tr>
-      <w:tr>
-        <w:tc>
-          <w:tcPr>
-            <w:tcW w:w="2400" w:type="dxa"/>
-            <w:tcBorders>
-              <w:top w:val="none" w:sz="0" w:space="0" w:color="000000"/>
-              <w:left w:val="none" w:sz="0" w:space="0" w:color="000000"/>
-              <w:bottom w:val="none" w:sz="0" w:space="0" w:color="000000"/>
-              <w:right w:val="none" w:sz="0" w:space="0" w:color="000000"/>
-            </w:tcBorders>
-            <w:tcMar>
-              <w:top w:w="40" w:type="dxa"/>
-              <w:left w:w="80" w:type="dxa"/>
-              <w:bottom w:w="40" w:type="dxa"/>
-              <w:right w:w="80" w:type="dxa"/>
-            </w:tcMar>
-            <w:vAlign w:val="center"/>
-          </w:tcPr>
-          <w:p>
-            <w:r>
-              <w:rPr>
-                <w:sz w:val="19"/>
-                <w:szCs w:val="19"/>
-              </w:rPr>
-              <w:t>Seasonal anomaly</w:t>
-            </w:r>
-          </w:p>
-        </w:tc>
-        <w:tc>
-          <w:tcPr>
-            <w:tcW w:w="800" w:type="dxa"/>
-            <w:tcBorders>
-              <w:top w:val="none" w:sz="0" w:space="0" w:color="000000"/>
+          </w:p>
+        </w:tc>
+        <w:tc>
+          <w:tcPr>
+            <w:tcW w:w="5500" w:type="dxa"/>
+            <w:tcBorders>
+              <w:top w:val="single" w:sz="4" w:space="0" w:color="000000"/>
               <w:left w:val="none" w:sz="0" w:space="0" w:color="000000"/>
               <w:bottom w:val="none" w:sz="0" w:space="0" w:color="000000"/>
               <w:right w:val="none" w:sz="0" w:space="0" w:color="000000"/>
@@ -3346,18 +3419,47 @@
             </w:pPr>
             <w:r>
               <w:rPr>
-                <w:i/>
-                <w:iCs/>
-                <w:sz w:val="19"/>
-                <w:szCs w:val="19"/>
-              </w:rPr>
-              <w:t>A</w:t>
-            </w:r>
-          </w:p>
-        </w:tc>
-        <w:tc>
-          <w:tcPr>
-            <w:tcW w:w="3800" w:type="dxa"/>
+                <w:b/>
+                <w:bCs/>
+                <w:sz w:val="19"/>
+                <w:szCs w:val="19"/>
+              </w:rPr>
+              <w:t>Features included</w:t>
+            </w:r>
+          </w:p>
+        </w:tc>
+      </w:tr>
+      <w:tr>
+        <w:tc>
+          <w:tcPr>
+            <w:tcW w:w="2900" w:type="dxa"/>
+            <w:tcBorders>
+              <w:top w:val="none" w:sz="0" w:space="0" w:color="000000"/>
+              <w:left w:val="none" w:sz="0" w:space="0" w:color="000000"/>
+              <w:bottom w:val="none" w:sz="0" w:space="0" w:color="000000"/>
+              <w:right w:val="none" w:sz="0" w:space="0" w:color="000000"/>
+            </w:tcBorders>
+            <w:tcMar>
+              <w:top w:w="40" w:type="dxa"/>
+              <w:left w:w="80" w:type="dxa"/>
+              <w:bottom w:w="40" w:type="dxa"/>
+              <w:right w:w="80" w:type="dxa"/>
+            </w:tcMar>
+            <w:vAlign w:val="center"/>
+          </w:tcPr>
+          <w:p>
+            <w:r>
+              <w:rPr>
+                <w:sz w:val="19"/>
+                <w:szCs w:val="19"/>
+              </w:rPr>
+              <w:t>Relative (E1)</w:t>
+            </w:r>
+          </w:p>
+        </w:tc>
+        <w:tc>
+          <w:tcPr>
+            <w:tcW w:w="900" w:type="dxa"/>
             <w:tcBorders>
               <w:top w:val="none" w:sz="0" w:space="0" w:color="000000"/>
               <w:left w:val="none" w:sz="0" w:space="0" w:color="000000"/>
@@ -3376,50 +3478,11 @@
             <w:pPr>
               <w:jc w:val="center"/>
             </w:pPr>
-            <w:r>
-              <w:rPr>
-                <w:sz w:val="19"/>
-                <w:szCs w:val="19"/>
-              </w:rPr>
-              <w:t xml:space="preserve">Difference from the seasonal </w:t>
-            </w:r>
-            <w:proofErr w:type="gramStart"/>
-            <w:r>
-              <w:rPr>
-                <w:sz w:val="19"/>
-                <w:szCs w:val="19"/>
-              </w:rPr>
-              <w:t>mean</w:t>
-            </w:r>
-            <w:proofErr w:type="gramEnd"/>
-            <w:r>
-              <w:rPr>
-                <w:sz w:val="19"/>
-                <w:szCs w:val="19"/>
-              </w:rPr>
-              <w:t xml:space="preserve"> of </w:t>
-            </w:r>
-            <w:r>
-              <w:rPr>
-                <w:i/>
-                <w:iCs/>
-                <w:sz w:val="19"/>
-                <w:szCs w:val="19"/>
-              </w:rPr>
-              <w:t>y</w:t>
-            </w:r>
-            <w:r>
-              <w:rPr>
-                <w:sz w:val="19"/>
-                <w:szCs w:val="19"/>
-              </w:rPr>
-              <w:t>, divided by the territory's residual standard deviation</w:t>
-            </w:r>
-          </w:p>
-        </w:tc>
-        <w:tc>
-          <w:tcPr>
-            <w:tcW w:w="2300" w:type="dxa"/>
+          </w:p>
+        </w:tc>
+        <w:tc>
+          <w:tcPr>
+            <w:tcW w:w="5500" w:type="dxa"/>
             <w:tcBorders>
               <w:top w:val="none" w:sz="0" w:space="0" w:color="000000"/>
               <w:left w:val="none" w:sz="0" w:space="0" w:color="000000"/>
@@ -3440,10 +3503,28 @@
             </w:pPr>
             <w:r>
               <w:rPr>
-                <w:sz w:val="19"/>
-                <w:szCs w:val="19"/>
-              </w:rPr>
-              <w:t>ANOMALIA</w:t>
+                <w:i/>
+                <w:iCs/>
+                <w:sz w:val="19"/>
+                <w:szCs w:val="19"/>
+              </w:rPr>
+              <w:t>A</w:t>
+            </w:r>
+            <w:r>
+              <w:rPr>
+                <w:sz w:val="19"/>
+                <w:szCs w:val="19"/>
+              </w:rPr>
+              <w:t xml:space="preserve">, </w:t>
+            </w:r>
+            <w:r>
+              <w:rPr>
+                <w:i/>
+                <w:iCs/>
+                <w:sz w:val="19"/>
+                <w:szCs w:val="19"/>
+              </w:rPr>
+              <w:t>C</w:t>
             </w:r>
           </w:p>
         </w:tc>
@@ -3451,34 +3532,34 @@
       <w:tr>
         <w:tc>
           <w:tcPr>
-            <w:tcW w:w="2400" w:type="dxa"/>
-            <w:tcBorders>
-              <w:top w:val="none" w:sz="0" w:space="0" w:color="000000"/>
-              <w:left w:val="none" w:sz="0" w:space="0" w:color="000000"/>
-              <w:bottom w:val="none" w:sz="0" w:space="0" w:color="000000"/>
-              <w:right w:val="none" w:sz="0" w:space="0" w:color="000000"/>
-            </w:tcBorders>
-            <w:tcMar>
-              <w:top w:w="40" w:type="dxa"/>
-              <w:left w:w="80" w:type="dxa"/>
-              <w:bottom w:w="40" w:type="dxa"/>
-              <w:right w:w="80" w:type="dxa"/>
-            </w:tcMar>
-            <w:vAlign w:val="center"/>
-          </w:tcPr>
-          <w:p>
-            <w:r>
-              <w:rPr>
-                <w:sz w:val="19"/>
-                <w:szCs w:val="19"/>
-              </w:rPr>
-              <w:t>Territorial share of the register</w:t>
-            </w:r>
-          </w:p>
-        </w:tc>
-        <w:tc>
-          <w:tcPr>
-            <w:tcW w:w="800" w:type="dxa"/>
+            <w:tcW w:w="2900" w:type="dxa"/>
+            <w:tcBorders>
+              <w:top w:val="none" w:sz="0" w:space="0" w:color="000000"/>
+              <w:left w:val="none" w:sz="0" w:space="0" w:color="000000"/>
+              <w:bottom w:val="none" w:sz="0" w:space="0" w:color="000000"/>
+              <w:right w:val="none" w:sz="0" w:space="0" w:color="000000"/>
+            </w:tcBorders>
+            <w:tcMar>
+              <w:top w:w="40" w:type="dxa"/>
+              <w:left w:w="80" w:type="dxa"/>
+              <w:bottom w:w="40" w:type="dxa"/>
+              <w:right w:w="80" w:type="dxa"/>
+            </w:tcMar>
+            <w:vAlign w:val="center"/>
+          </w:tcPr>
+          <w:p>
+            <w:r>
+              <w:rPr>
+                <w:sz w:val="19"/>
+                <w:szCs w:val="19"/>
+              </w:rPr>
+              <w:t>Mixed (E2, main)</w:t>
+            </w:r>
+          </w:p>
+        </w:tc>
+        <w:tc>
+          <w:tcPr>
+            <w:tcW w:w="900" w:type="dxa"/>
             <w:tcBorders>
               <w:top w:val="none" w:sz="0" w:space="0" w:color="000000"/>
               <w:left w:val="none" w:sz="0" w:space="0" w:color="000000"/>
@@ -3497,20 +3578,11 @@
             <w:pPr>
               <w:jc w:val="center"/>
             </w:pPr>
-            <w:r>
-              <w:rPr>
-                <w:i/>
-                <w:iCs/>
-                <w:sz w:val="19"/>
-                <w:szCs w:val="19"/>
-              </w:rPr>
-              <w:t>P</w:t>
-            </w:r>
-          </w:p>
-        </w:tc>
-        <w:tc>
-          <w:tcPr>
-            <w:tcW w:w="3800" w:type="dxa"/>
+          </w:p>
+        </w:tc>
+        <w:tc>
+          <w:tcPr>
+            <w:tcW w:w="5500" w:type="dxa"/>
             <w:tcBorders>
               <w:top w:val="none" w:sz="0" w:space="0" w:color="000000"/>
               <w:left w:val="none" w:sz="0" w:space="0" w:color="000000"/>
@@ -3531,16 +3603,79 @@
             </w:pPr>
             <w:r>
               <w:rPr>
-                <w:sz w:val="19"/>
-                <w:szCs w:val="19"/>
-              </w:rPr>
-              <w:t>Share of reports (panel) or rows (cells) of the territory; used only in sensitivity specifications</w:t>
-            </w:r>
-          </w:p>
-        </w:tc>
-        <w:tc>
-          <w:tcPr>
-            <w:tcW w:w="2300" w:type="dxa"/>
+                <w:i/>
+                <w:iCs/>
+                <w:sz w:val="19"/>
+                <w:szCs w:val="19"/>
+              </w:rPr>
+              <w:t>A</w:t>
+            </w:r>
+            <w:r>
+              <w:rPr>
+                <w:sz w:val="19"/>
+                <w:szCs w:val="19"/>
+              </w:rPr>
+              <w:t xml:space="preserve">, </w:t>
+            </w:r>
+            <w:r>
+              <w:rPr>
+                <w:i/>
+                <w:iCs/>
+                <w:sz w:val="19"/>
+                <w:szCs w:val="19"/>
+              </w:rPr>
+              <w:t>C</w:t>
+            </w:r>
+            <w:r>
+              <w:rPr>
+                <w:sz w:val="19"/>
+                <w:szCs w:val="19"/>
+              </w:rPr>
+              <w:t xml:space="preserve">, </w:t>
+            </w:r>
+            <w:r>
+              <w:rPr>
+                <w:i/>
+                <w:iCs/>
+                <w:sz w:val="19"/>
+                <w:szCs w:val="19"/>
+              </w:rPr>
+              <w:t>N</w:t>
+            </w:r>
+          </w:p>
+        </w:tc>
+      </w:tr>
+      <w:tr>
+        <w:tc>
+          <w:tcPr>
+            <w:tcW w:w="2900" w:type="dxa"/>
+            <w:tcBorders>
+              <w:top w:val="none" w:sz="0" w:space="0" w:color="000000"/>
+              <w:left w:val="none" w:sz="0" w:space="0" w:color="000000"/>
+              <w:bottom w:val="none" w:sz="0" w:space="0" w:color="000000"/>
+              <w:right w:val="none" w:sz="0" w:space="0" w:color="000000"/>
+            </w:tcBorders>
+            <w:tcMar>
+              <w:top w:w="40" w:type="dxa"/>
+              <w:left w:w="80" w:type="dxa"/>
+              <w:bottom w:w="40" w:type="dxa"/>
+              <w:right w:w="80" w:type="dxa"/>
+            </w:tcMar>
+            <w:vAlign w:val="center"/>
+          </w:tcPr>
+          <w:p>
+            <w:r>
+              <w:rPr>
+                <w:sz w:val="19"/>
+                <w:szCs w:val="19"/>
+              </w:rPr>
+              <w:t>Level (E3)</w:t>
+            </w:r>
+          </w:p>
+        </w:tc>
+        <w:tc>
+          <w:tcPr>
+            <w:tcW w:w="900" w:type="dxa"/>
             <w:tcBorders>
               <w:top w:val="none" w:sz="0" w:space="0" w:color="000000"/>
               <w:left w:val="none" w:sz="0" w:space="0" w:color="000000"/>
@@ -3559,51 +3694,13 @@
             <w:pPr>
               <w:jc w:val="center"/>
             </w:pPr>
-            <w:r>
-              <w:rPr>
-                <w:sz w:val="19"/>
-                <w:szCs w:val="19"/>
-              </w:rPr>
-              <w:t>DPTO_ID</w:t>
-            </w:r>
-          </w:p>
-        </w:tc>
-      </w:tr>
-      <w:tr>
-        <w:tc>
-          <w:tcPr>
-            <w:tcW w:w="2400" w:type="dxa"/>
-            <w:tcBorders>
-              <w:top w:val="single" w:sz="4" w:space="0" w:color="000000"/>
-              <w:left w:val="none" w:sz="0" w:space="0" w:color="000000"/>
-              <w:bottom w:val="none" w:sz="0" w:space="0" w:color="000000"/>
-              <w:right w:val="none" w:sz="0" w:space="0" w:color="000000"/>
-            </w:tcBorders>
-            <w:tcMar>
-              <w:top w:w="40" w:type="dxa"/>
-              <w:left w:w="80" w:type="dxa"/>
-              <w:bottom w:w="40" w:type="dxa"/>
-              <w:right w:w="80" w:type="dxa"/>
-            </w:tcMar>
-            <w:vAlign w:val="center"/>
-          </w:tcPr>
-          <w:p>
-            <w:r>
-              <w:rPr>
-                <w:b/>
-                <w:bCs/>
-                <w:sz w:val="19"/>
-                <w:szCs w:val="19"/>
-              </w:rPr>
-              <w:t>Space</w:t>
-            </w:r>
-          </w:p>
-        </w:tc>
-        <w:tc>
-          <w:tcPr>
-            <w:tcW w:w="800" w:type="dxa"/>
-            <w:tcBorders>
-              <w:top w:val="single" w:sz="4" w:space="0" w:color="000000"/>
+          </w:p>
+        </w:tc>
+        <w:tc>
+          <w:tcPr>
+            <w:tcW w:w="5500" w:type="dxa"/>
+            <w:tcBorders>
+              <w:top w:val="none" w:sz="0" w:space="0" w:color="000000"/>
               <w:left w:val="none" w:sz="0" w:space="0" w:color="000000"/>
               <w:bottom w:val="none" w:sz="0" w:space="0" w:color="000000"/>
               <w:right w:val="none" w:sz="0" w:space="0" w:color="000000"/>
@@ -3620,136 +3717,6 @@
             <w:pPr>
               <w:jc w:val="center"/>
             </w:pPr>
-          </w:p>
-        </w:tc>
-        <w:tc>
-          <w:tcPr>
-            <w:tcW w:w="3800" w:type="dxa"/>
-            <w:tcBorders>
-              <w:top w:val="single" w:sz="4" w:space="0" w:color="000000"/>
-              <w:left w:val="none" w:sz="0" w:space="0" w:color="000000"/>
-              <w:bottom w:val="none" w:sz="0" w:space="0" w:color="000000"/>
-              <w:right w:val="none" w:sz="0" w:space="0" w:color="000000"/>
-            </w:tcBorders>
-            <w:tcMar>
-              <w:top w:w="40" w:type="dxa"/>
-              <w:left w:w="80" w:type="dxa"/>
-              <w:bottom w:w="40" w:type="dxa"/>
-              <w:right w:w="80" w:type="dxa"/>
-            </w:tcMar>
-            <w:vAlign w:val="center"/>
-          </w:tcPr>
-          <w:p>
-            <w:pPr>
-              <w:jc w:val="center"/>
-            </w:pPr>
-            <w:r>
-              <w:rPr>
-                <w:b/>
-                <w:bCs/>
-                <w:sz w:val="19"/>
-                <w:szCs w:val="19"/>
-              </w:rPr>
-              <w:t>Features included</w:t>
-            </w:r>
-          </w:p>
-        </w:tc>
-        <w:tc>
-          <w:tcPr>
-            <w:tcW w:w="2300" w:type="dxa"/>
-            <w:tcBorders>
-              <w:top w:val="single" w:sz="4" w:space="0" w:color="000000"/>
-              <w:left w:val="none" w:sz="0" w:space="0" w:color="000000"/>
-              <w:bottom w:val="none" w:sz="0" w:space="0" w:color="000000"/>
-              <w:right w:val="none" w:sz="0" w:space="0" w:color="000000"/>
-            </w:tcBorders>
-            <w:tcMar>
-              <w:top w:w="40" w:type="dxa"/>
-              <w:left w:w="80" w:type="dxa"/>
-              <w:bottom w:w="40" w:type="dxa"/>
-              <w:right w:w="80" w:type="dxa"/>
-            </w:tcMar>
-            <w:vAlign w:val="center"/>
-          </w:tcPr>
-          <w:p>
-            <w:pPr>
-              <w:jc w:val="center"/>
-            </w:pPr>
-          </w:p>
-        </w:tc>
-      </w:tr>
-      <w:tr>
-        <w:tc>
-          <w:tcPr>
-            <w:tcW w:w="2400" w:type="dxa"/>
-            <w:tcBorders>
-              <w:top w:val="none" w:sz="0" w:space="0" w:color="000000"/>
-              <w:left w:val="none" w:sz="0" w:space="0" w:color="000000"/>
-              <w:bottom w:val="none" w:sz="0" w:space="0" w:color="000000"/>
-              <w:right w:val="none" w:sz="0" w:space="0" w:color="000000"/>
-            </w:tcBorders>
-            <w:tcMar>
-              <w:top w:w="40" w:type="dxa"/>
-              <w:left w:w="80" w:type="dxa"/>
-              <w:bottom w:w="40" w:type="dxa"/>
-              <w:right w:w="80" w:type="dxa"/>
-            </w:tcMar>
-            <w:vAlign w:val="center"/>
-          </w:tcPr>
-          <w:p>
-            <w:r>
-              <w:rPr>
-                <w:sz w:val="19"/>
-                <w:szCs w:val="19"/>
-              </w:rPr>
-              <w:t>Relative (E1)</w:t>
-            </w:r>
-          </w:p>
-        </w:tc>
-        <w:tc>
-          <w:tcPr>
-            <w:tcW w:w="800" w:type="dxa"/>
-            <w:tcBorders>
-              <w:top w:val="none" w:sz="0" w:space="0" w:color="000000"/>
-              <w:left w:val="none" w:sz="0" w:space="0" w:color="000000"/>
-              <w:bottom w:val="none" w:sz="0" w:space="0" w:color="000000"/>
-              <w:right w:val="none" w:sz="0" w:space="0" w:color="000000"/>
-            </w:tcBorders>
-            <w:tcMar>
-              <w:top w:w="40" w:type="dxa"/>
-              <w:left w:w="80" w:type="dxa"/>
-              <w:bottom w:w="40" w:type="dxa"/>
-              <w:right w:w="80" w:type="dxa"/>
-            </w:tcMar>
-            <w:vAlign w:val="center"/>
-          </w:tcPr>
-          <w:p>
-            <w:pPr>
-              <w:jc w:val="center"/>
-            </w:pPr>
-          </w:p>
-        </w:tc>
-        <w:tc>
-          <w:tcPr>
-            <w:tcW w:w="3800" w:type="dxa"/>
-            <w:tcBorders>
-              <w:top w:val="none" w:sz="0" w:space="0" w:color="000000"/>
-              <w:left w:val="none" w:sz="0" w:space="0" w:color="000000"/>
-              <w:bottom w:val="none" w:sz="0" w:space="0" w:color="000000"/>
-              <w:right w:val="none" w:sz="0" w:space="0" w:color="000000"/>
-            </w:tcBorders>
-            <w:tcMar>
-              <w:top w:w="40" w:type="dxa"/>
-              <w:left w:w="80" w:type="dxa"/>
-              <w:bottom w:w="40" w:type="dxa"/>
-              <w:right w:w="80" w:type="dxa"/>
-            </w:tcMar>
-            <w:vAlign w:val="center"/>
-          </w:tcPr>
-          <w:p>
-            <w:pPr>
-              <w:jc w:val="center"/>
-            </w:pPr>
             <w:r>
               <w:rPr>
                 <w:i/>
@@ -3757,7 +3724,7 @@
                 <w:sz w:val="19"/>
                 <w:szCs w:val="19"/>
               </w:rPr>
-              <w:t>A</w:t>
+              <w:t>y</w:t>
             </w:r>
             <w:r>
               <w:rPr>
@@ -3773,313 +3740,7 @@
                 <w:sz w:val="19"/>
                 <w:szCs w:val="19"/>
               </w:rPr>
-              <w:t>C</w:t>
-            </w:r>
-          </w:p>
-        </w:tc>
-        <w:tc>
-          <w:tcPr>
-            <w:tcW w:w="2300" w:type="dxa"/>
-            <w:tcBorders>
-              <w:top w:val="none" w:sz="0" w:space="0" w:color="000000"/>
-              <w:left w:val="none" w:sz="0" w:space="0" w:color="000000"/>
-              <w:bottom w:val="none" w:sz="0" w:space="0" w:color="000000"/>
-              <w:right w:val="none" w:sz="0" w:space="0" w:color="000000"/>
-            </w:tcBorders>
-            <w:tcMar>
-              <w:top w:w="40" w:type="dxa"/>
-              <w:left w:w="80" w:type="dxa"/>
-              <w:bottom w:w="40" w:type="dxa"/>
-              <w:right w:w="80" w:type="dxa"/>
-            </w:tcMar>
-            <w:vAlign w:val="center"/>
-          </w:tcPr>
-          <w:p>
-            <w:pPr>
-              <w:jc w:val="center"/>
-            </w:pPr>
-            <w:r>
-              <w:rPr>
-                <w:sz w:val="19"/>
-                <w:szCs w:val="19"/>
-              </w:rPr>
-              <w:t>E1_relativo</w:t>
-            </w:r>
-          </w:p>
-        </w:tc>
-      </w:tr>
-      <w:tr>
-        <w:tc>
-          <w:tcPr>
-            <w:tcW w:w="2400" w:type="dxa"/>
-            <w:tcBorders>
-              <w:top w:val="none" w:sz="0" w:space="0" w:color="000000"/>
-              <w:left w:val="none" w:sz="0" w:space="0" w:color="000000"/>
-              <w:bottom w:val="none" w:sz="0" w:space="0" w:color="000000"/>
-              <w:right w:val="none" w:sz="0" w:space="0" w:color="000000"/>
-            </w:tcBorders>
-            <w:tcMar>
-              <w:top w:w="40" w:type="dxa"/>
-              <w:left w:w="80" w:type="dxa"/>
-              <w:bottom w:w="40" w:type="dxa"/>
-              <w:right w:w="80" w:type="dxa"/>
-            </w:tcMar>
-            <w:vAlign w:val="center"/>
-          </w:tcPr>
-          <w:p>
-            <w:r>
-              <w:rPr>
-                <w:sz w:val="19"/>
-                <w:szCs w:val="19"/>
-              </w:rPr>
-              <w:t>Mixed (E2, main)</w:t>
-            </w:r>
-          </w:p>
-        </w:tc>
-        <w:tc>
-          <w:tcPr>
-            <w:tcW w:w="800" w:type="dxa"/>
-            <w:tcBorders>
-              <w:top w:val="none" w:sz="0" w:space="0" w:color="000000"/>
-              <w:left w:val="none" w:sz="0" w:space="0" w:color="000000"/>
-              <w:bottom w:val="none" w:sz="0" w:space="0" w:color="000000"/>
-              <w:right w:val="none" w:sz="0" w:space="0" w:color="000000"/>
-            </w:tcBorders>
-            <w:tcMar>
-              <w:top w:w="40" w:type="dxa"/>
-              <w:left w:w="80" w:type="dxa"/>
-              <w:bottom w:w="40" w:type="dxa"/>
-              <w:right w:w="80" w:type="dxa"/>
-            </w:tcMar>
-            <w:vAlign w:val="center"/>
-          </w:tcPr>
-          <w:p>
-            <w:pPr>
-              <w:jc w:val="center"/>
-            </w:pPr>
-          </w:p>
-        </w:tc>
-        <w:tc>
-          <w:tcPr>
-            <w:tcW w:w="3800" w:type="dxa"/>
-            <w:tcBorders>
-              <w:top w:val="none" w:sz="0" w:space="0" w:color="000000"/>
-              <w:left w:val="none" w:sz="0" w:space="0" w:color="000000"/>
-              <w:bottom w:val="none" w:sz="0" w:space="0" w:color="000000"/>
-              <w:right w:val="none" w:sz="0" w:space="0" w:color="000000"/>
-            </w:tcBorders>
-            <w:tcMar>
-              <w:top w:w="40" w:type="dxa"/>
-              <w:left w:w="80" w:type="dxa"/>
-              <w:bottom w:w="40" w:type="dxa"/>
-              <w:right w:w="80" w:type="dxa"/>
-            </w:tcMar>
-            <w:vAlign w:val="center"/>
-          </w:tcPr>
-          <w:p>
-            <w:pPr>
-              <w:jc w:val="center"/>
-            </w:pPr>
-            <w:r>
-              <w:rPr>
-                <w:i/>
-                <w:iCs/>
-                <w:sz w:val="19"/>
-                <w:szCs w:val="19"/>
-              </w:rPr>
-              <w:t>A</w:t>
-            </w:r>
-            <w:r>
-              <w:rPr>
-                <w:sz w:val="19"/>
-                <w:szCs w:val="19"/>
-              </w:rPr>
-              <w:t xml:space="preserve">, </w:t>
-            </w:r>
-            <w:r>
-              <w:rPr>
-                <w:i/>
-                <w:iCs/>
-                <w:sz w:val="19"/>
-                <w:szCs w:val="19"/>
-              </w:rPr>
-              <w:t>C</w:t>
-            </w:r>
-            <w:r>
-              <w:rPr>
-                <w:sz w:val="19"/>
-                <w:szCs w:val="19"/>
-              </w:rPr>
-              <w:t xml:space="preserve">, </w:t>
-            </w:r>
-            <w:r>
-              <w:rPr>
-                <w:i/>
-                <w:iCs/>
-                <w:sz w:val="19"/>
-                <w:szCs w:val="19"/>
-              </w:rPr>
               <w:t>N</w:t>
-            </w:r>
-          </w:p>
-        </w:tc>
-        <w:tc>
-          <w:tcPr>
-            <w:tcW w:w="2300" w:type="dxa"/>
-            <w:tcBorders>
-              <w:top w:val="none" w:sz="0" w:space="0" w:color="000000"/>
-              <w:left w:val="none" w:sz="0" w:space="0" w:color="000000"/>
-              <w:bottom w:val="none" w:sz="0" w:space="0" w:color="000000"/>
-              <w:right w:val="none" w:sz="0" w:space="0" w:color="000000"/>
-            </w:tcBorders>
-            <w:tcMar>
-              <w:top w:w="40" w:type="dxa"/>
-              <w:left w:w="80" w:type="dxa"/>
-              <w:bottom w:w="40" w:type="dxa"/>
-              <w:right w:w="80" w:type="dxa"/>
-            </w:tcMar>
-            <w:vAlign w:val="center"/>
-          </w:tcPr>
-          <w:p>
-            <w:pPr>
-              <w:jc w:val="center"/>
-            </w:pPr>
-            <w:r>
-              <w:rPr>
-                <w:sz w:val="19"/>
-                <w:szCs w:val="19"/>
-              </w:rPr>
-              <w:t>E2_relativo_mas_nivel</w:t>
-            </w:r>
-          </w:p>
-        </w:tc>
-      </w:tr>
-      <w:tr>
-        <w:tc>
-          <w:tcPr>
-            <w:tcW w:w="2400" w:type="dxa"/>
-            <w:tcBorders>
-              <w:top w:val="none" w:sz="0" w:space="0" w:color="000000"/>
-              <w:left w:val="none" w:sz="0" w:space="0" w:color="000000"/>
-              <w:bottom w:val="none" w:sz="0" w:space="0" w:color="000000"/>
-              <w:right w:val="none" w:sz="0" w:space="0" w:color="000000"/>
-            </w:tcBorders>
-            <w:tcMar>
-              <w:top w:w="40" w:type="dxa"/>
-              <w:left w:w="80" w:type="dxa"/>
-              <w:bottom w:w="40" w:type="dxa"/>
-              <w:right w:w="80" w:type="dxa"/>
-            </w:tcMar>
-            <w:vAlign w:val="center"/>
-          </w:tcPr>
-          <w:p>
-            <w:r>
-              <w:rPr>
-                <w:sz w:val="19"/>
-                <w:szCs w:val="19"/>
-              </w:rPr>
-              <w:t>Level (E3)</w:t>
-            </w:r>
-          </w:p>
-        </w:tc>
-        <w:tc>
-          <w:tcPr>
-            <w:tcW w:w="800" w:type="dxa"/>
-            <w:tcBorders>
-              <w:top w:val="none" w:sz="0" w:space="0" w:color="000000"/>
-              <w:left w:val="none" w:sz="0" w:space="0" w:color="000000"/>
-              <w:bottom w:val="none" w:sz="0" w:space="0" w:color="000000"/>
-              <w:right w:val="none" w:sz="0" w:space="0" w:color="000000"/>
-            </w:tcBorders>
-            <w:tcMar>
-              <w:top w:w="40" w:type="dxa"/>
-              <w:left w:w="80" w:type="dxa"/>
-              <w:bottom w:w="40" w:type="dxa"/>
-              <w:right w:w="80" w:type="dxa"/>
-            </w:tcMar>
-            <w:vAlign w:val="center"/>
-          </w:tcPr>
-          <w:p>
-            <w:pPr>
-              <w:jc w:val="center"/>
-            </w:pPr>
-          </w:p>
-        </w:tc>
-        <w:tc>
-          <w:tcPr>
-            <w:tcW w:w="3800" w:type="dxa"/>
-            <w:tcBorders>
-              <w:top w:val="none" w:sz="0" w:space="0" w:color="000000"/>
-              <w:left w:val="none" w:sz="0" w:space="0" w:color="000000"/>
-              <w:bottom w:val="none" w:sz="0" w:space="0" w:color="000000"/>
-              <w:right w:val="none" w:sz="0" w:space="0" w:color="000000"/>
-            </w:tcBorders>
-            <w:tcMar>
-              <w:top w:w="40" w:type="dxa"/>
-              <w:left w:w="80" w:type="dxa"/>
-              <w:bottom w:w="40" w:type="dxa"/>
-              <w:right w:w="80" w:type="dxa"/>
-            </w:tcMar>
-            <w:vAlign w:val="center"/>
-          </w:tcPr>
-          <w:p>
-            <w:pPr>
-              <w:jc w:val="center"/>
-            </w:pPr>
-            <w:r>
-              <w:rPr>
-                <w:i/>
-                <w:iCs/>
-                <w:sz w:val="19"/>
-                <w:szCs w:val="19"/>
-              </w:rPr>
-              <w:t>y</w:t>
-            </w:r>
-            <w:r>
-              <w:rPr>
-                <w:sz w:val="19"/>
-                <w:szCs w:val="19"/>
-              </w:rPr>
-              <w:t xml:space="preserve">, </w:t>
-            </w:r>
-            <w:r>
-              <w:rPr>
-                <w:i/>
-                <w:iCs/>
-                <w:sz w:val="19"/>
-                <w:szCs w:val="19"/>
-              </w:rPr>
-              <w:t>N</w:t>
-            </w:r>
-          </w:p>
-        </w:tc>
-        <w:tc>
-          <w:tcPr>
-            <w:tcW w:w="2300" w:type="dxa"/>
-            <w:tcBorders>
-              <w:top w:val="none" w:sz="0" w:space="0" w:color="000000"/>
-              <w:left w:val="none" w:sz="0" w:space="0" w:color="000000"/>
-              <w:bottom w:val="none" w:sz="0" w:space="0" w:color="000000"/>
-              <w:right w:val="none" w:sz="0" w:space="0" w:color="000000"/>
-            </w:tcBorders>
-            <w:tcMar>
-              <w:top w:w="40" w:type="dxa"/>
-              <w:left w:w="80" w:type="dxa"/>
-              <w:bottom w:w="40" w:type="dxa"/>
-              <w:right w:w="80" w:type="dxa"/>
-            </w:tcMar>
-            <w:vAlign w:val="center"/>
-          </w:tcPr>
-          <w:p>
-            <w:pPr>
-              <w:jc w:val="center"/>
-            </w:pPr>
-            <w:r>
-              <w:rPr>
-                <w:sz w:val="19"/>
-                <w:szCs w:val="19"/>
-              </w:rPr>
-              <w:t>E3_nivel</w:t>
             </w:r>
           </w:p>
         </w:tc>
@@ -4097,7 +3758,7 @@
         <w:spacing w:before="240" w:after="60" w:line="480" w:lineRule="auto"/>
       </w:pPr>
       <w:r>
-        <w:t>4.3. Multi-algorithm clustering</w:t>
+        <w:t>4.3. Multi-algorithm clustering and choice of K</w:t>
       </w:r>
     </w:p>
     <w:p>
@@ -4117,7 +3778,7 @@
         <w:t>K</w:t>
       </w:r>
       <w:r>
-        <w:t xml:space="preserve"> = 2 to 8 clusters, implemented in scikit-learn [40] (seed 42; 10 initializations during the selection of </w:t>
+        <w:t xml:space="preserve"> = 2 to 8 clusters, implemented in scikit-learn [41] (seed 42; 10 initializations during the selection of </w:t>
       </w:r>
       <w:r>
         <w:rPr>
@@ -4127,11 +3788,7 @@
         <w:t>K</w:t>
       </w:r>
       <w:r>
-        <w:t xml:space="preserve"> and 20 in the final partitions). To check that the states did not depend on a particular algorithm, we also fitted </w:t>
-      </w:r>
-      <w:r>
-        <w:lastRenderedPageBreak/>
-        <w:t>Ward's hierarchical clustering, a Gaussian mixture model and HDBSCAN [41], and compared their partitions with that of k-means using the adjusted Rand index (ARI), which equals 1 when two partitions coincide and is close to 0 when they agree only by chance [42]. Clusters were numbered by their mean monthly rate, from lowest to highest, so that state 0 is always the lowest.</w:t>
+        <w:t xml:space="preserve"> and 20 in the final partitions). To assess how much the states depend on the algorithm, we also fitted Ward's hierarchical clustering, a Gaussian mixture model and HDBSCAN [42], and compared their partitions with that of k-means using the adjusted Rand index (ARI), which equals 1 when two partitions coincide and is close to 0 when they agree only by chance [43]. Clusters were numbered by their mean monthly rate, from lowest to highest, so that state 0 is always the lowest.</w:t>
       </w:r>
     </w:p>
     <w:p>
@@ -4159,7 +3816,11 @@
       </w:r>
       <w:proofErr w:type="spellEnd"/>
       <w:r>
-        <w:t xml:space="preserve"> one-standard-error rule [23]. For the latter, we evaluated partitions with </w:t>
+        <w:t xml:space="preserve"> one-standard-error rule [23]. For the latter, we evaluated </w:t>
+      </w:r>
+      <w:r>
+        <w:lastRenderedPageBreak/>
+        <w:t xml:space="preserve">partitions with </w:t>
       </w:r>
       <w:r>
         <w:rPr>
@@ -4169,7 +3830,7 @@
         <w:t>K</w:t>
       </w:r>
       <w:r>
-        <w:t xml:space="preserve"> = 2 to 8 by their stability, measured as the mean ARI over 100 resamples of whole territories and of 12-month blocks; row resampling is reported for comparison but does not enter the selection. Candidates were the values of </w:t>
+        <w:t xml:space="preserve"> = 2 to 8 by their stability, measured as the mean ARI over 100 resamples of whole territories and of 12-month blocks; row resampling is reported for comparison only. Candidates were the values of </w:t>
       </w:r>
       <w:r>
         <w:rPr>
@@ -4219,7 +3880,7 @@
         <w:t>K</w:t>
       </w:r>
       <w:r>
-        <w:t xml:space="preserve"> in case of ties), a descriptive summary that does not constitute evidence of separated clusters. We also report the silhouette and the Davies–Bouldin [43] and </w:t>
+        <w:t xml:space="preserve"> in case of ties), which is used as a descriptive summary. We also report the silhouette and the Davies–Bouldin [44] and </w:t>
       </w:r>
       <w:proofErr w:type="spellStart"/>
       <w:r>
@@ -4235,7 +3896,7 @@
       </w:r>
       <w:proofErr w:type="spellEnd"/>
       <w:r>
-        <w:t xml:space="preserve"> [44] indices.</w:t>
+        <w:t xml:space="preserve"> [45] indices.</w:t>
       </w:r>
     </w:p>
     <w:p>
@@ -4245,7 +3906,7 @@
         <w:spacing w:before="240" w:after="60" w:line="480" w:lineRule="auto"/>
       </w:pPr>
       <w:r>
-        <w:t>4.4. Spatial structure</w:t>
+        <w:t>4.4. Spatial association analysis</w:t>
       </w:r>
     </w:p>
     <w:p>
@@ -4255,11 +3916,7 @@
         <w:jc w:val="both"/>
       </w:pPr>
       <w:r>
-        <w:t xml:space="preserve">We measured the global autocorrelation of the 2019–2025 rates with Moran's I [19], with 9,999 permutations and two-sided p-values. To assess the robustness of the pattern we repeated the computation (a) with the consolidated period 2019–2024, (b) with the empirical Bayes adjustment, which stabilizes the variance of rates in sparsely populated territories [18], (c) with report counts and (d) with the proportion of months that each territory spent in the highest-rate state. A leave-one-out analysis also recomputed the index after removing each territory. At the </w:t>
-      </w:r>
-      <w:r>
-        <w:lastRenderedPageBreak/>
-        <w:t xml:space="preserve">local level we computed the </w:t>
+        <w:t xml:space="preserve">We measured the global autocorrelation of the 2019–2025 rates with Moran's I [19], with 9,999 permutations and two-sided p-values. To assess the robustness of the pattern we repeated the computation (a) with the consolidated period 2019–2024, (b) with the empirical Bayes adjustment, which stabilizes the variance of rates in sparsely populated territories [18], (c) with report counts and (d) with the proportion of months that each territory spent in the highest-rate state. A leave-one-out analysis also recomputed the index after removing each territory. At the local level we computed the </w:t>
       </w:r>
       <w:proofErr w:type="spellStart"/>
       <w:r>
@@ -4275,7 +3932,7 @@
       </w:r>
       <w:proofErr w:type="spellEnd"/>
       <w:r>
-        <w:t xml:space="preserve"> [45].</w:t>
+        <w:t xml:space="preserve"> [46].</w:t>
       </w:r>
     </w:p>
     <w:p>
@@ -4285,7 +3942,11 @@
         <w:jc w:val="both"/>
       </w:pPr>
       <w:r>
-        <w:t>For the main local analyses, with contiguity and with the four nearest neighbors, we obtained p-values by exact conditional randomization. With the value of the territory evaluated and its number of neighbors fixed, we enumerated all combinations of values that could occupy the neighboring positions among the other 25 territories; with the uniform weights used, both statistics depend only on the sum of those values. The two-sided p-value doubles the smaller of the proportions of combinations whose sum is greater than or equal to, or less than or equal to, the observed sum, with a maximum of 1, and in the absence of ties its smallest attainable value is:</w:t>
+        <w:t xml:space="preserve">For the main local analyses, with contiguity and with the four nearest neighbors, we obtained p-values by exact conditional randomization. With the value of the territory evaluated and its number of neighbors fixed, we enumerated all combinations of values that could occupy the neighboring positions among the other 25 territories; with the uniform weights used, both statistics depend only on the sum of those values. The two-sided p-value doubles the smaller of the proportions of combinations whose sum is greater than or equal to, or less than or equal to, </w:t>
+      </w:r>
+      <w:r>
+        <w:lastRenderedPageBreak/>
+        <w:t>the observed sum, with a maximum of 1, and in the absence of ties its smallest attainable value is:</w:t>
       </w:r>
     </w:p>
     <w:p>
@@ -4486,7 +4147,7 @@
       </w:r>
       <w:proofErr w:type="spellEnd"/>
       <w:r>
-        <w:t xml:space="preserve"> = 2/25 = 0.08, so Callao and Tumbes cannot reach significance at 5% with this test and the contiguity matrix; this restriction reflects the resolution of the procedure and does not imply an absence of spatial association. When the combinations exceeded one million, we used 99,999 random draws with a fixed seed. We controlled the FDR across the 26 territories with the Benjamini–Hochberg procedure, and we also report uncorrected results and, as a sensitivity check, results with the Benjamini–</w:t>
+        <w:t xml:space="preserve"> = 2/25 = 0.08, so local significance at 5% for Callao and Tumbes under contiguity lies beyond the resolution of the test; we therefore report this minimum for each territory. When the combinations exceeded one million, we used 99,999 random draws with a fixed seed. We controlled the FDR across the 26 territories with the Benjamini–Hochberg procedure, and we also report uncorrected results and, as a sensitivity check, results with the Benjamini–</w:t>
       </w:r>
       <w:proofErr w:type="spellStart"/>
       <w:r>
@@ -4494,7 +4155,7 @@
       </w:r>
       <w:proofErr w:type="spellEnd"/>
       <w:r>
-        <w:t xml:space="preserve"> procedure, which is valid under any form of dependence among the tests [46]. Exact enumeration removes sampling variability, and the fixed seed makes the approximate computations reproducible.</w:t>
+        <w:t xml:space="preserve"> procedure, which is valid under any form of dependence among the tests [47]. Exact enumeration removes sampling variability, and the fixed seed makes the approximate computations reproducible.</w:t>
       </w:r>
     </w:p>
     <w:p>
@@ -4504,7 +4165,7 @@
         <w:spacing w:before="240" w:after="60" w:line="480" w:lineRule="auto"/>
       </w:pPr>
       <w:r>
-        <w:t>4.5. Temporal dynamics</w:t>
+        <w:t>4.5. Temporal transfer of the states</w:t>
       </w:r>
     </w:p>
     <w:p>
@@ -4514,11 +4175,7 @@
         <w:jc w:val="both"/>
       </w:pPr>
       <w:r>
-        <w:t xml:space="preserve">Temporal transfer was assessed by applying the model fitted in the training period to the observations of the following year. On the same observations, we refitted k-means with the same number of states and compared both assignments with the ARI. Because the refitted </w:t>
-      </w:r>
-      <w:r>
-        <w:lastRenderedPageBreak/>
-        <w:t>partition is an internal reference rather than a true classification, the ARI measures agreement, not predictive accuracy. We also compared the proportion of observations in each state between training and the evaluation year with the base-2 Jensen–Shannon distance [47,48], which ranges from 0 to 1 and describes changes in the distribution of states but not in individual assignments.</w:t>
+        <w:t>Temporal transfer was assessed by applying the model fitted in the training period to the observations of the following year. On the same observations, we refitted k-means with the same number of states and compared both assignments with the ARI; the refitted partition serves as an internal reference, so the ARI measures the agreement between both assignments. We also compared the proportion of observations in each state between training and the evaluation year with the base-2 Jensen–Shannon distance [48,49], which ranges from 0 to 1 and summarizes changes in the distribution of states.</w:t>
       </w:r>
     </w:p>
     <w:p>
@@ -4528,7 +4185,15 @@
         <w:spacing w:before="240" w:after="60" w:line="480" w:lineRule="auto"/>
       </w:pPr>
       <w:r>
-        <w:t>4.6. Multilevel validation</w:t>
+        <w:t xml:space="preserve">4.6. Design of </w:t>
+      </w:r>
+      <w:proofErr w:type="gramStart"/>
+      <w:r>
+        <w:t>the multilevel</w:t>
+      </w:r>
+      <w:proofErr w:type="gramEnd"/>
+      <w:r>
+        <w:t xml:space="preserve"> validation</w:t>
       </w:r>
     </w:p>
     <w:p>
@@ -4538,7 +4203,7 @@
         <w:jc w:val="both"/>
       </w:pPr>
       <w:r>
-        <w:t>The last stage assesses whether the previous patterns reflect the phenomenon or depend on analytical decisions, and it does so at three complementary levels.</w:t>
+        <w:t>The last stage assesses the robustness of the previous patterns to analytical decisions at three complementary levels.</w:t>
       </w:r>
     </w:p>
     <w:p>
@@ -4552,6 +4217,7 @@
           <w:b/>
           <w:bCs/>
         </w:rPr>
+        <w:lastRenderedPageBreak/>
         <w:t>Association with territorial identity.</w:t>
       </w:r>
       <w:r>
@@ -4718,7 +4384,7 @@
         <w:t>U</w:t>
       </w:r>
       <w:r>
-        <w:t xml:space="preserve"> = 0.25 means that knowing the territory removes a quarter of the uncertainty about the state, without implying that the territory causes membership. The observed NMI was compared with a reference distribution of 999 permutations that, within each year, randomly reassign territorial identities using the same reassignment for all months of each territory, which preserves the sequences within each year but breaks the territorial correspondence across years. We call </w:t>
+        <w:t xml:space="preserve"> = 0.25 means that knowing the territory removes a quarter of the uncertainty about the state; it is a measure of shared information. The observed NMI was compared with a reference distribution of 999 permutations that, within each year, randomly reassign territorial identities using the same reassignment for all months of each territory, which preserves the sequences within each year but breaks the territorial correspondence across years. We call </w:t>
       </w:r>
       <w:r>
         <w:rPr>
@@ -4738,7 +4404,7 @@
         <w:t>U</w:t>
       </w:r>
       <w:r>
-        <w:t xml:space="preserve"> ≥ 0.25; this threshold organizes the comparison across specifications, but it is not a universal criterion and does not by itself demonstrate information leakage.</w:t>
+        <w:t xml:space="preserve"> ≥ 0.25, an operational criterion defined in the analysis plan to compare specifications.</w:t>
       </w:r>
     </w:p>
     <w:p>
@@ -4755,11 +4421,7 @@
         <w:t>Reproduction of the initial analysis (baseline).</w:t>
       </w:r>
       <w:r>
-        <w:t xml:space="preserve"> To obtain a reference point, we reproduced an initial analysis of these data conducted by the authors in a conventional way. That analysis clustered the register cells into three states with nine features, robust scaling and </w:t>
-      </w:r>
-      <w:r>
-        <w:lastRenderedPageBreak/>
-        <w:t>the maximum-silhouette rule, and it reported a southern Andean corridor of hot spots using five nearest neighbors on hand-digitized centroids, one-sided p-values and no multiple-comparison correction.</w:t>
+        <w:t xml:space="preserve"> To obtain a reference point, we reproduced an initial analysis of these data conducted by the authors in a conventional way. That analysis clustered the register cells into three states with nine features, robust scaling and the maximum-silhouette rule, and it reported a southern Andean corridor of hot spots using five nearest neighbors on hand-digitized centroids, one-sided p-values and no multiple-comparison correction.</w:t>
       </w:r>
     </w:p>
     <w:p>
@@ -4776,7 +4438,7 @@
         <w:t>Multiverse.</w:t>
       </w:r>
       <w:r>
-        <w:t xml:space="preserve"> To examine the sensitivity of the conclusions to analytical decisions, we evaluated a defined set of specifications [31,32], which does not exhaust all possible decisions. The clustering multiverse (M1) crossed the unit of analysis (panel or cell), the trimming of extreme values, the feature space (E1, E2, E3, E2 plus territory weight and, for cells, the nine initial features), the scaling and the rule for choosing </w:t>
+        <w:t xml:space="preserve"> To examine the sensitivity of the conclusions to analytical decisions, we evaluated a set of specifications defined in the analysis plan [31,32]. The clustering multiverse (M1) crossed the unit of analysis (panel or cell), the trimming of extreme values, the feature space (E1, E2, E3, E2 plus territory share and, for cells, the nine initial features), the scaling and the rule for choosing </w:t>
       </w:r>
       <w:r>
         <w:rPr>
@@ -4796,7 +4458,11 @@
         <w:t>K</w:t>
       </w:r>
       <w:r>
-        <w:t xml:space="preserve"> between 2 and 6, 199 permutations for the null distribution, silhouettes on 5,000 rows and, as in the initial analysis, a subsample of 20,000 cells. The spatial multiverse (M2) crossed the trimming of extremes, the period, the variable (two rates or the count), five neighborhood matrices (including the two of the initial analysis), the p-value type (one- or two-sided) and the multiple-comparison correction, for a total of 240 specifications. In each specification we evaluated claims defined in the plan, such as “there is structure according to the silhouette (≥ 0.50)”, “there is identity leakage” or “there is a southern Andean hot spot”, and we summarized the association between each decision and the metrics with partial eta squared (η²</w:t>
+        <w:t xml:space="preserve"> between 2 and 6, 199 permutations </w:t>
+      </w:r>
+      <w:r>
+        <w:lastRenderedPageBreak/>
+        <w:t>for the null distribution, silhouettes on 5,000 rows and, as in the initial analysis, a subsample of 20,000 cells. The spatial multiverse (M2) crossed the trimming of extremes, the period, the variable (two rates or the count), five neighborhood matrices (including the two of the initial analysis), the p-value type (one- or two-sided) and the multiple-comparison correction, for a total of 240 specifications. In each specification we evaluated claims defined in the plan, such as “there is structure according to the silhouette (≥ 0.50)”, “there is identity leakage” or “there is a southern Andean hot spot”, the latter met when at least one of the five territories of the initial corridor (Arequipa, Ayacucho, Cusco, Moquegua and Tacna) is a hot spot (Puno, a sixth hot spot in the reproduction, lies outside that definition). The support of each claim is the proportion of specifications that meet it, and partial eta squared (η²</w:t>
       </w:r>
       <w:r>
         <w:rPr>
@@ -4805,7 +4471,7 @@
         <w:t>p</w:t>
       </w:r>
       <w:r>
-        <w:t>), which we use only to rank the relative importance of factors within the design, not as a causal effect or an additive share of variance.</w:t>
+        <w:t>) ranks the relative importance of each decision within the design.</w:t>
       </w:r>
     </w:p>
     <w:p>
@@ -4833,11 +4499,7 @@
       </w:r>
       <w:proofErr w:type="spellEnd"/>
       <w:r>
-        <w:t xml:space="preserve"> notebook and ten automated tests of its critical components. The version analyzed (3.3.2) fixes all decisions in a versioned analysis plan whose history documents each change and its rationale. All random operations use seed 42, each input file is identified by its SHA-256 hash, and every analytical result is read from a single results file, from which the figures </w:t>
-      </w:r>
-      <w:r>
-        <w:lastRenderedPageBreak/>
-        <w:t xml:space="preserve">are also generated. The reference run on Google </w:t>
+        <w:t xml:space="preserve"> notebook and ten automated tests of its critical components. The version analyzed (3.3.2) fixes all decisions in a versioned analysis plan whose history documents each change and its rationale. All random operations use seed 42, each input file is identified by its SHA-256 hash, and every analytical result is read from a single results file, from which the figures are also generated. The reference run on Google </w:t>
       </w:r>
       <w:proofErr w:type="spellStart"/>
       <w:r>
@@ -4862,7 +4524,7 @@
         <w:t>−10</w:t>
       </w:r>
       <w:r>
-        <w:t>; the remaining table differed only in internal HDBSCAN indices that the article does not report.</w:t>
+        <w:t>; the remaining table differed only in internal HDBSCAN indices outside the results of the article.</w:t>
       </w:r>
     </w:p>
     <w:p>
@@ -4872,6 +4534,7 @@
         <w:spacing w:before="360" w:after="120" w:line="480" w:lineRule="auto"/>
       </w:pPr>
       <w:r>
+        <w:lastRenderedPageBreak/>
         <w:t>5. Results</w:t>
       </w:r>
     </w:p>
@@ -4882,7 +4545,7 @@
         <w:spacing w:before="240" w:after="60" w:line="480" w:lineRule="auto"/>
       </w:pPr>
       <w:r>
-        <w:t>5.1. Rates and priority territories</w:t>
+        <w:t>5.1. Territorial differences in rates</w:t>
       </w:r>
     </w:p>
     <w:p>
@@ -4892,7 +4555,22 @@
         <w:jc w:val="both"/>
       </w:pPr>
       <w:r>
-        <w:t xml:space="preserve">The report rate varied 3.5-fold across territories, from 2.84 per 10,000 person-years in Cajamarca to 9.96 in Tacna (Fig. 2). Ten territories had a rate higher than that of the rest of the country, eight had a lower rate and eight were not distinguishable from the rest, a classification that remained </w:t>
+        <w:t>Between 2019 and 2025 the register recorded 142,374 reports, with an annual peak in 2019 and values between 18,192 and 20,947 from 2021 onward (Fig. 2)</w:t>
+      </w:r>
+      <w:r>
+        <w:t>.</w:t>
+      </w:r>
+      <w:r>
+        <w:t xml:space="preserve"> </w:t>
+      </w:r>
+      <w:r>
+        <w:t xml:space="preserve">The report rate varied 3.5-fold across territories, from 2.84 per 10,000 person-years in Cajamarca to 9.96 in Tacna (Fig. </w:t>
+      </w:r>
+      <w:r>
+        <w:t>3</w:t>
+      </w:r>
+      <w:r>
+        <w:t xml:space="preserve">). Ten territories had a rate higher than that of the rest of the country, eight had a lower rate and eight were not distinguishable from the rest, a classification that remained </w:t>
       </w:r>
       <w:proofErr w:type="gramStart"/>
       <w:r>
@@ -4905,88 +4583,20 @@
     </w:p>
     <w:p>
       <w:pPr>
+        <w:keepNext/>
         <w:spacing w:line="480" w:lineRule="auto"/>
         <w:ind w:firstLine="425"/>
         <w:jc w:val="both"/>
       </w:pPr>
       <w:r>
-        <w:t>Five territories in the center and south of the country topped the list: Tacna (</w:t>
-      </w:r>
-      <w:r>
-        <w:rPr>
-          <w:i/>
-          <w:iCs/>
-        </w:rPr>
-        <w:t>RR</w:t>
-      </w:r>
-      <w:r>
-        <w:t xml:space="preserve"> = 1.64; 95% CI: 1.27–1.96), Apurímac (1.58; 1.51–1.76), Huánuco (1.51; 1.42–1.65), Cusco (1.49; 1.40–1.58) and Junín (1.43; 1.31–1.52). In all of them, the annual rate exceeded that of the rest of the country in each of the seven years of the study (Fig. 3). They were followed by Ayacucho (1.32; 1.09–1.59; five of seven years), Lambayeque (1.26) and Arequipa (1.20), the latter two also above the rest in all seven years, and then by Metropolitan Lima (1.14) and Callao (1.06).</w:t>
-      </w:r>
-    </w:p>
-    <w:p>
-      <w:pPr>
-        <w:spacing w:line="480" w:lineRule="auto"/>
-        <w:ind w:firstLine="425"/>
-        <w:jc w:val="both"/>
-      </w:pPr>
-      <w:r>
-        <w:t>Metropolitan Lima clearly illustrates the difference between volume and intensity. Although it ranked first in number of reports (46,848, or 33% of the national total), it ranked ninth by rate (6.70), and its excess over the rest of the country, 14% (</w:t>
-      </w:r>
-      <w:r>
-        <w:rPr>
-          <w:i/>
-          <w:iCs/>
-        </w:rPr>
-        <w:t>RR</w:t>
-      </w:r>
-      <w:r>
-        <w:t xml:space="preserve"> = 1.14; 95% CI: 1.05–1.19), recurred in six of the seven years. It is therefore a moderate and persistent excess, far from what its volume would suggest. Callao, with a rate of 6.48, showed an even smaller excess (6%).</w:t>
-      </w:r>
-    </w:p>
-    <w:p>
-      <w:pPr>
-        <w:spacing w:line="480" w:lineRule="auto"/>
-        <w:ind w:firstLine="425"/>
-        <w:jc w:val="both"/>
-      </w:pPr>
-      <w:r>
-        <w:lastRenderedPageBreak/>
-        <w:t>At the opposite end, the eight territories with lower rates were Cajamarca (</w:t>
-      </w:r>
-      <w:r>
-        <w:rPr>
-          <w:i/>
-          <w:iCs/>
-        </w:rPr>
-        <w:t>RR</w:t>
-      </w:r>
-      <w:r>
-        <w:t xml:space="preserve"> = 0.45), La Libertad (0.59), Piura (0.61), Loreto (0.61), San Martín (0.68), </w:t>
-      </w:r>
-      <w:proofErr w:type="spellStart"/>
-      <w:r>
-        <w:t>Áncash</w:t>
-      </w:r>
-      <w:proofErr w:type="spellEnd"/>
-      <w:r>
-        <w:t xml:space="preserve"> (0.73), Ica (0.77) and Amazonas (0.80); none exceeded the rest of the country in any year, and six of them (Amazonas, Cajamarca, La Libertad, Loreto, Piura and San Martín) are located in the north. The territories that were not distinguishable include some with wide intervals owing to their smaller populations, such as Madre de Dios (1.10; 0.75–1.26) and Pasco (0.99; 0.84–1.24), and others whose rates are close to that of the rest, such as Moquegua (0.94) and Puno (0.86).</w:t>
-      </w:r>
-    </w:p>
-    <w:p>
-      <w:pPr>
-        <w:keepNext/>
-        <w:spacing w:before="240" w:after="120"/>
-        <w:jc w:val="center"/>
-      </w:pPr>
-      <w:r>
         <w:rPr>
           <w:noProof/>
         </w:rPr>
         <w:drawing>
-          <wp:inline distT="0" distB="0" distL="0" distR="0" wp14:anchorId="1283031A" wp14:editId="471ABE28">
-            <wp:extent cx="5400675" cy="4562475"/>
-            <wp:effectExtent l="0" t="0" r="0" b="0"/>
-            <wp:docPr id="710981832" name="Fig2_priority_en.png" descr="Fig. 2. Priority territories according to the missing-person report rate, 2019–2025. (a) Classification of the 26 territories: rate higher than, lower than or not distinguishable from that of the rest of the country (false discovery rate control at 5%); numbers identify each territory by its rank in (b), and the inset enlarges Metropolitan Lima (9), Callao (12) and Lima Region (15). (b) Rate ratio of each territory versus the rest of the country, with its 95% confidence interval (12-month block bootstrap, 9,999 replicates); on the right, each territory's share of national reports. Map lines delineate study areas and do not necessarily depict accepted national boundaries." title="Fig2_priority_en.png"/>
+          <wp:inline distT="0" distB="0" distL="0" distR="0" wp14:anchorId="321700F5" wp14:editId="2F65144F">
+            <wp:extent cx="5212080" cy="3227206"/>
+            <wp:effectExtent l="0" t="0" r="7620" b="7620"/>
+            <wp:docPr id="575664788" name="Imagen 2"/>
             <wp:cNvGraphicFramePr>
               <a:graphicFrameLocks xmlns:a="http://schemas.openxmlformats.org/drawingml/2006/main" noChangeAspect="1"/>
             </wp:cNvGraphicFramePr>
@@ -4994,13 +4604,19 @@
               <a:graphicData uri="http://schemas.openxmlformats.org/drawingml/2006/picture">
                 <pic:pic xmlns:pic="http://schemas.openxmlformats.org/drawingml/2006/picture">
                   <pic:nvPicPr>
-                    <pic:cNvPr id="0" name=""/>
+                    <pic:cNvPr id="0" name="Picture 2"/>
                     <pic:cNvPicPr>
                       <a:picLocks noChangeAspect="1" noChangeArrowheads="1"/>
                     </pic:cNvPicPr>
                   </pic:nvPicPr>
                   <pic:blipFill>
-                    <a:blip r:embed="rId8"/>
+                    <a:blip r:embed="rId9" cstate="print">
+                      <a:extLst>
+                        <a:ext uri="{28A0092B-C50C-407E-A947-70E740481C1C}">
+                          <a14:useLocalDpi xmlns:a14="http://schemas.microsoft.com/office/drawing/2010/main" val="0"/>
+                        </a:ext>
+                      </a:extLst>
+                    </a:blip>
                     <a:srcRect/>
                     <a:stretch>
                       <a:fillRect/>
@@ -5009,11 +4625,15 @@
                   <pic:spPr bwMode="auto">
                     <a:xfrm>
                       <a:off x="0" y="0"/>
-                      <a:ext cx="5400675" cy="4562475"/>
+                      <a:ext cx="5212080" cy="3227206"/>
                     </a:xfrm>
                     <a:prstGeom prst="rect">
                       <a:avLst/>
                     </a:prstGeom>
+                    <a:noFill/>
+                    <a:ln>
+                      <a:noFill/>
+                    </a:ln>
                   </pic:spPr>
                 </pic:pic>
               </a:graphicData>
@@ -5024,13 +4644,22 @@
     </w:p>
     <w:p>
       <w:pPr>
-        <w:spacing w:after="360"/>
+        <w:pStyle w:val="Descripcin"/>
         <w:jc w:val="both"/>
+        <w:rPr>
+          <w:i w:val="0"/>
+          <w:iCs w:val="0"/>
+          <w:sz w:val="20"/>
+          <w:szCs w:val="20"/>
+        </w:rPr>
       </w:pPr>
       <w:r>
         <w:rPr>
           <w:b/>
           <w:bCs/>
+          <w:i w:val="0"/>
+          <w:iCs w:val="0"/>
+          <w:color w:val="000000" w:themeColor="text1"/>
           <w:sz w:val="20"/>
           <w:szCs w:val="20"/>
         </w:rPr>
@@ -5038,10 +4667,13 @@
       </w:r>
       <w:r>
         <w:rPr>
+          <w:i w:val="0"/>
+          <w:iCs w:val="0"/>
+          <w:color w:val="000000" w:themeColor="text1"/>
           <w:sz w:val="20"/>
           <w:szCs w:val="20"/>
         </w:rPr>
-        <w:t xml:space="preserve"> Priority territories according to the missing-person report rate, 2019–2025. (a) Classification of the 26 territories: rate higher than, lower than or not distinguishable from that of the rest of the country (false discovery rate control at 5%); numbers identify each territory by its rank in (b), and the inset enlarges Metropolitan Lima (9), Callao (12) and Lima Region (15). (b) Rate ratio of each territory versus the rest of the country, with its 95% confidence interval (12-month block bootstrap, 9,999 replicates); on the right, each territory's share of national reports. Map lines delineate study areas and do not necessarily depict accepted national boundaries.</w:t>
+        <w:t xml:space="preserve"> Reports recorded, 2019–2025. (a) Annual total and change from the previous year. (b) Monthly total; the circle marks January 2023, with no data for six departments. 2025 is preliminary.</w:t>
       </w:r>
     </w:p>
     <w:p>
@@ -5051,11 +4683,83 @@
         <w:jc w:val="both"/>
       </w:pPr>
       <w:r>
-        <w:t xml:space="preserve">Fig. 3 breaks this classification down by year and makes it possible to distinguish a persistent excess from one concentrated in a few years. Apurímac, Huánuco, Cusco and Junín </w:t>
+        <w:t>Five territories in the center and south of the country topped the list: Tacna (</w:t>
+      </w:r>
+      <w:r>
+        <w:rPr>
+          <w:i/>
+          <w:iCs/>
+        </w:rPr>
+        <w:t>RR</w:t>
+      </w:r>
+      <w:r>
+        <w:t xml:space="preserve"> = 1.64; 95% CI: 1.27–1.96), Apurímac (1.58; 1.51–1.76), Huánuco (1.51; 1.42–1.65), Cusco (1.49; 1.40–1.58) and Junín (1.43; 1.31–1.52). In all of them, the annual rate exceeded that of the rest of the country in each of the seven years of </w:t>
+      </w:r>
+      <w:proofErr w:type="gramStart"/>
+      <w:r>
+        <w:t>the study</w:t>
+      </w:r>
+      <w:proofErr w:type="gramEnd"/>
+      <w:r>
+        <w:t xml:space="preserve"> (Fig. </w:t>
+      </w:r>
+      <w:r>
+        <w:t>4</w:t>
+      </w:r>
+      <w:r>
+        <w:t xml:space="preserve">). They were followed by Ayacucho </w:t>
       </w:r>
       <w:r>
         <w:lastRenderedPageBreak/>
-        <w:t>remained between 1.19 and 1.79 in every year, and the excess of Cusco grew from 1.29 in 2021 to 1.67 in 2025. In Tacna, by contrast, the excess declined steadily from 2.48 in 2019 to 1.01 in 2024 and rebounded slightly in 2025 (1.17), so its first place is driven mainly by the early years of the period. Ayacucho exceeded the rest until 2023 but fell below it in 2024 (0.94) and 2025 (0.73). Territories with lower rates, by contrast, remained so consistently; Cajamarca, for example, never exceeded 0.54, whereas among the non-distinguishable territories Madre de Dios fluctuated between 0.45 and 1.65, which explains the width of its interval. These annual ratios are descriptive and carry no confidence interval; the classification is based on the full period.</w:t>
+        <w:t>(1.32; 1.09–1.59; five of seven years), Lambayeque (1.26) and Arequipa (1.20), the latter two also above the rest in all seven years, and then by Metropolitan Lima (1.14) and Callao (1.06).</w:t>
+      </w:r>
+    </w:p>
+    <w:p>
+      <w:pPr>
+        <w:spacing w:line="480" w:lineRule="auto"/>
+        <w:ind w:firstLine="425"/>
+        <w:jc w:val="both"/>
+      </w:pPr>
+      <w:r>
+        <w:t>Metropolitan Lima clearly illustrates the difference between volume and intensity: it ranked first in number of reports (46,848, or 33% of the national total) and ninth by rate (6.70), with an excess over the rest of the country of 14% (</w:t>
+      </w:r>
+      <w:r>
+        <w:rPr>
+          <w:i/>
+          <w:iCs/>
+        </w:rPr>
+        <w:t>RR</w:t>
+      </w:r>
+      <w:r>
+        <w:t xml:space="preserve"> = 1.14; 95% CI: 1.05–1.19) that recurred in six of the seven years, that is, a moderate and persistent excess. Callao, with a rate of 6.48, showed an excess of 6%.</w:t>
+      </w:r>
+    </w:p>
+    <w:p>
+      <w:pPr>
+        <w:spacing w:line="480" w:lineRule="auto"/>
+        <w:ind w:firstLine="425"/>
+        <w:jc w:val="both"/>
+      </w:pPr>
+      <w:r>
+        <w:t>At the opposite end, the eight territories with lower rates were Cajamarca (</w:t>
+      </w:r>
+      <w:r>
+        <w:rPr>
+          <w:i/>
+          <w:iCs/>
+        </w:rPr>
+        <w:t>RR</w:t>
+      </w:r>
+      <w:r>
+        <w:t xml:space="preserve"> = 0.45), La Libertad (0.59), Piura (0.61), Loreto (0.61), San Martín (0.68), </w:t>
+      </w:r>
+      <w:proofErr w:type="spellStart"/>
+      <w:r>
+        <w:t>Áncash</w:t>
+      </w:r>
+      <w:proofErr w:type="spellEnd"/>
+      <w:r>
+        <w:t xml:space="preserve"> (0.73), Ica (0.77) and Amazonas (0.80), all below the rest of the country in each of the seven years, and six of them (Amazonas, Cajamarca, La Libertad, Loreto, Piura and San Martín) are located in the north. The territories that were not distinguishable include some with wide intervals owing to their smaller populations, such as Madre de Dios (1.10; 0.75–1.26) and Pasco (0.99; 0.84–1.24), and others whose rates are close to that of the rest, such as Moquegua (0.94) and Puno (0.86).</w:t>
       </w:r>
     </w:p>
     <w:p>
@@ -5068,152 +4772,12 @@
         <w:rPr>
           <w:noProof/>
         </w:rPr>
-        <w:drawing>
-          <wp:inline distT="0" distB="0" distL="0" distR="0" wp14:anchorId="67FDE9D5" wp14:editId="13008066">
-            <wp:extent cx="5400675" cy="4857750"/>
-            <wp:effectExtent l="0" t="0" r="0" b="0"/>
-            <wp:docPr id="823978517" name="Fig3_persistence_en.png" descr="Fig. 3. Persistence of the rate ratio, 2019–2025. Each cell shows the ratio between the territory's rate in that year and that of the rest of the country (observed exposure); values above 1 (orange) indicate a higher rate, and values below 1 (blue) a lower rate. The color scale is logarithmic, so that 0.5 and 2 are equidistant from 1. The right-hand columns show the classification for the full period (Fig. 2) and the number of years in which the rate exceeded that of the rest of the country. Territories are ordered by their full-period rate ratio; 2025 is preliminary according to the source." title="Fig3_persistence_en.png"/>
-            <wp:cNvGraphicFramePr>
-              <a:graphicFrameLocks xmlns:a="http://schemas.openxmlformats.org/drawingml/2006/main" noChangeAspect="1"/>
-            </wp:cNvGraphicFramePr>
-            <a:graphic xmlns:a="http://schemas.openxmlformats.org/drawingml/2006/main">
-              <a:graphicData uri="http://schemas.openxmlformats.org/drawingml/2006/picture">
-                <pic:pic xmlns:pic="http://schemas.openxmlformats.org/drawingml/2006/picture">
-                  <pic:nvPicPr>
-                    <pic:cNvPr id="0" name=""/>
-                    <pic:cNvPicPr>
-                      <a:picLocks noChangeAspect="1" noChangeArrowheads="1"/>
-                    </pic:cNvPicPr>
-                  </pic:nvPicPr>
-                  <pic:blipFill>
-                    <a:blip r:embed="rId9"/>
-                    <a:srcRect/>
-                    <a:stretch>
-                      <a:fillRect/>
-                    </a:stretch>
-                  </pic:blipFill>
-                  <pic:spPr bwMode="auto">
-                    <a:xfrm>
-                      <a:off x="0" y="0"/>
-                      <a:ext cx="5400675" cy="4857750"/>
-                    </a:xfrm>
-                    <a:prstGeom prst="rect">
-                      <a:avLst/>
-                    </a:prstGeom>
-                  </pic:spPr>
-                </pic:pic>
-              </a:graphicData>
-            </a:graphic>
-          </wp:inline>
-        </w:drawing>
-      </w:r>
-    </w:p>
-    <w:p>
-      <w:pPr>
-        <w:spacing w:after="360"/>
-        <w:jc w:val="both"/>
-      </w:pPr>
-      <w:r>
-        <w:rPr>
-          <w:b/>
-          <w:bCs/>
-          <w:sz w:val="20"/>
-          <w:szCs w:val="20"/>
-        </w:rPr>
-        <w:t>Fig. 3.</w:t>
-      </w:r>
-      <w:r>
-        <w:rPr>
-          <w:sz w:val="20"/>
-          <w:szCs w:val="20"/>
-        </w:rPr>
-        <w:t xml:space="preserve"> Persistence of the rate ratio, 2019–2025. Each cell shows the ratio between the territory's rate in that year and that of the rest of the country (observed exposure); values above 1 (orange) indicate a higher rate, and values below 1 (blue) a lower rate. The color scale is logarithmic, so that 0.5 and 2 are equidistant from 1. The right-hand columns show the classification for the full period (Fig. 2) and the number of years in which the rate exceeded that </w:t>
-      </w:r>
-      <w:r>
-        <w:rPr>
-          <w:sz w:val="20"/>
-          <w:szCs w:val="20"/>
-        </w:rPr>
-        <w:lastRenderedPageBreak/>
-        <w:t>of the rest of the country. Territories are ordered by their full-period rate ratio; 2025 is preliminary according to the source.</w:t>
-      </w:r>
-    </w:p>
-    <w:p>
-      <w:pPr>
-        <w:pStyle w:val="Ttulo2"/>
-        <w:keepNext/>
-        <w:spacing w:before="240" w:after="60" w:line="480" w:lineRule="auto"/>
-      </w:pPr>
-      <w:r>
-        <w:t>5.2. Spatiotemporal states</w:t>
-      </w:r>
-    </w:p>
-    <w:p>
-      <w:pPr>
-        <w:spacing w:line="480" w:lineRule="auto"/>
-        <w:ind w:firstLine="425"/>
-        <w:jc w:val="both"/>
-      </w:pPr>
-      <w:r>
-        <w:t xml:space="preserve">In the mixed space E2, the diagnostics provided no consistent evidence of clearly separated and stable clusters (Fig. 4a–c). The gap statistic favored </w:t>
-      </w:r>
-      <w:r>
-        <w:rPr>
-          <w:i/>
-          <w:iCs/>
-        </w:rPr>
-        <w:t>K</w:t>
-      </w:r>
-      <w:r>
-        <w:t xml:space="preserve"> = 1, with a value of 1.851 compared with 1.380–1.432 for </w:t>
-      </w:r>
-      <w:r>
-        <w:rPr>
-          <w:i/>
-          <w:iCs/>
-        </w:rPr>
-        <w:t>K</w:t>
-      </w:r>
-      <w:r>
-        <w:t xml:space="preserve"> = 2–8; the silhouette remained between 0.28 and 0.29, and no partition reached a mean ARI of 0.80 under both resampling schemes. The fallback rule was therefore applied, and it selected </w:t>
-      </w:r>
-      <w:r>
-        <w:rPr>
-          <w:i/>
-          <w:iCs/>
-        </w:rPr>
-        <w:t>K</w:t>
-      </w:r>
-      <w:r>
-        <w:t xml:space="preserve"> = 4 as the partition with the highest minimum stability (0.63). The four states are accordingly used to summarize monthly profiles of the features analyzed, not as natural categories of the phenomenon. Agreement with other algorithms was also limited: the ARI with respect to k-means was 0.31 for Ward and 0.23 for the Gaussian mixture, whereas HDBSCAN labeled 70% of the observations as noise.</w:t>
-      </w:r>
-    </w:p>
-    <w:p>
-      <w:pPr>
-        <w:spacing w:line="480" w:lineRule="auto"/>
-        <w:ind w:firstLine="425"/>
-        <w:jc w:val="both"/>
-      </w:pPr>
-      <w:r>
-        <w:t>The profile of the four states reveals that they combine two types of difference (Fig. 4d). Two of them describe the dynamics of the month and appear in all 26 territories: state 0 gathers 163 months well below the usual level, with a mean seasonal anomaly of −1.40 residual standard deviations of the territory (SD = 0.64) and a mean monthly rate of 0.31 per 10,000 inhabitants (SD = 0.16), and state 3 gathers 294 months above the usual level, with an anomaly of +1.21 (SD = 0.55) and a rate of 0.78 (SD = 0.29). The other two group months with anomalies close to zero (−0.38 and −0.11) and differ mainly in the level of the territory: state 1 (500 months from 19 territories) corresponds to territories with a low prior level, with a standardized median of −1.00, and state 2 (439 months from 20 territories) to territories with a high level, with a median of 0.59. This composition explains why, as shown in Section 5.5, the states share information with territorial identity.</w:t>
-      </w:r>
-    </w:p>
-    <w:p>
-      <w:pPr>
-        <w:keepNext/>
-        <w:spacing w:before="240" w:after="120"/>
-        <w:jc w:val="center"/>
-      </w:pPr>
-      <w:r>
-        <w:rPr>
-          <w:noProof/>
-        </w:rPr>
         <w:lastRenderedPageBreak/>
         <w:drawing>
-          <wp:inline distT="0" distB="0" distL="0" distR="0" wp14:anchorId="154A91BD" wp14:editId="68C5BA7A">
-            <wp:extent cx="5400675" cy="3905250"/>
+          <wp:inline distT="0" distB="0" distL="0" distR="0" wp14:anchorId="23612B72" wp14:editId="61CC7BAB">
+            <wp:extent cx="5400675" cy="4562475"/>
             <wp:effectExtent l="0" t="0" r="0" b="0"/>
-            <wp:docPr id="1657445213" name="Fig4_states_en.png" descr="Fig. 4. Choice of the number of clusters and profile of the states in the mixed space (E2), 2019–2023 (n = 1,396 territory-months). (a) Gap statistic with its standard error; the diagnostic favors K = 1 and does not support a separation into several clusters in the representation evaluated. (b) Mean stability (ARI) over 100 resamples by resampling scheme; the dashed line marks the 0.80 threshold and the vertical dotted line the K chosen by the fallback rule. (c) Silhouette index; the dashed line marks the silhouette reference value adopted in the analysis (0.50). (d) Distribution of the three standardized features in each of the four states (K = 4); the legend gives the number of months, the territories present and the mean monthly rate of each state." title="Fig4_states_en.png"/>
+            <wp:docPr id="1319567868" name="Fig2_priority_en.png" descr="Fig. 3. Territorial comparison of rates, 2019–2025." title="Fig2_priority_en.png"/>
             <wp:cNvGraphicFramePr>
               <a:graphicFrameLocks xmlns:a="http://schemas.openxmlformats.org/drawingml/2006/main" noChangeAspect="1"/>
             </wp:cNvGraphicFramePr>
@@ -5236,6 +4800,283 @@
                   <pic:spPr bwMode="auto">
                     <a:xfrm>
                       <a:off x="0" y="0"/>
+                      <a:ext cx="5400675" cy="4562475"/>
+                    </a:xfrm>
+                    <a:prstGeom prst="rect">
+                      <a:avLst/>
+                    </a:prstGeom>
+                  </pic:spPr>
+                </pic:pic>
+              </a:graphicData>
+            </a:graphic>
+          </wp:inline>
+        </w:drawing>
+      </w:r>
+    </w:p>
+    <w:p>
+      <w:pPr>
+        <w:spacing w:after="360"/>
+        <w:jc w:val="both"/>
+      </w:pPr>
+      <w:r>
+        <w:rPr>
+          <w:b/>
+          <w:bCs/>
+          <w:sz w:val="20"/>
+          <w:szCs w:val="20"/>
+        </w:rPr>
+        <w:t xml:space="preserve">Fig. </w:t>
+      </w:r>
+      <w:r>
+        <w:rPr>
+          <w:b/>
+          <w:bCs/>
+          <w:sz w:val="20"/>
+          <w:szCs w:val="20"/>
+        </w:rPr>
+        <w:t>3</w:t>
+      </w:r>
+      <w:r>
+        <w:rPr>
+          <w:b/>
+          <w:bCs/>
+          <w:sz w:val="20"/>
+          <w:szCs w:val="20"/>
+        </w:rPr>
+        <w:t>.</w:t>
+      </w:r>
+      <w:r>
+        <w:rPr>
+          <w:sz w:val="20"/>
+          <w:szCs w:val="20"/>
+        </w:rPr>
+        <w:t xml:space="preserve"> Territorial comparison of rates, 2019–2025. (a) Classification with false discovery rate control. (b) Rate ratios and 95% confidence intervals. Map lines delineate study areas and do not necessarily depict accepted national boundaries.</w:t>
+      </w:r>
+    </w:p>
+    <w:p>
+      <w:pPr>
+        <w:spacing w:line="480" w:lineRule="auto"/>
+        <w:ind w:firstLine="425"/>
+        <w:jc w:val="both"/>
+      </w:pPr>
+      <w:r>
+        <w:t>Fig. 4 breaks the classification down by year, which makes it possible to distinguish a persistent excess from one concentrated in a few years. Apurímac, Huánuco, Cusco and Junín remained between 1.19 and 1.79 in every year, and the excess of Cusco grew from 1.29 in 2021 to 1.67 in 2025. In Tacna, the excess declined steadily from 2.48 in 2019 to 1.01 in 2024 and rebounded slightly in 2025 (1.17), so its first place is driven mainly by the early years of the period. Ayacucho exceeded the rest until 2023 and fell below it in 2024 (0.94) and 2025 (0.73). Territories with lower rates remained so consistently; Cajamarca, for example, ranged from 0.40 to 0.54, whereas among the non-distinguishable territories Madre de Dios fluctuated between 0.45 and 1.65, which explains the width of its interval. These annual ratios are descriptive; the classification is based on the full period.</w:t>
+      </w:r>
+    </w:p>
+    <w:p>
+      <w:pPr>
+        <w:keepNext/>
+        <w:spacing w:before="240" w:after="120"/>
+        <w:jc w:val="center"/>
+      </w:pPr>
+      <w:r>
+        <w:rPr>
+          <w:noProof/>
+        </w:rPr>
+        <w:lastRenderedPageBreak/>
+        <w:drawing>
+          <wp:inline distT="0" distB="0" distL="0" distR="0" wp14:anchorId="0CFB26FB" wp14:editId="6BC2E8AD">
+            <wp:extent cx="5249413" cy="4693563"/>
+            <wp:effectExtent l="0" t="0" r="8890" b="0"/>
+            <wp:docPr id="1353048546" name="Imagen 3"/>
+            <wp:cNvGraphicFramePr>
+              <a:graphicFrameLocks xmlns:a="http://schemas.openxmlformats.org/drawingml/2006/main" noChangeAspect="1"/>
+            </wp:cNvGraphicFramePr>
+            <a:graphic xmlns:a="http://schemas.openxmlformats.org/drawingml/2006/main">
+              <a:graphicData uri="http://schemas.openxmlformats.org/drawingml/2006/picture">
+                <pic:pic xmlns:pic="http://schemas.openxmlformats.org/drawingml/2006/picture">
+                  <pic:nvPicPr>
+                    <pic:cNvPr id="0" name="Picture 3"/>
+                    <pic:cNvPicPr>
+                      <a:picLocks noChangeAspect="1" noChangeArrowheads="1"/>
+                    </pic:cNvPicPr>
+                  </pic:nvPicPr>
+                  <pic:blipFill>
+                    <a:blip r:embed="rId11" cstate="print">
+                      <a:extLst>
+                        <a:ext uri="{28A0092B-C50C-407E-A947-70E740481C1C}">
+                          <a14:useLocalDpi xmlns:a14="http://schemas.microsoft.com/office/drawing/2010/main" val="0"/>
+                        </a:ext>
+                      </a:extLst>
+                    </a:blip>
+                    <a:srcRect/>
+                    <a:stretch>
+                      <a:fillRect/>
+                    </a:stretch>
+                  </pic:blipFill>
+                  <pic:spPr bwMode="auto">
+                    <a:xfrm>
+                      <a:off x="0" y="0"/>
+                      <a:ext cx="5249413" cy="4693563"/>
+                    </a:xfrm>
+                    <a:prstGeom prst="rect">
+                      <a:avLst/>
+                    </a:prstGeom>
+                    <a:noFill/>
+                    <a:ln>
+                      <a:noFill/>
+                    </a:ln>
+                  </pic:spPr>
+                </pic:pic>
+              </a:graphicData>
+            </a:graphic>
+          </wp:inline>
+        </w:drawing>
+      </w:r>
+    </w:p>
+    <w:p>
+      <w:pPr>
+        <w:spacing w:after="360"/>
+        <w:jc w:val="both"/>
+      </w:pPr>
+      <w:r>
+        <w:rPr>
+          <w:b/>
+          <w:bCs/>
+          <w:sz w:val="20"/>
+          <w:szCs w:val="20"/>
+        </w:rPr>
+        <w:t xml:space="preserve">Fig. </w:t>
+      </w:r>
+      <w:r>
+        <w:rPr>
+          <w:b/>
+          <w:bCs/>
+          <w:sz w:val="20"/>
+          <w:szCs w:val="20"/>
+        </w:rPr>
+        <w:t>4</w:t>
+      </w:r>
+      <w:r>
+        <w:rPr>
+          <w:b/>
+          <w:bCs/>
+          <w:sz w:val="20"/>
+          <w:szCs w:val="20"/>
+        </w:rPr>
+        <w:t>.</w:t>
+      </w:r>
+      <w:r>
+        <w:rPr>
+          <w:sz w:val="20"/>
+          <w:szCs w:val="20"/>
+        </w:rPr>
+        <w:t xml:space="preserve"> Annual rate ratios relative to the rest of the country, 2019–2025.</w:t>
+      </w:r>
+    </w:p>
+    <w:p>
+      <w:pPr>
+        <w:pStyle w:val="Ttulo2"/>
+        <w:keepNext/>
+        <w:spacing w:before="240" w:after="60" w:line="480" w:lineRule="auto"/>
+      </w:pPr>
+      <w:r>
+        <w:t>5.2. Monthly profiles of the states</w:t>
+      </w:r>
+    </w:p>
+    <w:p>
+      <w:pPr>
+        <w:spacing w:line="480" w:lineRule="auto"/>
+        <w:ind w:firstLine="425"/>
+        <w:jc w:val="both"/>
+      </w:pPr>
+      <w:r>
+        <w:t xml:space="preserve">In the mixed space E2, the three diagnostics agreed on weak separation between clusters (Fig. </w:t>
+      </w:r>
+      <w:r>
+        <w:t>5</w:t>
+      </w:r>
+      <w:r>
+        <w:t xml:space="preserve">a–c). The gap statistic peaked at </w:t>
+      </w:r>
+      <w:r>
+        <w:rPr>
+          <w:i/>
+          <w:iCs/>
+        </w:rPr>
+        <w:t>K</w:t>
+      </w:r>
+      <w:r>
+        <w:t xml:space="preserve"> = 1 (1.851, compared with 1.380–1.432 for </w:t>
+      </w:r>
+      <w:r>
+        <w:rPr>
+          <w:i/>
+          <w:iCs/>
+        </w:rPr>
+        <w:t>K</w:t>
+      </w:r>
+      <w:r>
+        <w:t xml:space="preserve"> = 2–8), the silhouette remained between 0.28 and 0.29, and minimum stability stayed below 0.80 for all partitions. The fallback rule selected </w:t>
+      </w:r>
+      <w:r>
+        <w:rPr>
+          <w:i/>
+          <w:iCs/>
+        </w:rPr>
+        <w:t>K</w:t>
+      </w:r>
+      <w:r>
+        <w:t xml:space="preserve"> = 4, the partition with the highest minimum stability (0.63), which we use to summarize monthly profiles. Agreement with other algorithms was low: the ARI with respect to k-means was 0.31 for Ward and 0.23 for the Gaussian mixture, and HDBSCAN labeled 70% of the observations as noise.</w:t>
+      </w:r>
+    </w:p>
+    <w:p>
+      <w:pPr>
+        <w:spacing w:line="480" w:lineRule="auto"/>
+        <w:ind w:firstLine="425"/>
+        <w:jc w:val="both"/>
+      </w:pPr>
+      <w:r>
+        <w:t xml:space="preserve">The profile of the four states reveals that they combine two types of difference (Fig. </w:t>
+      </w:r>
+      <w:r>
+        <w:t>5</w:t>
+      </w:r>
+      <w:r>
+        <w:t xml:space="preserve">d). Two of them describe the dynamics of the month and appear in all 26 territories: state 0 gathers 163 months well below the usual level, with a mean seasonal anomaly of −1.40 residual </w:t>
+      </w:r>
+      <w:r>
+        <w:lastRenderedPageBreak/>
+        <w:t>standard deviations of the territory (SD = 0.64) and a mean monthly rate of 0.31 per 10,000 inhabitants (SD = 0.16), and state 3 gathers 294 months above the usual level, with an anomaly of +1.21 (SD = 0.55) and a rate of 0.78 (SD = 0.29). The other two group months with anomalies close to zero (−0.38 and −0.11) and differ mainly in the level of the territory: state 1 (500 months from 19 territories) corresponds to territories with a low prior level, with a standardized median of −1.00, and state 2 (439 months from 20 territories) to territories with a high level, with a median of 0.59. This composition explains why, as shown in Section 5.5, the states share information with territorial identity.</w:t>
+      </w:r>
+    </w:p>
+    <w:p>
+      <w:pPr>
+        <w:keepNext/>
+        <w:spacing w:before="240" w:after="120"/>
+        <w:jc w:val="center"/>
+      </w:pPr>
+      <w:r>
+        <w:rPr>
+          <w:noProof/>
+        </w:rPr>
+        <w:drawing>
+          <wp:inline distT="0" distB="0" distL="0" distR="0" wp14:anchorId="27F418A9" wp14:editId="5A62D51F">
+            <wp:extent cx="5400675" cy="3905250"/>
+            <wp:effectExtent l="0" t="0" r="0" b="0"/>
+            <wp:docPr id="1899929116" name="Fig4_states_en.png" descr="Fig. 5. Diagnostics and state profiles in E2." title="Fig4_states_en.png"/>
+            <wp:cNvGraphicFramePr>
+              <a:graphicFrameLocks xmlns:a="http://schemas.openxmlformats.org/drawingml/2006/main" noChangeAspect="1"/>
+            </wp:cNvGraphicFramePr>
+            <a:graphic xmlns:a="http://schemas.openxmlformats.org/drawingml/2006/main">
+              <a:graphicData uri="http://schemas.openxmlformats.org/drawingml/2006/picture">
+                <pic:pic xmlns:pic="http://schemas.openxmlformats.org/drawingml/2006/picture">
+                  <pic:nvPicPr>
+                    <pic:cNvPr id="0" name=""/>
+                    <pic:cNvPicPr>
+                      <a:picLocks noChangeAspect="1" noChangeArrowheads="1"/>
+                    </pic:cNvPicPr>
+                  </pic:nvPicPr>
+                  <pic:blipFill>
+                    <a:blip r:embed="rId12"/>
+                    <a:srcRect/>
+                    <a:stretch>
+                      <a:fillRect/>
+                    </a:stretch>
+                  </pic:blipFill>
+                  <pic:spPr bwMode="auto">
+                    <a:xfrm>
+                      <a:off x="0" y="0"/>
                       <a:ext cx="5400675" cy="3905250"/>
                     </a:xfrm>
                     <a:prstGeom prst="rect">
@@ -5261,142 +5102,8 @@
           <w:sz w:val="20"/>
           <w:szCs w:val="20"/>
         </w:rPr>
-        <w:t>Fig. 4.</w:t>
-      </w:r>
-      <w:r>
-        <w:rPr>
-          <w:sz w:val="20"/>
-          <w:szCs w:val="20"/>
-        </w:rPr>
-        <w:t xml:space="preserve"> Choice of the number of clusters and profile of the states in the mixed space (E2), 2019–2023 (n = 1,396 territory-months). (a) Gap statistic with its standard error; the diagnostic favors </w:t>
-      </w:r>
-      <w:r>
-        <w:rPr>
-          <w:i/>
-          <w:iCs/>
-          <w:sz w:val="20"/>
-          <w:szCs w:val="20"/>
-        </w:rPr>
-        <w:t>K</w:t>
-      </w:r>
-      <w:r>
-        <w:rPr>
-          <w:sz w:val="20"/>
-          <w:szCs w:val="20"/>
-        </w:rPr>
-        <w:t xml:space="preserve"> = 1 and does not support a separation into several clusters in the representation evaluated. (b) Mean stability (ARI) over 100 resamples by resampling scheme; the dashed line marks the 0.80 threshold and the vertical dotted line the </w:t>
-      </w:r>
-      <w:r>
-        <w:rPr>
-          <w:i/>
-          <w:iCs/>
-          <w:sz w:val="20"/>
-          <w:szCs w:val="20"/>
-        </w:rPr>
-        <w:t>K</w:t>
-      </w:r>
-      <w:r>
-        <w:rPr>
-          <w:sz w:val="20"/>
-          <w:szCs w:val="20"/>
-        </w:rPr>
-        <w:t xml:space="preserve"> chosen by the fallback rule. (c) Silhouette index; the dashed line marks the silhouette reference value adopted in the analysis (0.50). (d) Distribution of the three standardized features in each of the four states (</w:t>
-      </w:r>
-      <w:r>
-        <w:rPr>
-          <w:i/>
-          <w:iCs/>
-          <w:sz w:val="20"/>
-          <w:szCs w:val="20"/>
-        </w:rPr>
-        <w:t>K</w:t>
-      </w:r>
-      <w:r>
-        <w:rPr>
-          <w:sz w:val="20"/>
-          <w:szCs w:val="20"/>
-        </w:rPr>
-        <w:t xml:space="preserve"> = 4); the legend gives the number of months, the territories present and the mean monthly rate of each state.</w:t>
-      </w:r>
-    </w:p>
-    <w:p>
-      <w:pPr>
-        <w:pStyle w:val="Ttulo2"/>
-        <w:keepNext/>
-        <w:spacing w:before="240" w:after="60" w:line="480" w:lineRule="auto"/>
-      </w:pPr>
-      <w:r>
-        <w:t>5.3. Spatial structure</w:t>
-      </w:r>
-    </w:p>
-    <w:p>
-      <w:pPr>
-        <w:spacing w:line="480" w:lineRule="auto"/>
-        <w:ind w:firstLine="425"/>
-        <w:jc w:val="both"/>
-      </w:pPr>
-      <w:r>
-        <w:t xml:space="preserve">Evidence of global spatial autocorrelation in the rates depended on the neighborhood definition (Table 2). With the four nearest neighbors, Moran's I was 0.288 (p = 0.018) for 2019–2025 and 0.245 (p = 0.032) for the consolidated period 2019–2024, whereas under contiguity it was 0.122 and not significant (p = 0.244); the empirical Bayes adjustment did not change these values. These results support a positive association under nearest-neighbor proximity, but not a conclusion independent of the spatial matrix. Counts and the proportion of months in the highest-rate state showed no significant autocorrelation with either matrix, and when each territory was removed in turn (24 of the 26 exclusions are computable), Moran's I under </w:t>
-      </w:r>
-      <w:r>
-        <w:lastRenderedPageBreak/>
-        <w:t>contiguity ranged from 0.029 to 0.289 and was significant only when Huánuco was excluded, which shows its sensitivity to the territorial composition.</w:t>
-      </w:r>
-    </w:p>
-    <w:p>
-      <w:pPr>
-        <w:spacing w:line="480" w:lineRule="auto"/>
-        <w:ind w:firstLine="425"/>
-        <w:jc w:val="both"/>
-      </w:pPr>
-      <w:r>
-        <w:t>In the local Gi* analysis, cold spots were identified after Benjamini–Hochberg adjustment in Amazonas and Lambayeque under contiguity, and in Lambayeque and San Martín with four neighbors; under the more conservative Benjamini–</w:t>
-      </w:r>
-      <w:proofErr w:type="spellStart"/>
-      <w:r>
-        <w:t>Yekutieli</w:t>
-      </w:r>
-      <w:proofErr w:type="spellEnd"/>
-      <w:r>
-        <w:t xml:space="preserve"> adjustment, only Amazonas remained significant (q = 0.032). No territory was a hot spot after adjustment with either main matrix. Under contiguity, Apurímac, Cusco and Ayacucho had the highest positive Gi* values (</w:t>
-      </w:r>
-      <w:r>
-        <w:rPr>
-          <w:i/>
-          <w:iCs/>
-        </w:rPr>
-        <w:t>z</w:t>
-      </w:r>
-      <w:r>
-        <w:t xml:space="preserve"> between 2.13 and 2.43), but their two-sided p-values (0.057–0.064) were not significant even before adjustment. Metropolitan Lima showed no significant local concentration either (under contiguity, </w:t>
-      </w:r>
-      <w:r>
-        <w:rPr>
-          <w:i/>
-          <w:iCs/>
-        </w:rPr>
-        <w:t>z</w:t>
-      </w:r>
-      <w:r>
-        <w:t xml:space="preserve"> = 0.07 and p = 0.97).</w:t>
-      </w:r>
-    </w:p>
-    <w:p>
-      <w:pPr>
-        <w:spacing w:line="480" w:lineRule="auto"/>
-        <w:ind w:firstLine="425"/>
-        <w:jc w:val="both"/>
-      </w:pPr>
-      <w:r>
-        <w:t>The local classification differs from the comparison of each territory with the rest of the country. Lambayeque has a rate above that of the rest (Section 5.1) and, at the same time, a low-value surrounding that Gi* identifies as a cold spot, whereas the local Moran's I characterizes it as a high-value territory surrounded by low values; both readings describe different aspects of its spatial position.</w:t>
-      </w:r>
-    </w:p>
-    <w:p>
-      <w:pPr>
-        <w:keepNext/>
-        <w:spacing w:after="120"/>
-        <w:jc w:val="both"/>
-      </w:pPr>
+        <w:t xml:space="preserve">Fig. </w:t>
+      </w:r>
       <w:r>
         <w:rPr>
           <w:b/>
@@ -5404,14 +5111,133 @@
           <w:sz w:val="20"/>
           <w:szCs w:val="20"/>
         </w:rPr>
-        <w:t>Table 2.</w:t>
-      </w:r>
-      <w:r>
-        <w:rPr>
+        <w:t>5</w:t>
+      </w:r>
+      <w:r>
+        <w:rPr>
+          <w:b/>
+          <w:bCs/>
           <w:sz w:val="20"/>
           <w:szCs w:val="20"/>
         </w:rPr>
-        <w:t xml:space="preserve"> Spatial structure of missing-person reports. Panel A: global Moran's I (9,999 permutations; two-sided p-value). Panel B: territories significant after false discovery rate control (exact local p-values; 2019–2025 rate with observed exposure).</w:t>
+        <w:t>.</w:t>
+      </w:r>
+      <w:r>
+        <w:rPr>
+          <w:sz w:val="20"/>
+          <w:szCs w:val="20"/>
+        </w:rPr>
+        <w:t xml:space="preserve"> Diagnostics and state profiles in E2, 2019–2023 (n = 1,396 territory-months). (a) Gap statistic. (b) ARI stability. (c) Silhouette. (d) Standardized features.</w:t>
+      </w:r>
+    </w:p>
+    <w:p>
+      <w:pPr>
+        <w:pStyle w:val="Ttulo2"/>
+        <w:keepNext/>
+        <w:spacing w:before="240" w:after="60" w:line="480" w:lineRule="auto"/>
+      </w:pPr>
+      <w:r>
+        <w:t>5.3. Autocorrelation and local concentrations</w:t>
+      </w:r>
+    </w:p>
+    <w:p>
+      <w:pPr>
+        <w:spacing w:line="480" w:lineRule="auto"/>
+        <w:ind w:firstLine="425"/>
+        <w:jc w:val="both"/>
+      </w:pPr>
+      <w:r>
+        <w:t xml:space="preserve">Global spatial autocorrelation of the rates was positive, and its significance depended on the neighborhood definition (Table 2). With the four nearest neighbors, Moran's I was 0.288 (p = 0.018) for 2019–2025 and 0.245 (p = 0.032) for 2019–2024; under contiguity it was 0.122 (p </w:t>
+      </w:r>
+      <w:r>
+        <w:lastRenderedPageBreak/>
+        <w:t xml:space="preserve">= 0.244), against an expected value of −0.04 in the absence of autocorrelation, and the empirical Bayes adjustment reproduced these values. The positive association therefore holds under nearest-neighbor proximity. Counts and the proportion of months in the highest-rate state </w:t>
+      </w:r>
+      <w:proofErr w:type="gramStart"/>
+      <w:r>
+        <w:t>had I</w:t>
+      </w:r>
+      <w:proofErr w:type="gramEnd"/>
+      <w:r>
+        <w:t xml:space="preserve"> values between −0.10 and 0.01, not significant with either matrix. When each territory was removed in turn (24 computable exclusions), Moran's I under contiguity ranged from 0.029 to 0.289 and was significant only when Huánuco was excluded, which indicates sensitivity to the territorial composition.</w:t>
+      </w:r>
+    </w:p>
+    <w:p>
+      <w:pPr>
+        <w:spacing w:line="480" w:lineRule="auto"/>
+        <w:ind w:firstLine="425"/>
+        <w:jc w:val="both"/>
+      </w:pPr>
+      <w:r>
+        <w:t>In the local Gi* analysis, Benjamini–Hochberg adjustment identified cold spots in Amazonas and Lambayeque under contiguity, and in Lambayeque and San Martín with four neighbors; under the more conservative Benjamini–</w:t>
+      </w:r>
+      <w:proofErr w:type="spellStart"/>
+      <w:r>
+        <w:t>Yekutieli</w:t>
+      </w:r>
+      <w:proofErr w:type="spellEnd"/>
+      <w:r>
+        <w:t xml:space="preserve"> adjustment, Amazonas remained significant (q = 0.032). After adjustment, no territory was a hot spot with either main matrix. The highest positive Gi* values corresponded to Apurímac, Cusco and Ayacucho under contiguity (</w:t>
+      </w:r>
+      <w:r>
+        <w:rPr>
+          <w:i/>
+          <w:iCs/>
+        </w:rPr>
+        <w:t>z</w:t>
+      </w:r>
+      <w:r>
+        <w:t xml:space="preserve"> between 2.13 and 2.43; two-sided p between 0.057 and 0.064), and Metropolitan Lima had a value close to zero (</w:t>
+      </w:r>
+      <w:r>
+        <w:rPr>
+          <w:i/>
+          <w:iCs/>
+        </w:rPr>
+        <w:t>z</w:t>
+      </w:r>
+      <w:r>
+        <w:t xml:space="preserve"> = 0.07; p = 0.97).</w:t>
+      </w:r>
+    </w:p>
+    <w:p>
+      <w:pPr>
+        <w:spacing w:line="480" w:lineRule="auto"/>
+        <w:ind w:firstLine="425"/>
+        <w:jc w:val="both"/>
+      </w:pPr>
+      <w:r>
+        <w:t>The local classification differs from the comparison of each territory with the rest of the country. Lambayeque has a rate above that of the rest (Section 5.1) and, at the same time, a low-value surrounding that Gi* identifies as a cold spot, whereas the local Moran's I characterizes it as a high-value territory surrounded by low values; both readings describe different aspects of its spatial position.</w:t>
+      </w:r>
+    </w:p>
+    <w:p>
+      <w:pPr>
+        <w:keepNext/>
+        <w:spacing w:after="120"/>
+        <w:jc w:val="both"/>
+      </w:pPr>
+      <w:r>
+        <w:rPr>
+          <w:b/>
+          <w:bCs/>
+          <w:sz w:val="20"/>
+          <w:szCs w:val="20"/>
+        </w:rPr>
+        <w:t>Table 2.</w:t>
+      </w:r>
+      <w:r>
+        <w:rPr>
+          <w:sz w:val="20"/>
+          <w:szCs w:val="20"/>
+        </w:rPr>
+        <w:t xml:space="preserve"> </w:t>
+      </w:r>
+      <w:r>
+        <w:rPr>
+          <w:sz w:val="20"/>
+          <w:szCs w:val="20"/>
+        </w:rPr>
+        <w:t>Global and local spatial association.</w:t>
       </w:r>
     </w:p>
     <w:tbl>
@@ -5429,7 +5255,7 @@
           <w:left w:w="10" w:type="dxa"/>
           <w:right w:w="10" w:type="dxa"/>
         </w:tblCellMar>
-        <w:tblLook w:val="04A0" w:firstRow="1" w:lastRow="0" w:firstColumn="1" w:lastColumn="0" w:noHBand="0" w:noVBand="1"/>
+        <w:tblLook w:val="0000" w:firstRow="0" w:lastRow="0" w:firstColumn="0" w:lastColumn="0" w:noHBand="0" w:noVBand="0"/>
       </w:tblPr>
       <w:tblGrid>
         <w:gridCol w:w="3300"/>
@@ -6826,6 +6652,7 @@
                 <w:sz w:val="19"/>
                 <w:szCs w:val="19"/>
               </w:rPr>
+              <w:lastRenderedPageBreak/>
               <w:t>Lambayeque (contiguity)</w:t>
             </w:r>
           </w:p>
@@ -7260,39 +7087,7 @@
           <w:sz w:val="18"/>
           <w:szCs w:val="18"/>
         </w:rPr>
-        <w:t xml:space="preserve">I: global Moran's index (expected value without autocorrelation: −0.04). Gi* z: standardized value of the </w:t>
-      </w:r>
-      <w:proofErr w:type="spellStart"/>
-      <w:r>
-        <w:rPr>
-          <w:sz w:val="18"/>
-          <w:szCs w:val="18"/>
-        </w:rPr>
-        <w:t>Getis</w:t>
-      </w:r>
-      <w:proofErr w:type="spellEnd"/>
-      <w:r>
-        <w:rPr>
-          <w:sz w:val="18"/>
-          <w:szCs w:val="18"/>
-        </w:rPr>
-        <w:t>–Ord statistic; negative values indicate a concentration of low values (cold spot). q: p-value adjusted with the Benjamini–Hochberg procedure; under the Benjamini–</w:t>
-      </w:r>
-      <w:proofErr w:type="spellStart"/>
-      <w:r>
-        <w:rPr>
-          <w:sz w:val="18"/>
-          <w:szCs w:val="18"/>
-        </w:rPr>
-        <w:t>Yekutieli</w:t>
-      </w:r>
-      <w:proofErr w:type="spellEnd"/>
-      <w:r>
-        <w:rPr>
-          <w:sz w:val="18"/>
-          <w:szCs w:val="18"/>
-        </w:rPr>
-        <w:t xml:space="preserve"> adjustment, only Amazonas (contiguity) keeps q &lt; 0.05 (q = 0.032). LISA type: territory (high or low) relative to its neighbors (high or low). No territory was a hot spot after correction.</w:t>
+        <w:t>I: global Moran's I; Gi* z: standardized Getis–Ord statistic; q: Benjamini–Hochberg adjusted p-value. LISA: value of the territory relative to its neighbors.</w:t>
       </w:r>
     </w:p>
     <w:p>
@@ -7302,8 +7097,15 @@
         <w:spacing w:before="240" w:after="60" w:line="480" w:lineRule="auto"/>
       </w:pPr>
       <w:r>
-        <w:lastRenderedPageBreak/>
-        <w:t>5.4. Temporal dynamics</w:t>
+        <w:t xml:space="preserve">5.4. Changes in the </w:t>
+      </w:r>
+      <w:proofErr w:type="gramStart"/>
+      <w:r>
+        <w:t>states</w:t>
+      </w:r>
+      <w:proofErr w:type="gramEnd"/>
+      <w:r>
+        <w:t xml:space="preserve"> across years</w:t>
       </w:r>
     </w:p>
     <w:p>
@@ -7313,7 +7115,7 @@
         <w:jc w:val="both"/>
       </w:pPr>
       <w:r>
-        <w:t>In 2024, the partition transferred from the 2019–2023 fit had an ARI of 0.41 with respect to the partition refitted in that year; the proportion of observations in state 1 rose from 35.8% during training to 56.4%, and the Jensen–Shannon distance between the state distributions was 0.18. In 2025, with the model fitted up to 2024, the ARI was 0.52 and the distance 0.05, so the proportions moved closer to those of training, although differences between the transferred and refitted assignments persisted. These results describe partial temporal agreement and do not allow the states to be interpreted as categories that are invariant across periods.</w:t>
+        <w:t>In 2024, the partition transferred from the 2019–2023 fit had an ARI of 0.41 with respect to the partition refitted in that year; the proportion of observations in state 1 rose from 35.8% during training to 56.4%, and the Jensen–Shannon distance between the state distributions was 0.18. In 2025, with the model fitted up to 2024, the ARI was 0.52 and the distance 0.05, with proportions close to those of training. These results indicate partial temporal agreement, so the states vary across periods.</w:t>
       </w:r>
     </w:p>
     <w:p>
@@ -7323,7 +7125,7 @@
         <w:spacing w:before="240" w:after="60" w:line="480" w:lineRule="auto"/>
       </w:pPr>
       <w:r>
-        <w:t>5.5. Multilevel validation</w:t>
+        <w:t>5.5. Sensitivity of the findings</w:t>
       </w:r>
     </w:p>
     <w:p>
@@ -7340,7 +7142,7 @@
         <w:t>Association with territorial identity.</w:t>
       </w:r>
       <w:r>
-        <w:t xml:space="preserve"> The information shared between states and territories increased as the features incorporated territorial level (Table 3, panel A). In the relative space (E1), the NMI was 0.015 and did not exceed what chance would produce (p = 0.81); in the mixed space (E2) it rose to 0.138 (p = 0.001), with 24% of the clusters' entropy explained by territory, just below the 0.25 threshold; and in the level space (E3) it reached 0.252, with 45% of the entropy explained and three territories whose months almost always fell in the same cluster. Requiring 12 months of history instead of 6 preserved the same ordering among spaces (NMI of 0.026, 0.166 and 0.271), although with that requirement E2 exceeded the leakage threshold (fraction 0.29).</w:t>
+        <w:t xml:space="preserve"> The information shared between states and territories increased as the features incorporated territorial level (Table 3, panel A). In the relative space (E1), the NMI was 0.015, within what chance would produce (p = 0.81); in the mixed space (E2) it rose to 0.138 (p = 0.001), with 24% of the clusters' entropy explained by territory, just below the 0.25 threshold; and in the level space (E3) it reached 0.252, with 45% of the entropy explained and three territories whose months almost always fell in the same cluster. Requiring 12 months of history instead of 6 preserved the same ordering among spaces (NMI of 0.026, 0.166 and 0.271), and with that requirement E2 exceeded the leakage threshold (fraction 0.29).</w:t>
       </w:r>
     </w:p>
     <w:p>
@@ -7357,11 +7159,19 @@
         <w:t>Reproduction of the initial analysis.</w:t>
       </w:r>
       <w:r>
-        <w:t xml:space="preserve"> The framework reproduced the initial analysis: with register cells, nine features, robust scaling and the maximum-silhouette rule, it selected three clusters with a silhouette of 0.559 (0.550 in the initial report), and with its weights matrix it obtained a Moran's I of 0.330 and six hot spots (Arequipa, Ayacucho, Cusco, Moquegua, Puno and Tacna). That partition, however, shared a great deal of information with territory (NMI of 0.330; in 12 of the 26 territories, at least 95% of the cells fell in a single cluster), and with standard scaling the same specification selected two clusters, with each territory falling entirely </w:t>
+        <w:t xml:space="preserve"> The framework reproduced the initial analysis: with register cells, nine features, robust scaling and the maximum-silhouette rule, it selected three clusters with a silhouette of 0.559 (0.550 in the initial report), and with its weights matrix it obtained a Moran's I of 0.330 and six hot spots (Arequipa, Ayacucho, Cusco, Moquegua, Puno </w:t>
       </w:r>
       <w:r>
         <w:lastRenderedPageBreak/>
-        <w:t>in one of them. The three initial clusters thus described mainly differences in territorial size and identity.</w:t>
+        <w:t xml:space="preserve">and Tacna). That partition shared a great deal of information with territory (NMI of 0.330; in 12 of the 26 territories, at least 95% of the cells fell in a single cluster), and with standard scaling the same specification selected two clusters, with each territory falling entirely </w:t>
+      </w:r>
+      <w:proofErr w:type="gramStart"/>
+      <w:r>
+        <w:t>in</w:t>
+      </w:r>
+      <w:proofErr w:type="gramEnd"/>
+      <w:r>
+        <w:t xml:space="preserve"> one of them. The three initial clusters thus described mainly differences in territorial size and identity.</w:t>
       </w:r>
     </w:p>
     <w:p>
@@ -7378,7 +7188,13 @@
         <w:t>Multiverse.</w:t>
       </w:r>
       <w:r>
-        <w:t xml:space="preserve"> Across the 108 clustering specifications, row resampling indicated stability in 97% of cases, compared with only 31% when territories and blocks were resampled; the silhouette exceeded 0.50 in 34%, and 62% showed identity leakage according to the operational criterion of Section 4.6 (Table 3, panel B; Fig. 5a). Within the set evaluated, the feature space was the decision most associated with differences in NMI (η²</w:t>
+        <w:t xml:space="preserve"> Across the 108 clustering specifications, row resampling indicated stability in 97% of cases, compared with 31% when territories and blocks were resampled; the silhouette exceeded 0.50 in 34%, and 62% showed identity leakage according to the operational criterion of Section 4.6 (Table 3, panel B; Fig. </w:t>
+      </w:r>
+      <w:r>
+        <w:t>6</w:t>
+      </w:r>
+      <w:r>
+        <w:t>a). Within the set evaluated, the feature space was the decision most associated with differences in NMI (η²</w:t>
       </w:r>
       <w:r>
         <w:rPr>
@@ -7406,7 +7222,13 @@
         <w:jc w:val="both"/>
       </w:pPr>
       <w:r>
-        <w:t>In the 160 spatial rate specifications, Moran's I was significant in 72.5% (65% with two-sided p-values), never under contiguity and, with two-sided p-values, in 50–100% of the specifications with the other four matrices (Fig. 5b). The southern Andean hot spot appeared in all specifications with uncorrected one-sided p-values, but in none with two-sided p-values and FDR control. In the latter scenario, only the inverse-distance matrix of the initial analysis flagged hot spots (8 of 40 specifications: Apurímac, Madre de Dios and Puno), with local p-values obtained by random draws because that matrix assigns each territory between 6 and 18 neighbors. Metropolitan Lima was not a hot spot in any of the 240 spatial specifications.</w:t>
+        <w:t xml:space="preserve">In the 160 spatial rate specifications, Moran's I was significant in 72.5% (65% with two-sided p-values), never under contiguity and, with two-sided p-values, in 50–100% of the specifications with the other four matrices (Fig. </w:t>
+      </w:r>
+      <w:r>
+        <w:t>6</w:t>
+      </w:r>
+      <w:r>
+        <w:t>b). The southern Andean hot spot appeared in all specifications with uncorrected one-sided p-values, and in 0% with two-sided p-values and FDR control. In the latter scenario, only the inverse-distance matrix of the initial analysis flagged hot spots (8 of 40 specifications: Apurímac, Madre de Dios and Puno), with local p-values obtained by random draws because that matrix assigns each territory between 6 and 18 neighbors. Metropolitan Lima was not a hot spot in any of the 240 spatial specifications.</w:t>
       </w:r>
     </w:p>
     <w:p>
@@ -7416,7 +7238,61 @@
         <w:jc w:val="both"/>
       </w:pPr>
       <w:r>
-        <w:t>Fig. 5 summarizes both validations through specification curves. Each point represents a specification, ordered by the value of the metric, and the lower marks identify the options used; their concentration in one sector of the curve signals an association between the decision and the result, without isolating its effect on its own. In panel (a), 39 of the 41 specifications without identity leakage use relative (E1) or mixed (E2) features, and none uses only level features (E3) or the nine features of the initial analysis, whose specifications are among those with the highest NMI (0.26–0.33). In panel (b), contiguity occupies the eight lowest positions without any significant specification, whereas the five-neighbor matrix of the initial analysis sits at the top.</w:t>
+        <w:t xml:space="preserve">Fig. </w:t>
+      </w:r>
+      <w:r>
+        <w:t>6</w:t>
+      </w:r>
+      <w:r>
+        <w:t xml:space="preserve"> summarizes both validations through specification curves. Each point represents a specification, ordered by the value of the metric, and the lower marks identify the options used; their concentration in one sector of the curve signals an association between the decision and the result. In panel (a), 39 of the 41 specifications without identity leakage use relative (E1) or mixed (E2) features, and the remaining two use the mixed space with territory share; the specifications with the nine features of the initial analysis are among those with the highest NMI (0.26–0.33). In panel (b), contiguity occupies the eight lowest positions, whereas the five-</w:t>
+      </w:r>
+      <w:r>
+        <w:lastRenderedPageBreak/>
+        <w:t xml:space="preserve">neighbor matrix of the initial analysis sits at the top. The figure shows the most influential decisions; the others have a smaller effect (in panel a, the rule for choosing </w:t>
+      </w:r>
+      <w:r>
+        <w:rPr>
+          <w:i/>
+          <w:iCs/>
+        </w:rPr>
+        <w:t>K</w:t>
+      </w:r>
+      <w:r>
+        <w:t>, η²</w:t>
+      </w:r>
+      <w:r>
+        <w:rPr>
+          <w:vertAlign w:val="subscript"/>
+        </w:rPr>
+        <w:t>p</w:t>
+      </w:r>
+      <w:r>
+        <w:t xml:space="preserve"> = 0.10, and </w:t>
+      </w:r>
+      <w:proofErr w:type="spellStart"/>
+      <w:r>
+        <w:t>winsorization</w:t>
+      </w:r>
+      <w:proofErr w:type="spellEnd"/>
+      <w:r>
+        <w:t>, η²</w:t>
+      </w:r>
+      <w:r>
+        <w:rPr>
+          <w:vertAlign w:val="subscript"/>
+        </w:rPr>
+        <w:t>p</w:t>
+      </w:r>
+      <w:r>
+        <w:t xml:space="preserve"> &lt; 0.01; in panel b, exposure and </w:t>
+      </w:r>
+      <w:proofErr w:type="spellStart"/>
+      <w:r>
+        <w:t>winsorization</w:t>
+      </w:r>
+      <w:proofErr w:type="spellEnd"/>
+      <w:r>
+        <w:t>, which change the mean Moran's I by less than 0.01).</w:t>
       </w:r>
     </w:p>
     <w:p>
@@ -7432,7 +7308,6 @@
           <w:sz w:val="20"/>
           <w:szCs w:val="20"/>
         </w:rPr>
-        <w:lastRenderedPageBreak/>
         <w:t>Table 3.</w:t>
       </w:r>
       <w:r>
@@ -7440,23 +7315,7 @@
           <w:sz w:val="20"/>
           <w:szCs w:val="20"/>
         </w:rPr>
-        <w:t xml:space="preserve"> Multilevel validation. Panel A: information shared between states and territories by feature space (2019–2023, </w:t>
-      </w:r>
-      <w:r>
-        <w:rPr>
-          <w:i/>
-          <w:iCs/>
-          <w:sz w:val="20"/>
-          <w:szCs w:val="20"/>
-        </w:rPr>
-        <w:t>K</w:t>
-      </w:r>
-      <w:r>
-        <w:rPr>
-          <w:sz w:val="20"/>
-          <w:szCs w:val="20"/>
-        </w:rPr>
-        <w:t xml:space="preserve"> = 4; 999 within-year permutations). Panel B: proportion of multiverse specifications that support each claim.</w:t>
+        <w:t xml:space="preserve"> Territorial association and analytical sensitivity.</w:t>
       </w:r>
     </w:p>
     <w:tbl>
@@ -7474,7 +7333,7 @@
           <w:left w:w="10" w:type="dxa"/>
           <w:right w:w="10" w:type="dxa"/>
         </w:tblCellMar>
-        <w:tblLook w:val="04A0" w:firstRow="1" w:lastRow="0" w:firstColumn="1" w:lastColumn="0" w:noHBand="0" w:noVBand="1"/>
+        <w:tblLook w:val="0000" w:firstRow="0" w:lastRow="0" w:firstColumn="0" w:lastColumn="0" w:noHBand="0" w:noVBand="0"/>
       </w:tblPr>
       <w:tblGrid>
         <w:gridCol w:w="3900"/>
@@ -9324,7 +9183,7 @@
           <w:sz w:val="18"/>
           <w:szCs w:val="18"/>
         </w:rPr>
-        <w:t>NMI: normalized mutual information between cluster and territory. Entropy fraction: share of the uncertainty about the cluster that is removed by knowing the territory. Southern Andean hot spot: at least one of the five territories of the corridor described in the initial report (Arequipa, Ayacucho, Cusco, Moquegua and Tacna), as defined in the plan; Puno, the sixth hot spot in the reproduction, is reported separately. With two-sided p-values and FDR, 8 of the 40 specifications flagged other hot spots (Apurímac, Madre de Dios and Puno), all with the inverse-distance matrix of the initial analysis. Percentages are the proportion of specifications evaluated that meet each criterion; they are not probabilities that a claim is true and do not come from independent replications, because the specifications share data and analytical decisions.</w:t>
+        <w:t>NMI: normalized mutual information. Entropy fraction: uncertainty about the state removed by knowing the territory. Percentages computed over the specifications indicated.</w:t>
       </w:r>
     </w:p>
     <w:p>
@@ -9339,10 +9198,10 @@
         </w:rPr>
         <w:lastRenderedPageBreak/>
         <w:drawing>
-          <wp:inline distT="0" distB="0" distL="0" distR="0" wp14:anchorId="048FCAB7" wp14:editId="1B6093A4">
+          <wp:inline distT="0" distB="0" distL="0" distR="0" wp14:anchorId="1C96FC47" wp14:editId="6758E67D">
             <wp:extent cx="5400675" cy="5838825"/>
             <wp:effectExtent l="0" t="0" r="0" b="0"/>
-            <wp:docPr id="1981425617" name="Fig5_validation_en.png" descr="Fig. 5. Multilevel validation through specification curves. (a) Normalized mutual information (NMI) between cluster and territory in the 108 clustering specifications; orange marks specifications with territorial identity leakage (p &lt; 0.05 and entropy fraction ≥ 0.25). (b) Global Moran's I of the rates in 40 combinations of data and weights matrix (two-sided p-values); orange marks those significant at 5%. In both panels, the circle marks the specification of the initial analysis and the lower rows indicate the decisions that define each specification. Only the most influential decisions are shown, because the omitted ones have little influence: in (a), the rule for choosing K (η²p = 0.10) and winsorization (η²p &lt; 0.01); in (b), the exposure definition and winsorization, which change the mean Moran's I by less than 0.01." title="Fig5_validation_en.png"/>
+            <wp:docPr id="1646545319" name="Fig5_validation_en.png" descr="Fig. 6. Specification curves." title="Fig5_validation_en.png"/>
             <wp:cNvGraphicFramePr>
               <a:graphicFrameLocks xmlns:a="http://schemas.openxmlformats.org/drawingml/2006/main" noChangeAspect="1"/>
             </wp:cNvGraphicFramePr>
@@ -9356,7 +9215,7 @@
                     </pic:cNvPicPr>
                   </pic:nvPicPr>
                   <pic:blipFill>
-                    <a:blip r:embed="rId11"/>
+                    <a:blip r:embed="rId13"/>
                     <a:srcRect/>
                     <a:stretch>
                       <a:fillRect/>
@@ -9390,108 +9249,32 @@
           <w:sz w:val="20"/>
           <w:szCs w:val="20"/>
         </w:rPr>
-        <w:t>Fig. 5.</w:t>
-      </w:r>
-      <w:r>
-        <w:rPr>
+        <w:t xml:space="preserve">Fig. </w:t>
+      </w:r>
+      <w:r>
+        <w:rPr>
+          <w:b/>
+          <w:bCs/>
           <w:sz w:val="20"/>
           <w:szCs w:val="20"/>
         </w:rPr>
-        <w:t xml:space="preserve"> Multilevel validation through specification curves. (a) Normalized mutual information (NMI) between cluster and territory in the 108 clustering specifications; orange marks specifications with territorial identity leakage (p &lt; 0.05 and entropy fraction ≥ 0.25). (b) Global Moran's I of the rates in 40 combinations of data and weights matrix (two-sided p-values); orange marks those significant at 5%. In both panels, the circle marks the specification of the initial </w:t>
-      </w:r>
-      <w:proofErr w:type="gramStart"/>
-      <w:r>
-        <w:rPr>
+        <w:t>6</w:t>
+      </w:r>
+      <w:r>
+        <w:rPr>
+          <w:b/>
+          <w:bCs/>
           <w:sz w:val="20"/>
           <w:szCs w:val="20"/>
         </w:rPr>
-        <w:t>analysis</w:t>
-      </w:r>
-      <w:proofErr w:type="gramEnd"/>
+        <w:t>.</w:t>
+      </w:r>
       <w:r>
         <w:rPr>
           <w:sz w:val="20"/>
           <w:szCs w:val="20"/>
         </w:rPr>
-        <w:t xml:space="preserve"> and the lower rows indicate the decisions that define each specification. Only the most influential decisions are shown, because the omitted ones have little influence: in (a), the rule for choosing </w:t>
-      </w:r>
-      <w:r>
-        <w:rPr>
-          <w:i/>
-          <w:iCs/>
-          <w:sz w:val="20"/>
-          <w:szCs w:val="20"/>
-        </w:rPr>
-        <w:t>K</w:t>
-      </w:r>
-      <w:r>
-        <w:rPr>
-          <w:sz w:val="20"/>
-          <w:szCs w:val="20"/>
-        </w:rPr>
-        <w:t xml:space="preserve"> (η²</w:t>
-      </w:r>
-      <w:r>
-        <w:rPr>
-          <w:sz w:val="20"/>
-          <w:szCs w:val="20"/>
-          <w:vertAlign w:val="subscript"/>
-        </w:rPr>
-        <w:t>p</w:t>
-      </w:r>
-      <w:r>
-        <w:rPr>
-          <w:sz w:val="20"/>
-          <w:szCs w:val="20"/>
-        </w:rPr>
-        <w:t xml:space="preserve"> = 0.10) and </w:t>
-      </w:r>
-      <w:proofErr w:type="spellStart"/>
-      <w:r>
-        <w:rPr>
-          <w:sz w:val="20"/>
-          <w:szCs w:val="20"/>
-        </w:rPr>
-        <w:t>winsorization</w:t>
-      </w:r>
-      <w:proofErr w:type="spellEnd"/>
-      <w:r>
-        <w:rPr>
-          <w:sz w:val="20"/>
-          <w:szCs w:val="20"/>
-        </w:rPr>
-        <w:t xml:space="preserve"> (η²</w:t>
-      </w:r>
-      <w:r>
-        <w:rPr>
-          <w:sz w:val="20"/>
-          <w:szCs w:val="20"/>
-          <w:vertAlign w:val="subscript"/>
-        </w:rPr>
-        <w:t>p</w:t>
-      </w:r>
-      <w:r>
-        <w:rPr>
-          <w:sz w:val="20"/>
-          <w:szCs w:val="20"/>
-        </w:rPr>
-        <w:t xml:space="preserve"> &lt; 0.01); in (b), the exposure definition and </w:t>
-      </w:r>
-      <w:proofErr w:type="spellStart"/>
-      <w:r>
-        <w:rPr>
-          <w:sz w:val="20"/>
-          <w:szCs w:val="20"/>
-        </w:rPr>
-        <w:t>winsorization</w:t>
-      </w:r>
-      <w:proofErr w:type="spellEnd"/>
-      <w:r>
-        <w:rPr>
-          <w:sz w:val="20"/>
-          <w:szCs w:val="20"/>
-        </w:rPr>
-        <w:t>, which change the mean Moran's I by less than 0.01.</w:t>
+        <w:t xml:space="preserve"> Specification curves. (a) Territorial association. (b) Global spatial autocorrelation.</w:t>
       </w:r>
     </w:p>
     <w:p>
@@ -9511,7 +9294,7 @@
         <w:spacing w:before="240" w:after="60" w:line="480" w:lineRule="auto"/>
       </w:pPr>
       <w:r>
-        <w:t>6.1. Territorial differences in report rates and implications for search</w:t>
+        <w:t>6.1. Implications for search and prevention</w:t>
       </w:r>
     </w:p>
     <w:p>
@@ -9521,19 +9304,29 @@
         <w:jc w:val="both"/>
       </w:pPr>
       <w:r>
-        <w:t xml:space="preserve">The result with the broadest policy relevance is the classification in Fig. 2. Ten territories have report rates above the rest of the country after FDR control, and five of them (Tacna, </w:t>
+        <w:t xml:space="preserve">The result with the broadest policy relevance is the classification in Fig. </w:t>
+      </w:r>
+      <w:r>
+        <w:t>3</w:t>
+      </w:r>
+      <w:r>
+        <w:t xml:space="preserve">. Ten territories have report rates above the rest of the country after FDR control, and five of them (Tacna, Apurímac, Huánuco, Cusco and Junín) exceed it by 43% to 64% over the full period, with an annual rate above that of the rest in each of the seven years. The agreement of this classification across the two sensitivity analyses supports its consistency under the variations in period and </w:t>
       </w:r>
       <w:r>
         <w:lastRenderedPageBreak/>
-        <w:t xml:space="preserve">Apurímac, Huánuco, Cusco and Junín) exceed it by 43% to 64% over the full period, with an annual rate above that of the rest in each of the seven years. The agreement of this classification across the two sensitivity analyses supports its consistency under the variations in period and exposure examined. These results can provide a complementary criterion for assessing needs for search, prevention and review of the register, provided they are interpreted together with the volume of reports, the status of cases and institutional response capacity; on their own, they do not establish a resource-allocation rule. Fig. 3 adds a useful nuance for planning: the excess of Apurímac, Huánuco, Cusco and Junín is stable, that of Cusco is increasing, and that of Tacna declined until it matched the rest of the country in 2024 (1.01) and rebounded only slightly in 2025. The classification should therefore be updated every year rather than setting priorities only from the </w:t>
-      </w:r>
-      <w:proofErr w:type="gramStart"/>
-      <w:r>
-        <w:t>period average</w:t>
-      </w:r>
-      <w:proofErr w:type="gramEnd"/>
-      <w:r>
-        <w:t>.</w:t>
+        <w:t xml:space="preserve">exposure examined. These results provide one quantitative criterion for assessing needs for search, prevention and review of the register; allocating resources requires combining it with the volume of reports, the status of cases and institutional response capacity. Fig. 4 adds a useful nuance for planning: </w:t>
+      </w:r>
+      <w:r>
+        <w:t>Apurimac, Huánuco, Cusco and Junín maintained rates higher than those of the rest of the country during the seven years</w:t>
+      </w:r>
+      <w:r>
+        <w:t xml:space="preserve">, that of Cusco is increasing, and that of Tacna declined </w:t>
+      </w:r>
+      <w:r>
+        <w:t xml:space="preserve">until approaching the rate of the rest of the country in 2024 (RR = 1.01) </w:t>
+      </w:r>
+      <w:r>
+        <w:t>and rebounded only slightly in 2025. The classification should therefore be updated every year rather than being based only on the period average.</w:t>
       </w:r>
     </w:p>
     <w:p>
@@ -9553,7 +9346,7 @@
         <w:jc w:val="both"/>
       </w:pPr>
       <w:r>
-        <w:t>The low rates in the north, in turn, should be interpreted with caution, because a low report rate may reflect fewer disappearances but also poorer access to police stations, a lower willingness to report or differences in recording. The available data cannot discriminate among these explanations, so we do not attribute causes to the observed patterns. The same caution applies to high rates, which indicate where more reports are filed per inhabitant, but not why.</w:t>
+        <w:t>The low rates in the north admit several explanations: fewer disappearances, poorer access to police stations, a lower willingness to report or differences in recording. The available data describe the pattern, and attributing causes requires additional information; the same applies to high rates, which indicate where more reports are filed per inhabitant.</w:t>
       </w:r>
     </w:p>
     <w:p>
@@ -9563,7 +9356,7 @@
         <w:spacing w:before="240" w:after="60" w:line="480" w:lineRule="auto"/>
       </w:pPr>
       <w:r>
-        <w:t>6.2. Spatial pattern and states of the phenomenon</w:t>
+        <w:t>6.2. Interpreting the spatial pattern and the states</w:t>
       </w:r>
     </w:p>
     <w:p>
@@ -9573,19 +9366,11 @@
         <w:jc w:val="both"/>
       </w:pPr>
       <w:r>
-        <w:t xml:space="preserve">The observed distribution shows high-rate territories in the center and south of the </w:t>
-      </w:r>
-      <w:proofErr w:type="gramStart"/>
-      <w:r>
-        <w:t>country, but</w:t>
-      </w:r>
-      <w:proofErr w:type="gramEnd"/>
-      <w:r>
-        <w:t xml:space="preserve"> interpreting it as spatial concentration requires distinguishing geographic description from </w:t>
+        <w:t xml:space="preserve">High-rate territories are concentrated in the center and south of the country, and the inferential evidence specifies the scope of this concentration: global autocorrelation is significant with the four nearest neighbors, and multiple-comparison adjustment retained no hot spots with the main matrices. The results are consistent with a regional concentration of high rates, detectable under nearest-neighbor weights, and do not confirm a hot-spot corridor under the main specifications. The smallest attainable p-value limits local significance only for Callao </w:t>
       </w:r>
       <w:r>
         <w:lastRenderedPageBreak/>
-        <w:t>inferential evidence. Global autocorrelation was significant with the four nearest neighbors but not under contiguity, and no hot spot survived multiple-comparison adjustment with the main matrices, so the results do not confirm a hot-spot corridor under these specifications. Nor do they allow this absence to be attributed solely to insufficient power, since we did not assess power, although the smallest attainable p-value limits the resolution of the test in territories with few neighbors. In the north, cold spots were detected with Benjamini–Hochberg adjustment, but their location depended on the matrix and only Amazonas remained significant under Benjamini–</w:t>
+        <w:t>and Tumbes under contiguity; for the southern territories with the highest Gi* values that minimum was below 0.001, and the power of the test was not formally assessed. In the north, the cold spots identified with Benjamini–Hochberg varied with the matrix, and Amazonas remained significant under Benjamini–</w:t>
       </w:r>
       <w:proofErr w:type="spellStart"/>
       <w:r>
@@ -9593,15 +9378,7 @@
       </w:r>
       <w:proofErr w:type="spellEnd"/>
       <w:r>
-        <w:t xml:space="preserve">, so local evidence should be read </w:t>
-      </w:r>
-      <w:proofErr w:type="gramStart"/>
-      <w:r>
-        <w:t>in light of</w:t>
-      </w:r>
-      <w:proofErr w:type="gramEnd"/>
-      <w:r>
-        <w:t xml:space="preserve"> the neighborhood and adjustment used.</w:t>
+        <w:t>.</w:t>
       </w:r>
     </w:p>
     <w:p>
@@ -9611,7 +9388,7 @@
         <w:jc w:val="both"/>
       </w:pPr>
       <w:r>
-        <w:t>The four states serve a descriptive purpose: they summarize combinations of seasonal anomaly, change from prior level and usual level, and they distinguish relatively low or high months from situations linked to persistent differences between territories. The limited separation and the sensitivity of the partitions, however, suggest interpreting their boundaries as analytical approximations rather than divisions inherent to the phenomenon. Rate classification and clustering also answer different questions: the former compares the recorded frequency over a period, and the latter summarizes multivariate monthly profiles, so the consistency of the former in two sensitivity analyses does not, on its own, demonstrate a general superiority over the latter.</w:t>
+        <w:t>The four states serve a descriptive purpose: they summarize combinations of seasonal anomaly, change from prior level and usual level, and they distinguish relatively low or high months from situations linked to persistent differences between territories. Given the weak separation of the partitions, their boundaries are interpreted as analytical approximations. Rate classification and clustering also answer different questions and complement each other: the former compares the recorded frequency over the full period, with a classification that was identical in two sensitivity analyses, and the latter describes monthly dynamics.</w:t>
       </w:r>
     </w:p>
     <w:p>
@@ -9621,7 +9398,7 @@
         <w:spacing w:before="240" w:after="60" w:line="480" w:lineRule="auto"/>
       </w:pPr>
       <w:r>
-        <w:t>6.3. What multilevel validation contributes</w:t>
+        <w:t>6.3. Lessons for the analysis of administrative registers</w:t>
       </w:r>
     </w:p>
     <w:p>
@@ -9639,11 +9416,15 @@
       </w:r>
       <w:proofErr w:type="gramEnd"/>
       <w:r>
-        <w:t xml:space="preserve"> of unit of analysis, features and resampling, and their association with territorial identity indicated that part of that organization was linked to persistent differences between territories. This result does not by itself demonstrate information leakage, but it limits the interpretation of the clusters as shared temporal states. Likewise, the identification of the </w:t>
-      </w:r>
-      <w:r>
-        <w:lastRenderedPageBreak/>
-        <w:t xml:space="preserve">southern Andean corridor changed when the sidedness of the test and the multiple-comparison adjustment were modified. Together, these results show the need to assess which conclusions </w:t>
+        <w:t xml:space="preserve"> of unit of analysis, features and resampling, and their association with territorial identity indicated that part of that organization was linked to persistent differences between territories. This result </w:t>
+      </w:r>
+      <w:proofErr w:type="gramStart"/>
+      <w:r>
+        <w:t>points</w:t>
+      </w:r>
+      <w:proofErr w:type="gramEnd"/>
+      <w:r>
+        <w:t xml:space="preserve"> the interpretation of the initial clusters toward persistent territorial differences rather than shared temporal states. Likewise, the identification of the southern Andean corridor changed when the sidedness of the test and the multiple-comparison adjustment were modified. Together, these results show the need to assess which conclusions </w:t>
       </w:r>
       <w:proofErr w:type="gramStart"/>
       <w:r>
@@ -9661,7 +9442,11 @@
         <w:jc w:val="both"/>
       </w:pPr>
       <w:r>
-        <w:t>Building on this experience, we recommend five checks for similar analyses: compare rates rather than counts, always with their uncertainty; evaluate the gap statistic starting from a single cluster; measure stability by resampling territories and time blocks; compute exact local p-values and report the minimum attainable p-value of each territory; and control the FDR with more than one weights matrix.</w:t>
+        <w:t>Building on this experience, we recommend five checks for similar analyses: compare rates rather than counts, always with their uncertainty; evaluate the gap statistic starting from a single cluster; measure stability by resampling territories and time blocks; compute exact local p-</w:t>
+      </w:r>
+      <w:r>
+        <w:lastRenderedPageBreak/>
+        <w:t>values and report the minimum attainable p-value of each territory; and control the FDR with more than one weights matrix.</w:t>
       </w:r>
     </w:p>
     <w:p>
@@ -9681,15 +9466,15 @@
         <w:jc w:val="both"/>
       </w:pPr>
       <w:r>
-        <w:t xml:space="preserve">The study is conditioned by the nature of the administrative register. The aggregated reports identify neither unique persons nor the outcome of cases, so rates describe the recorded frequency and not the individual probability of disappearance, and territorial differences may reflect both the phenomenon and access to reporting and recording procedures. Population projections and the 2025 records are preliminary, and the treatment of the eight territory-months without information adjusts the exposure but does not recover any reports that may be missing. Aggregation into 26 territories also prevents transferring the results to specific localities or </w:t>
+        <w:t xml:space="preserve">The study relies on an aggregated administrative register. Because the register identifies neither unique persons nor the outcome of cases, rates describe the recorded frequency at the territorial level, and differences between territories combine the occurrence of the phenomenon with access to reporting and recording procedures. Population projections and the 2025 records are preliminary, and observed exposure corrects the denominator of the eight territory-months without information, whose reports remain absent. Aggregation into 26 territories also places the results </w:t>
       </w:r>
       <w:proofErr w:type="gramStart"/>
       <w:r>
-        <w:t>persons</w:t>
+        <w:t>at</w:t>
       </w:r>
       <w:proofErr w:type="gramEnd"/>
       <w:r>
-        <w:t>.</w:t>
+        <w:t xml:space="preserve"> the departmental scale.</w:t>
       </w:r>
     </w:p>
     <w:p>
@@ -9699,11 +9484,7 @@
         <w:jc w:val="both"/>
       </w:pPr>
       <w:r>
-        <w:t xml:space="preserve">Methodologically, the spatial findings depend on the neighborhood definition and on the multiple-comparison adjustment, and the geographic layer comes from a third party, so its correspondence with official cartography should be checked before assuming that contiguity does not change. The intervals of the rate ratios rely on fixed-length blocks over seven years, may be affected by changes in level or trend, and do not incorporate the uncertainty of under-reporting or of the projections. The states depend on the representation of the features, and their association with territorial identity, assessed with a specific annual permutation scheme, does not by itself separate persistent differences in the register from effects of that representation; </w:t>
-      </w:r>
-      <w:r>
-        <w:lastRenderedPageBreak/>
-        <w:t>the temporal evaluation, limited to two years and without a true reference classification, does not measure predictive accuracy.</w:t>
+        <w:t>Methodologically, the spatial findings depend on the neighborhood definition and on the multiple-comparison adjustment, and the geographic layer, distributed by a third party, requires comparison with official cartography. The intervals of the rate ratios rely on fixed-length blocks over seven years and reflect the temporal variability of the register, without incorporating under-reporting or the uncertainty of the projections. The states depend on the representation of the features, and the association with territorial identity was assessed with a specific annual permutation scheme; the temporal evaluation, limited to two years, measures agreement between partitions.</w:t>
       </w:r>
     </w:p>
     <w:p>
@@ -9713,15 +9494,7 @@
         <w:jc w:val="both"/>
       </w:pPr>
       <w:r>
-        <w:t xml:space="preserve">Finally, the framework was evaluated on a single </w:t>
-      </w:r>
-      <w:proofErr w:type="gramStart"/>
-      <w:r>
-        <w:t>register and</w:t>
-      </w:r>
-      <w:proofErr w:type="gramEnd"/>
-      <w:r>
-        <w:t xml:space="preserve"> without synthetic data of known structure, and the multiverse covers a finite set of decisions with a reduced computational budget. The territorial rate comparison was added to the plan after intermediate results were reviewed, as documented in its history, which gives that component an exploratory character. Applying the procedure in other contexts will require checking coverage, units of analysis and the assumptions of each method anew.</w:t>
+        <w:t>Finally, the framework was evaluated on a single register, without synthetic data of known structure, and the multiverse covers a finite set of decisions with a reduced computational budget. The territorial rate comparison was added to the plan after intermediate results were reviewed, as documented in its history, so that component has an exploratory character. Its application in other contexts requires checking coverage, units of analysis and the assumptions of each method.</w:t>
       </w:r>
     </w:p>
     <w:p>
@@ -9731,6 +9504,7 @@
         <w:spacing w:before="240" w:after="60" w:line="480" w:lineRule="auto"/>
       </w:pPr>
       <w:r>
+        <w:lastRenderedPageBreak/>
         <w:t>6.5. Future work</w:t>
       </w:r>
     </w:p>
@@ -9771,12 +9545,11 @@
         <w:jc w:val="both"/>
       </w:pPr>
       <w:r>
-        <w:lastRenderedPageBreak/>
-        <w:t xml:space="preserve">Spatial evidence depended on the neighborhood definition: global autocorrelation was significant with the four nearest neighbors but not under contiguity, and with the main matrices cold spots were identified after Benjamini–Hochberg adjustment, but no hot spots. In the clustering component, the diagnostics did not support clearly separated and stable clusters in the representation evaluated; the four selected states summarize monthly profiles, although their interpretation must </w:t>
+        <w:t xml:space="preserve">Spatial evidence depended on the neighborhood definition: global autocorrelation was significant with the four nearest neighbors and, after Benjamini–Hochberg adjustment, the main matrices identified cold spots in the north and no hot spots. In the clustering component, the diagnostics showed weak separation between clusters, and the four selected states summarize monthly profiles whose interpretation </w:t>
       </w:r>
       <w:proofErr w:type="gramStart"/>
       <w:r>
-        <w:t>take into account</w:t>
+        <w:t>takes into account</w:t>
       </w:r>
       <w:proofErr w:type="gramEnd"/>
       <w:r>
@@ -9790,7 +9563,11 @@
         <w:jc w:val="both"/>
       </w:pPr>
       <w:r>
-        <w:t xml:space="preserve">The contribution of the framework lies in articulating these perspectives and pairing them with checks that delimit the interpretation of the results. The findings can provide complementary information for assessing institutional needs, together with the status of cases and the available response capacity, but on their own they establish neither a resource-allocation rule nor an estimate of individual risk. The code, the analysis plan and the results are published to facilitate their verification; their extension to other registers </w:t>
+        <w:t xml:space="preserve">The contribution of the framework lies in articulating these perspectives and pairing them with checks that delimit the interpretation of the results. The findings provide quantitative </w:t>
+      </w:r>
+      <w:r>
+        <w:lastRenderedPageBreak/>
+        <w:t xml:space="preserve">information for assessing institutional needs, in combination with the status of cases and the available response capacity. The code, the analysis plan and the results are published to facilitate their verification; their extension to other registers </w:t>
       </w:r>
       <w:proofErr w:type="gramStart"/>
       <w:r>
@@ -9808,59 +9585,6 @@
         <w:spacing w:before="360" w:after="120" w:line="480" w:lineRule="auto"/>
       </w:pPr>
       <w:r>
-        <w:t>Data availability</w:t>
-      </w:r>
-    </w:p>
-    <w:p>
-      <w:pPr>
-        <w:spacing w:line="480" w:lineRule="auto"/>
-        <w:ind w:firstLine="425"/>
-        <w:jc w:val="both"/>
-      </w:pPr>
-      <w:r>
-        <w:t xml:space="preserve">The report data come from Peru's National Open Data Platform [4], the population denominators from the INEI projections [36] and the geographic layer from the </w:t>
-      </w:r>
-      <w:proofErr w:type="spellStart"/>
-      <w:r>
-        <w:t>peru-geojson</w:t>
-      </w:r>
-      <w:proofErr w:type="spellEnd"/>
-      <w:r>
-        <w:t xml:space="preserve"> repository [38]; the three files are identified by their SHA-256 hashes. These files, the code, the analysis plan, the automated tests, the Google </w:t>
-      </w:r>
-      <w:proofErr w:type="spellStart"/>
-      <w:r>
-        <w:t>Colab</w:t>
-      </w:r>
-      <w:proofErr w:type="spellEnd"/>
-      <w:r>
-        <w:t xml:space="preserve"> notebook and the </w:t>
-      </w:r>
-      <w:proofErr w:type="gramStart"/>
-      <w:r>
-        <w:t>derived results</w:t>
-      </w:r>
-      <w:proofErr w:type="gramEnd"/>
-      <w:r>
-        <w:t xml:space="preserve"> of version 3.3.2 are available on GitHub and archived in </w:t>
-      </w:r>
-      <w:proofErr w:type="spellStart"/>
-      <w:r>
-        <w:t>Zenodo</w:t>
-      </w:r>
-      <w:proofErr w:type="spellEnd"/>
-      <w:r>
-        <w:t xml:space="preserve"> [49].</w:t>
-      </w:r>
-    </w:p>
-    <w:p>
-      <w:pPr>
-        <w:pStyle w:val="Ttulo1"/>
-        <w:keepNext/>
-        <w:spacing w:before="360" w:after="120" w:line="480" w:lineRule="auto"/>
-      </w:pPr>
-      <w:r>
-        <w:lastRenderedPageBreak/>
         <w:t>References</w:t>
       </w:r>
     </w:p>
@@ -10143,6 +9867,7 @@
         <w:ind w:left="567" w:hanging="567"/>
       </w:pPr>
       <w:r>
+        <w:lastRenderedPageBreak/>
         <w:t>[6]</w:t>
       </w:r>
       <w:r>
@@ -10207,7 +9932,6 @@
         <w:ind w:left="567" w:hanging="567"/>
       </w:pPr>
       <w:r>
-        <w:lastRenderedPageBreak/>
         <w:t>[8]</w:t>
       </w:r>
       <w:r>
@@ -10395,6 +10119,7 @@
         <w:ind w:left="567" w:hanging="567"/>
       </w:pPr>
       <w:r>
+        <w:lastRenderedPageBreak/>
         <w:t>[15]</w:t>
       </w:r>
       <w:r>
@@ -10430,7 +10155,6 @@
         <w:ind w:left="567" w:hanging="567"/>
       </w:pPr>
       <w:r>
-        <w:lastRenderedPageBreak/>
         <w:t>[16]</w:t>
       </w:r>
       <w:r>
@@ -10599,6 +10323,7 @@
         <w:ind w:left="567" w:hanging="567"/>
       </w:pPr>
       <w:r>
+        <w:lastRenderedPageBreak/>
         <w:t>[23]</w:t>
       </w:r>
       <w:r>
@@ -10631,7 +10356,6 @@
         <w:ind w:left="567" w:hanging="567"/>
       </w:pPr>
       <w:r>
-        <w:lastRenderedPageBreak/>
         <w:t>[24]</w:t>
       </w:r>
       <w:r>
@@ -10880,6 +10604,7 @@
         <w:ind w:left="567" w:hanging="567"/>
       </w:pPr>
       <w:r>
+        <w:lastRenderedPageBreak/>
         <w:t>[33]</w:t>
       </w:r>
       <w:r>
@@ -10896,7 +10621,6 @@
         <w:ind w:left="567" w:hanging="567"/>
       </w:pPr>
       <w:r>
-        <w:lastRenderedPageBreak/>
         <w:t>[34]</w:t>
       </w:r>
       <w:r>
@@ -11270,11 +10994,28 @@
         <w:ind w:left="567" w:hanging="567"/>
       </w:pPr>
       <w:r>
+        <w:lastRenderedPageBreak/>
         <w:t>[39]</w:t>
       </w:r>
       <w:r>
         <w:tab/>
-        <w:t>B. Efron, Bootstrap methods: another look at the jackknife, Ann. Stat. 7 (1979) 1–26. https://doi.org/10.1214/aos/1176344552</w:t>
+        <w:t xml:space="preserve">C. Rudin, </w:t>
+      </w:r>
+      <w:proofErr w:type="gramStart"/>
+      <w:r>
+        <w:t>Stop</w:t>
+      </w:r>
+      <w:proofErr w:type="gramEnd"/>
+      <w:r>
+        <w:t xml:space="preserve"> explaining black box machine learning models for </w:t>
+      </w:r>
+      <w:proofErr w:type="gramStart"/>
+      <w:r>
+        <w:t>high stakes</w:t>
+      </w:r>
+      <w:proofErr w:type="gramEnd"/>
+      <w:r>
+        <w:t xml:space="preserve"> decisions and use interpretable models instead, Nat. Mach. Intell. 1 (2019) 206–215. https://doi.org/10.1038/s42256-019-0048-x</w:t>
       </w:r>
     </w:p>
     <w:p>
@@ -11290,15 +11031,7 @@
       </w:r>
       <w:r>
         <w:tab/>
-        <w:t>F. Pedregosa et al., Scikit-</w:t>
-      </w:r>
-      <w:proofErr w:type="gramStart"/>
-      <w:r>
-        <w:t>learn:</w:t>
-      </w:r>
-      <w:proofErr w:type="gramEnd"/>
-      <w:r>
-        <w:t xml:space="preserve"> machine learning in Python, J. Mach. Learn. Res. 12 (2011) 2825–2830. https://jmlr.org/papers/v12/pedregosa11a.html</w:t>
+        <w:t>B. Efron, Bootstrap methods: another look at the jackknife, Ann. Stat. 7 (1979) 1–26. https://doi.org/10.1214/aos/1176344552</w:t>
       </w:r>
     </w:p>
     <w:p>
@@ -11310,20 +11043,19 @@
         <w:ind w:left="567" w:hanging="567"/>
       </w:pPr>
       <w:r>
-        <w:lastRenderedPageBreak/>
         <w:t>[41]</w:t>
       </w:r>
       <w:r>
         <w:tab/>
-        <w:t xml:space="preserve">R.J.G.B. Campello, D. Moulavi, J. Sander, Density-based clustering based on hierarchical density estimates, in: Advances in Knowledge Discovery and Data Mining (PAKDD 2013), Lect. Notes </w:t>
-      </w:r>
-      <w:proofErr w:type="spellStart"/>
-      <w:r>
-        <w:t>Comput</w:t>
-      </w:r>
-      <w:proofErr w:type="spellEnd"/>
-      <w:r>
-        <w:t>. Sci. 7819, Springer, Berlin, 2013, pp. 160–172. https://doi.org/10.1007/978-3-642-37456-2_14</w:t>
+        <w:t>F. Pedregosa et al., Scikit-</w:t>
+      </w:r>
+      <w:proofErr w:type="gramStart"/>
+      <w:r>
+        <w:t>learn:</w:t>
+      </w:r>
+      <w:proofErr w:type="gramEnd"/>
+      <w:r>
+        <w:t xml:space="preserve"> machine learning in Python, J. Mach. Learn. Res. 12 (2011) 2825–2830. https://jmlr.org/papers/v12/pedregosa11a.html</w:t>
       </w:r>
     </w:p>
     <w:p>
@@ -11339,15 +11071,15 @@
       </w:r>
       <w:r>
         <w:tab/>
-        <w:t xml:space="preserve">L. Hubert, P. Arabie, Comparing partitions, J. </w:t>
-      </w:r>
-      <w:proofErr w:type="spellStart"/>
-      <w:r>
-        <w:t>Classif</w:t>
-      </w:r>
-      <w:proofErr w:type="spellEnd"/>
-      <w:r>
-        <w:t>. 2 (1985) 193–218. https://doi.org/10.1007/BF01908075</w:t>
+        <w:t xml:space="preserve">R.J.G.B. Campello, D. Moulavi, J. Sander, Density-based clustering based on hierarchical density estimates, in: Advances in Knowledge Discovery and Data Mining (PAKDD 2013), Lect. Notes </w:t>
+      </w:r>
+      <w:proofErr w:type="spellStart"/>
+      <w:r>
+        <w:t>Comput</w:t>
+      </w:r>
+      <w:proofErr w:type="spellEnd"/>
+      <w:r>
+        <w:t>. Sci. 7819, Springer, Berlin, 2013, pp. 160–172. https://doi.org/10.1007/978-3-642-37456-2_14</w:t>
       </w:r>
     </w:p>
     <w:p>
@@ -11363,7 +11095,15 @@
       </w:r>
       <w:r>
         <w:tab/>
-        <w:t>D.L. Davies, D.W. Bouldin, A cluster separation measure, IEEE Trans. Pattern Anal. Mach. Intell. PAMI-1 (1979) 224–227. https://doi.org/10.1109/TPAMI.1979.4766909</w:t>
+        <w:t xml:space="preserve">L. Hubert, P. Arabie, Comparing partitions, J. </w:t>
+      </w:r>
+      <w:proofErr w:type="spellStart"/>
+      <w:r>
+        <w:t>Classif</w:t>
+      </w:r>
+      <w:proofErr w:type="spellEnd"/>
+      <w:r>
+        <w:t>. 2 (1985) 193–218. https://doi.org/10.1007/BF01908075</w:t>
       </w:r>
     </w:p>
     <w:p>
@@ -11379,7 +11119,7 @@
       </w:r>
       <w:r>
         <w:tab/>
-        <w:t>T. Caliński, J. Harabasz, A dendrite method for cluster analysis, Commun. Stat. 3 (1974) 1–27. https://doi.org/10.1080/03610927408827101</w:t>
+        <w:t>D.L. Davies, D.W. Bouldin, A cluster separation measure, IEEE Trans. Pattern Anal. Mach. Intell. PAMI-1 (1979) 224–227. https://doi.org/10.1109/TPAMI.1979.4766909</w:t>
       </w:r>
     </w:p>
     <w:p>
@@ -11395,23 +11135,7 @@
       </w:r>
       <w:r>
         <w:tab/>
-        <w:t xml:space="preserve">S.J. Rey, L. </w:t>
-      </w:r>
-      <w:proofErr w:type="spellStart"/>
-      <w:r>
-        <w:t>Anselin</w:t>
-      </w:r>
-      <w:proofErr w:type="spellEnd"/>
-      <w:r>
-        <w:t xml:space="preserve">, </w:t>
-      </w:r>
-      <w:proofErr w:type="spellStart"/>
-      <w:r>
-        <w:t>PySAL</w:t>
-      </w:r>
-      <w:proofErr w:type="spellEnd"/>
-      <w:r>
-        <w:t>: a Python library of spatial analytical methods, Rev. Reg. Stud. 37 (2007) 5–27. https://doi.org/10.52324/001c.8285</w:t>
+        <w:t>T. Caliński, J. Harabasz, A dendrite method for cluster analysis, Commun. Stat. 3 (1974) 1–27. https://doi.org/10.1080/03610927408827101</w:t>
       </w:r>
     </w:p>
     <w:p>
@@ -11427,15 +11151,23 @@
       </w:r>
       <w:r>
         <w:tab/>
-        <w:t xml:space="preserve">Y. Benjamini, D. </w:t>
-      </w:r>
-      <w:proofErr w:type="spellStart"/>
-      <w:r>
-        <w:t>Yekutieli</w:t>
-      </w:r>
-      <w:proofErr w:type="spellEnd"/>
-      <w:r>
-        <w:t>, The control of the false discovery rate in multiple testing under dependency, Ann. Stat. 29 (2001) 1165–1188. https://doi.org/10.1214/aos/1013699998</w:t>
+        <w:t xml:space="preserve">S.J. Rey, L. </w:t>
+      </w:r>
+      <w:proofErr w:type="spellStart"/>
+      <w:r>
+        <w:t>Anselin</w:t>
+      </w:r>
+      <w:proofErr w:type="spellEnd"/>
+      <w:r>
+        <w:t xml:space="preserve">, </w:t>
+      </w:r>
+      <w:proofErr w:type="spellStart"/>
+      <w:r>
+        <w:t>PySAL</w:t>
+      </w:r>
+      <w:proofErr w:type="spellEnd"/>
+      <w:r>
+        <w:t>: a Python library of spatial analytical methods, Rev. Reg. Stud. 37 (2007) 5–27. https://doi.org/10.52324/001c.8285</w:t>
       </w:r>
     </w:p>
     <w:p>
@@ -11451,7 +11183,15 @@
       </w:r>
       <w:r>
         <w:tab/>
-        <w:t>J. Lin, Divergence measures based on the Shannon entropy, IEEE Trans. Inf. Theory 37 (1991) 145–151. https://doi.org/10.1109/18.61115</w:t>
+        <w:t xml:space="preserve">Y. Benjamini, D. </w:t>
+      </w:r>
+      <w:proofErr w:type="spellStart"/>
+      <w:r>
+        <w:t>Yekutieli</w:t>
+      </w:r>
+      <w:proofErr w:type="spellEnd"/>
+      <w:r>
+        <w:t>, The control of the false discovery rate in multiple testing under dependency, Ann. Stat. 29 (2001) 1165–1188. https://doi.org/10.1214/aos/1013699998</w:t>
       </w:r>
     </w:p>
     <w:p>
@@ -11467,15 +11207,7 @@
       </w:r>
       <w:r>
         <w:tab/>
-        <w:t xml:space="preserve">D.M. Endres, J.E. </w:t>
-      </w:r>
-      <w:proofErr w:type="spellStart"/>
-      <w:r>
-        <w:t>Schindelin</w:t>
-      </w:r>
-      <w:proofErr w:type="spellEnd"/>
-      <w:r>
-        <w:t>, A new metric for probability distributions, IEEE Trans. Inf. Theory 49 (2003) 1858–1860. https://doi.org/10.1109/TIT.2003.813506</w:t>
+        <w:t>J. Lin, Divergence measures based on the Shannon entropy, IEEE Trans. Inf. Theory 37 (1991) 145–151. https://doi.org/10.1109/18.61115</w:t>
       </w:r>
     </w:p>
     <w:p>
@@ -11487,7 +11219,32 @@
         <w:ind w:left="567" w:hanging="567"/>
       </w:pPr>
       <w:r>
+        <w:lastRenderedPageBreak/>
         <w:t>[49]</w:t>
+      </w:r>
+      <w:r>
+        <w:tab/>
+        <w:t xml:space="preserve">D.M. Endres, J.E. </w:t>
+      </w:r>
+      <w:proofErr w:type="spellStart"/>
+      <w:r>
+        <w:t>Schindelin</w:t>
+      </w:r>
+      <w:proofErr w:type="spellEnd"/>
+      <w:r>
+        <w:t>, A new metric for probability distributions, IEEE Trans. Inf. Theory 49 (2003) 1858–1860. https://doi.org/10.1109/TIT.2003.813506</w:t>
+      </w:r>
+    </w:p>
+    <w:p>
+      <w:pPr>
+        <w:tabs>
+          <w:tab w:val="left" w:pos="567"/>
+        </w:tabs>
+        <w:spacing w:line="480" w:lineRule="auto"/>
+        <w:ind w:left="567" w:hanging="567"/>
+      </w:pPr>
+      <w:r>
+        <w:t>[50]</w:t>
       </w:r>
       <w:r>
         <w:tab/>
@@ -11507,17 +11264,31 @@
       </w:r>
       <w:proofErr w:type="spellEnd"/>
       <w:r>
-        <w:t xml:space="preserve">, 2026. </w:t>
-      </w:r>
-      <w:r>
-        <w:rPr>
-          <w:highlight w:val="yellow"/>
-        </w:rPr>
-        <w:t>[https://doi.org/10.5281/zenodo.XXXXXXX]</w:t>
-      </w:r>
+        <w:t>, 2026.</w:t>
+      </w:r>
+      <w:r>
+        <w:t xml:space="preserve"> </w:t>
+      </w:r>
+      <w:hyperlink r:id="rId14" w:history="1">
+        <w:r>
+          <w:rPr>
+            <w:rStyle w:val="Hipervnculo"/>
+          </w:rPr>
+          <w:t>https://doi.org/10.5281/zenodo.23066963</w:t>
+        </w:r>
+      </w:hyperlink>
+    </w:p>
+    <w:p>
+      <w:pPr>
+        <w:tabs>
+          <w:tab w:val="left" w:pos="567"/>
+        </w:tabs>
+        <w:spacing w:line="480" w:lineRule="auto"/>
+        <w:ind w:left="567" w:hanging="567"/>
+      </w:pPr>
     </w:p>
     <w:sectPr>
-      <w:footerReference w:type="default" r:id="rId12"/>
+      <w:footerReference w:type="default" r:id="rId15"/>
       <w:pgSz w:w="11906" w:h="16838"/>
       <w:pgMar w:top="1418" w:right="1418" w:bottom="1418" w:left="1418" w:header="708" w:footer="708" w:gutter="0"/>
       <w:lnNumType w:countBy="1" w:distance="283" w:restart="continuous"/>
@@ -11616,96 +11387,10 @@
 <file path=word/numbering.xml><?xml version="1.0" encoding="utf-8"?>
 <w:numbering xmlns:wpc="http://schemas.microsoft.com/office/word/2010/wordprocessingCanvas" xmlns:cx="http://schemas.microsoft.com/office/drawing/2014/chartex" xmlns:cx1="http://schemas.microsoft.com/office/drawing/2015/9/8/chartex" xmlns:cx2="http://schemas.microsoft.com/office/drawing/2015/10/21/chartex" xmlns:cx3="http://schemas.microsoft.com/office/drawing/2016/5/9/chartex" xmlns:cx4="http://schemas.microsoft.com/office/drawing/2016/5/10/chartex" xmlns:cx5="http://schemas.microsoft.com/office/drawing/2016/5/11/chartex" xmlns:cx6="http://schemas.microsoft.com/office/drawing/2016/5/12/chartex" xmlns:cx7="http://schemas.microsoft.com/office/drawing/2016/5/13/chartex" xmlns:cx8="http://schemas.microsoft.com/office/drawing/2016/5/14/chartex" xmlns:mc="http://schemas.openxmlformats.org/markup-compatibility/2006" xmlns:aink="http://schemas.microsoft.com/office/drawing/2016/ink" xmlns:am3d="http://schemas.microsoft.com/office/drawing/2017/model3d" xmlns:o="urn:schemas-microsoft-com:office:office" xmlns:oel="http://schemas.microsoft.com/office/2019/extlst" xmlns:r="http://schemas.openxmlformats.org/officeDocument/2006/relationships" xmlns:m="http://schemas.openxmlformats.org/officeDocument/2006/math" xmlns:v="urn:schemas-microsoft-com:vml" xmlns:wp14="http://schemas.microsoft.com/office/word/2010/wordprocessingDrawing" xmlns:wp="http://schemas.openxmlformats.org/drawingml/2006/wordprocessingDrawing" xmlns:w10="urn:schemas-microsoft-com:office:word" xmlns:w="http://schemas.openxmlformats.org/wordprocessingml/2006/main" xmlns:w14="http://schemas.microsoft.com/office/word/2010/wordml" xmlns:w15="http://schemas.microsoft.com/office/word/2012/wordml" xmlns:w16cex="http://schemas.microsoft.com/office/word/2018/wordml/cex" xmlns:w16cid="http://schemas.microsoft.com/office/word/2016/wordml/cid" xmlns:w16="http://schemas.microsoft.com/office/word/2018/wordml" xmlns:w16du="http://schemas.microsoft.com/office/word/2023/wordml/word16du" xmlns:w16sdtdh="http://schemas.microsoft.com/office/word/2020/wordml/sdtdatahash" xmlns:w16sdtfl="http://schemas.microsoft.com/office/word/2024/wordml/sdtformatlock" xmlns:w16se="http://schemas.microsoft.com/office/word/2015/wordml/symex" xmlns:wpg="http://schemas.microsoft.com/office/word/2010/wordprocessingGroup" xmlns:wpi="http://schemas.microsoft.com/office/word/2010/wordprocessingInk" xmlns:wne="http://schemas.microsoft.com/office/word/2006/wordml" xmlns:wps="http://schemas.microsoft.com/office/word/2010/wordprocessingShape" mc:Ignorable="w14 w15 w16se w16cid w16 w16cex w16sdtdh w16sdtfl w16du wp14">
   <w:abstractNum w:abstractNumId="0" w15:restartNumberingAfterBreak="0">
-    <w:nsid w:val="172105F4"/>
+    <w:nsid w:val="14B92AE1"/>
     <w:multiLevelType w:val="hybridMultilevel"/>
-    <w:tmpl w:val="2834CD12"/>
-    <w:lvl w:ilvl="0" w:tplc="A04603EA">
-      <w:start w:val="1"/>
-      <w:numFmt w:val="bullet"/>
-      <w:lvlText w:val="●"/>
-      <w:lvlJc w:val="left"/>
-      <w:pPr>
-        <w:ind w:left="720" w:hanging="360"/>
-      </w:pPr>
-    </w:lvl>
-    <w:lvl w:ilvl="1" w:tplc="8BC0C756">
-      <w:start w:val="1"/>
-      <w:numFmt w:val="bullet"/>
-      <w:lvlText w:val="○"/>
-      <w:lvlJc w:val="left"/>
-      <w:pPr>
-        <w:ind w:left="1440" w:hanging="360"/>
-      </w:pPr>
-    </w:lvl>
-    <w:lvl w:ilvl="2" w:tplc="EACAEB80">
-      <w:start w:val="1"/>
-      <w:numFmt w:val="bullet"/>
-      <w:lvlText w:val="■"/>
-      <w:lvlJc w:val="left"/>
-      <w:pPr>
-        <w:ind w:left="2160" w:hanging="360"/>
-      </w:pPr>
-    </w:lvl>
-    <w:lvl w:ilvl="3" w:tplc="0F22ED6C">
-      <w:start w:val="1"/>
-      <w:numFmt w:val="bullet"/>
-      <w:lvlText w:val="●"/>
-      <w:lvlJc w:val="left"/>
-      <w:pPr>
-        <w:ind w:left="2880" w:hanging="360"/>
-      </w:pPr>
-    </w:lvl>
-    <w:lvl w:ilvl="4" w:tplc="00DAF666">
-      <w:start w:val="1"/>
-      <w:numFmt w:val="bullet"/>
-      <w:lvlText w:val="○"/>
-      <w:lvlJc w:val="left"/>
-      <w:pPr>
-        <w:ind w:left="3600" w:hanging="360"/>
-      </w:pPr>
-    </w:lvl>
-    <w:lvl w:ilvl="5" w:tplc="662ABEB8">
-      <w:start w:val="1"/>
-      <w:numFmt w:val="bullet"/>
-      <w:lvlText w:val="■"/>
-      <w:lvlJc w:val="left"/>
-      <w:pPr>
-        <w:ind w:left="4320" w:hanging="360"/>
-      </w:pPr>
-    </w:lvl>
-    <w:lvl w:ilvl="6" w:tplc="3D3C8EA0">
-      <w:start w:val="1"/>
-      <w:numFmt w:val="bullet"/>
-      <w:lvlText w:val="●"/>
-      <w:lvlJc w:val="left"/>
-      <w:pPr>
-        <w:ind w:left="5040" w:hanging="360"/>
-      </w:pPr>
-    </w:lvl>
-    <w:lvl w:ilvl="7" w:tplc="FF3E9FE6">
-      <w:start w:val="1"/>
-      <w:numFmt w:val="bullet"/>
-      <w:lvlText w:val="●"/>
-      <w:lvlJc w:val="left"/>
-      <w:pPr>
-        <w:ind w:left="5760" w:hanging="360"/>
-      </w:pPr>
-    </w:lvl>
-    <w:lvl w:ilvl="8" w:tplc="DA64F096">
-      <w:start w:val="1"/>
-      <w:numFmt w:val="bullet"/>
-      <w:lvlText w:val="●"/>
-      <w:lvlJc w:val="left"/>
-      <w:pPr>
-        <w:ind w:left="6480" w:hanging="360"/>
-      </w:pPr>
-    </w:lvl>
-  </w:abstractNum>
-  <w:abstractNum w:abstractNumId="1" w15:restartNumberingAfterBreak="0">
-    <w:nsid w:val="7C103419"/>
-    <w:multiLevelType w:val="hybridMultilevel"/>
-    <w:tmpl w:val="D204691E"/>
-    <w:lvl w:ilvl="0" w:tplc="2A6E2554">
+    <w:tmpl w:val="8BCC714A"/>
+    <w:lvl w:ilvl="0" w:tplc="ACB0751E">
       <w:start w:val="1"/>
       <w:numFmt w:val="bullet"/>
       <w:lvlText w:val="•"/>
@@ -11714,55 +11399,141 @@
         <w:ind w:left="567" w:hanging="283"/>
       </w:pPr>
     </w:lvl>
-    <w:lvl w:ilvl="1" w:tplc="815649CE">
+    <w:lvl w:ilvl="1" w:tplc="9F4C903A">
       <w:numFmt w:val="decimal"/>
       <w:lvlText w:val=""/>
       <w:lvlJc w:val="left"/>
     </w:lvl>
-    <w:lvl w:ilvl="2" w:tplc="EB166F5A">
+    <w:lvl w:ilvl="2" w:tplc="66483B84">
       <w:numFmt w:val="decimal"/>
       <w:lvlText w:val=""/>
       <w:lvlJc w:val="left"/>
     </w:lvl>
-    <w:lvl w:ilvl="3" w:tplc="2C1A4F64">
+    <w:lvl w:ilvl="3" w:tplc="A42216D8">
       <w:numFmt w:val="decimal"/>
       <w:lvlText w:val=""/>
       <w:lvlJc w:val="left"/>
     </w:lvl>
-    <w:lvl w:ilvl="4" w:tplc="49468B2C">
+    <w:lvl w:ilvl="4" w:tplc="CF5809EC">
       <w:numFmt w:val="decimal"/>
       <w:lvlText w:val=""/>
       <w:lvlJc w:val="left"/>
     </w:lvl>
-    <w:lvl w:ilvl="5" w:tplc="8934F0B8">
+    <w:lvl w:ilvl="5" w:tplc="204EAD00">
       <w:numFmt w:val="decimal"/>
       <w:lvlText w:val=""/>
       <w:lvlJc w:val="left"/>
     </w:lvl>
-    <w:lvl w:ilvl="6" w:tplc="4EB02C86">
+    <w:lvl w:ilvl="6" w:tplc="7F80C69E">
       <w:numFmt w:val="decimal"/>
       <w:lvlText w:val=""/>
       <w:lvlJc w:val="left"/>
     </w:lvl>
-    <w:lvl w:ilvl="7" w:tplc="9C3A0C06">
+    <w:lvl w:ilvl="7" w:tplc="2BB06B2E">
       <w:numFmt w:val="decimal"/>
       <w:lvlText w:val=""/>
       <w:lvlJc w:val="left"/>
     </w:lvl>
-    <w:lvl w:ilvl="8" w:tplc="A31E4A2E">
+    <w:lvl w:ilvl="8" w:tplc="507E88F2">
       <w:numFmt w:val="decimal"/>
       <w:lvlText w:val=""/>
       <w:lvlJc w:val="left"/>
     </w:lvl>
   </w:abstractNum>
-  <w:num w:numId="1" w16cid:durableId="1918712475">
-    <w:abstractNumId w:val="0"/>
+  <w:abstractNum w:abstractNumId="1" w15:restartNumberingAfterBreak="0">
+    <w:nsid w:val="6AAD4313"/>
+    <w:multiLevelType w:val="hybridMultilevel"/>
+    <w:tmpl w:val="DB5E20D0"/>
+    <w:lvl w:ilvl="0" w:tplc="55F27DE8">
+      <w:start w:val="1"/>
+      <w:numFmt w:val="bullet"/>
+      <w:lvlText w:val="●"/>
+      <w:lvlJc w:val="left"/>
+      <w:pPr>
+        <w:ind w:left="720" w:hanging="360"/>
+      </w:pPr>
+    </w:lvl>
+    <w:lvl w:ilvl="1" w:tplc="C660E43E">
+      <w:start w:val="1"/>
+      <w:numFmt w:val="bullet"/>
+      <w:lvlText w:val="○"/>
+      <w:lvlJc w:val="left"/>
+      <w:pPr>
+        <w:ind w:left="1440" w:hanging="360"/>
+      </w:pPr>
+    </w:lvl>
+    <w:lvl w:ilvl="2" w:tplc="D55A9322">
+      <w:start w:val="1"/>
+      <w:numFmt w:val="bullet"/>
+      <w:lvlText w:val="■"/>
+      <w:lvlJc w:val="left"/>
+      <w:pPr>
+        <w:ind w:left="2160" w:hanging="360"/>
+      </w:pPr>
+    </w:lvl>
+    <w:lvl w:ilvl="3" w:tplc="2A5A1A0A">
+      <w:start w:val="1"/>
+      <w:numFmt w:val="bullet"/>
+      <w:lvlText w:val="●"/>
+      <w:lvlJc w:val="left"/>
+      <w:pPr>
+        <w:ind w:left="2880" w:hanging="360"/>
+      </w:pPr>
+    </w:lvl>
+    <w:lvl w:ilvl="4" w:tplc="6792B0B6">
+      <w:start w:val="1"/>
+      <w:numFmt w:val="bullet"/>
+      <w:lvlText w:val="○"/>
+      <w:lvlJc w:val="left"/>
+      <w:pPr>
+        <w:ind w:left="3600" w:hanging="360"/>
+      </w:pPr>
+    </w:lvl>
+    <w:lvl w:ilvl="5" w:tplc="D26E7B0E">
+      <w:start w:val="1"/>
+      <w:numFmt w:val="bullet"/>
+      <w:lvlText w:val="■"/>
+      <w:lvlJc w:val="left"/>
+      <w:pPr>
+        <w:ind w:left="4320" w:hanging="360"/>
+      </w:pPr>
+    </w:lvl>
+    <w:lvl w:ilvl="6" w:tplc="590A6BCA">
+      <w:start w:val="1"/>
+      <w:numFmt w:val="bullet"/>
+      <w:lvlText w:val="●"/>
+      <w:lvlJc w:val="left"/>
+      <w:pPr>
+        <w:ind w:left="5040" w:hanging="360"/>
+      </w:pPr>
+    </w:lvl>
+    <w:lvl w:ilvl="7" w:tplc="B6ECFE0E">
+      <w:start w:val="1"/>
+      <w:numFmt w:val="bullet"/>
+      <w:lvlText w:val="●"/>
+      <w:lvlJc w:val="left"/>
+      <w:pPr>
+        <w:ind w:left="5760" w:hanging="360"/>
+      </w:pPr>
+    </w:lvl>
+    <w:lvl w:ilvl="8" w:tplc="E57A0F0A">
+      <w:start w:val="1"/>
+      <w:numFmt w:val="bullet"/>
+      <w:lvlText w:val="●"/>
+      <w:lvlJc w:val="left"/>
+      <w:pPr>
+        <w:ind w:left="6480" w:hanging="360"/>
+      </w:pPr>
+    </w:lvl>
+  </w:abstractNum>
+  <w:num w:numId="1" w16cid:durableId="1272931222">
+    <w:abstractNumId w:val="1"/>
     <w:lvlOverride w:ilvl="0">
       <w:startOverride w:val="1"/>
     </w:lvlOverride>
   </w:num>
-  <w:num w:numId="2" w16cid:durableId="399788165">
-    <w:abstractNumId w:val="1"/>
+  <w:num w:numId="2" w16cid:durableId="371467723">
+    <w:abstractNumId w:val="0"/>
     <w:lvlOverride w:ilvl="0">
       <w:startOverride w:val="1"/>
     </w:lvlOverride>
@@ -12372,7 +12143,50 @@
     <w:uiPriority w:val="99"/>
     <w:semiHidden/>
     <w:unhideWhenUsed/>
-    <w:rsid w:val="00AF1BD9"/>
+    <w:rsid w:val="00497B7B"/>
+  </w:style>
+  <w:style w:type="paragraph" w:styleId="Descripcin">
+    <w:name w:val="caption"/>
+    <w:basedOn w:val="Normal"/>
+    <w:next w:val="Normal"/>
+    <w:uiPriority w:val="35"/>
+    <w:unhideWhenUsed/>
+    <w:qFormat/>
+    <w:rsid w:val="00497B7B"/>
+    <w:pPr>
+      <w:spacing w:after="200"/>
+    </w:pPr>
+    <w:rPr>
+      <w:i/>
+      <w:iCs/>
+      <w:color w:val="0E2841" w:themeColor="text2"/>
+      <w:sz w:val="18"/>
+      <w:szCs w:val="18"/>
+    </w:rPr>
+  </w:style>
+  <w:style w:type="character" w:styleId="Mencinsinresolver">
+    <w:name w:val="Unresolved Mention"/>
+    <w:basedOn w:val="Fuentedeprrafopredeter"/>
+    <w:uiPriority w:val="99"/>
+    <w:semiHidden/>
+    <w:unhideWhenUsed/>
+    <w:rsid w:val="00BB45B4"/>
+    <w:rPr>
+      <w:color w:val="605E5C"/>
+      <w:shd w:val="clear" w:color="auto" w:fill="E1DFDD"/>
+    </w:rPr>
+  </w:style>
+  <w:style w:type="character" w:styleId="Hipervnculovisitado">
+    <w:name w:val="FollowedHyperlink"/>
+    <w:basedOn w:val="Fuentedeprrafopredeter"/>
+    <w:uiPriority w:val="99"/>
+    <w:semiHidden/>
+    <w:unhideWhenUsed/>
+    <w:rsid w:val="00BB45B4"/>
+    <w:rPr>
+      <w:color w:val="96607D" w:themeColor="followedHyperlink"/>
+      <w:u w:val="single"/>
+    </w:rPr>
   </w:style>
 </w:styles>
 </file>
@@ -12690,4 +12504,16 @@
     </a:ext>
   </a:extLst>
 </a:theme>
+</file>
+
+<file path=customXml/item1.xml><?xml version="1.0" encoding="utf-8"?>
+<b:Sources xmlns:b="http://schemas.openxmlformats.org/officeDocument/2006/bibliography" xmlns="http://schemas.openxmlformats.org/officeDocument/2006/bibliography" SelectedStyle="\IEEE2006OfficeOnline.xsl" StyleName="IEEE" Version="2006"/>
+</file>
+
+<file path=customXml/itemProps1.xml><?xml version="1.0" encoding="utf-8"?>
+<ds:datastoreItem xmlns:ds="http://schemas.openxmlformats.org/officeDocument/2006/customXml" ds:itemID="{D027B698-86BA-4C84-B0A7-51EBAD267D93}">
+  <ds:schemaRefs>
+    <ds:schemaRef ds:uri="http://schemas.openxmlformats.org/officeDocument/2006/bibliography"/>
+  </ds:schemaRefs>
+</ds:datastoreItem>
 </file>
</xml_diff>